<commit_message>
KOS-6 AA-19 chiuse: nessun blocco dei crawler AI; nota di consegna dello sprint 1 (docx)
Co-Authored-By: Claude Opus 5.5 <noreply@anthropic.com>
Claude-Session: https://claude.ai/code/session_01Rr1X44gsg7BUwMzrRvYrc2
</commit_message>
<xml_diff>
--- a/docs/docx/piano-sprint-1.docx
+++ b/docs/docx/piano-sprint-1.docx
@@ -1071,7 +1071,40 @@
         <w:t xml:space="preserve">[2 siti] Accesso dei crawler AI (6 KOS / 19 AA)</w:t>
       </w:r>
       <w:r>
-        <w:t xml:space="preserve">: verifica fatta il 18 ottobre (test user agent e log): nessun blocco di GPTBot e Bingbot. Da completare: ClaudeBot e PerplexityBot sugli intervalli IP pubblicati; nota di chiusura con le evidenze per Cerved/ProWeb (l'audit AA stesso segnala GPTBot e ClaudeBot come possibile falso negativo con codice 200).</w:t>
+        <w:t xml:space="preserve"> </w:t>
+      </w:r>
+      <w:r>
+        <w:t xml:space="preserve">— CHIUSA il 20/10: nessun blocco. robots.txt con il solo gruppo</w:t>
+      </w:r>
+      <w:r>
+        <w:t xml:space="preserve"> </w:t>
+      </w:r>
+      <w:r>
+        <w:rPr>
+          <w:rStyle w:val="VerbatimChar"/>
+        </w:rPr>
+        <w:t xml:space="preserve">*</w:t>
+      </w:r>
+      <w:r>
+        <w:t xml:space="preserve">; 18/18 richieste 200 con gli user agent di 9 bot, stessa pagina del browser (</w:t>
+      </w:r>
+      <w:r>
+        <w:rPr>
+          <w:rStyle w:val="VerbatimChar"/>
+        </w:rPr>
+        <w:t xml:space="preserve">scripts/checks/verifica-bot-ai.ps1</w:t>
+      </w:r>
+      <w:r>
+        <w:t xml:space="preserve">); nessuna sfida o ban di whackabot, limite o accesso negato sugli IP ufficiali di OpenAI, Anthropic e Perplexity nell'intero log degli errori (</w:t>
+      </w:r>
+      <w:r>
+        <w:rPr>
+          <w:rStyle w:val="VerbatimChar"/>
+        </w:rPr>
+        <w:t xml:space="preserve">scripts/checks/bot-ai-log.php</w:t>
+      </w:r>
+      <w:r>
+        <w:t xml:space="preserve">). Da chiedere all'agenzia strumento e IP del test; da segnalare a MODX Cloud syslog e cache SSL. Storico: verifica fatta il 18 ottobre (test user agent e log): nessun blocco di GPTBot e Bingbot. Da completare: ClaudeBot e PerplexityBot sugli intervalli IP pubblicati; nota di chiusura con le evidenze per Cerved/ProWeb (l'audit AA stesso segnala GPTBot e ClaudeBot come possibile falso negativo con codice 200).</w:t>
       </w:r>
       <w:r>
         <w:t xml:space="preserve"> </w:t>
@@ -2726,6 +2759,34 @@
       </w:pPr>
       <w:r>
         <w:t xml:space="preserve">Nota di consegna dello sprint 1 per Cerved/ProWeb: interventi per voce d'audit, URL da verificare, evidenze (log bot).</w:t>
+      </w:r>
+      <w:r>
+        <w:t xml:space="preserve"> </w:t>
+      </w:r>
+      <w:r>
+        <w:rPr>
+          <w:bCs/>
+          <w:b/>
+        </w:rPr>
+        <w:t xml:space="preserve">Scritta il 20/10</w:t>
+      </w:r>
+      <w:r>
+        <w:t xml:space="preserve"> </w:t>
+      </w:r>
+      <w:r>
+        <w:t xml:space="preserve">(scheda condivisa «Nota di consegna dello sprint 1», copia in</w:t>
+      </w:r>
+      <w:r>
+        <w:t xml:space="preserve"> </w:t>
+      </w:r>
+      <w:r>
+        <w:rPr>
+          <w:rStyle w:val="VerbatimChar"/>
+        </w:rPr>
+        <w:t xml:space="preserve">docs/docx/nota-di-consegna-sprint-1.docx</w:t>
+      </w:r>
+      <w:r>
+        <w:t xml:space="preserve">); attende solo la conferma di KOS sul testo di llms.txt.</w:t>
       </w:r>
     </w:p>
     <w:bookmarkEnd w:id="23"/>

</xml_diff>

<commit_message>
Piano: fonte dei title e description AA per lo sprint 2 (voce AA-20, file PWC di luglio)
Co-Authored-By: Claude Opus 5.5 <noreply@anthropic.com>
Claude-Session: https://claude.ai/code/session_01Rr1X44gsg7BUwMzrRvYrc2
</commit_message>
<xml_diff>
--- a/docs/docx/piano-sprint-1.docx
+++ b/docs/docx/piano-sprint-1.docx
@@ -3007,6 +3007,40 @@
       </w:pPr>
       <w:r>
         <w:t xml:space="preserve">Creazione delle TV anagrafiche su AA.</w:t>
+      </w:r>
+    </w:p>
+    <w:p>
+      <w:pPr>
+        <w:numPr>
+          <w:ilvl w:val="0"/>
+          <w:numId w:val="1007"/>
+        </w:numPr>
+        <w:pStyle w:val="Compact"/>
+      </w:pPr>
+      <w:r>
+        <w:rPr>
+          <w:bCs/>
+          <w:b/>
+        </w:rPr>
+        <w:t xml:space="preserve">[AA] Title e description (20) e H2 (6), sprint 2</w:t>
+      </w:r>
+      <w:r>
+        <w:t xml:space="preserve">: fonte dei testi</w:t>
+      </w:r>
+      <w:r>
+        <w:t xml:space="preserve"> </w:t>
+      </w:r>
+      <w:r>
+        <w:rPr>
+          <w:rStyle w:val="VerbatimChar"/>
+        </w:rPr>
+        <w:t xml:space="preserve">202607_PWC_AnniAzzurri_Ottimizzazioni_Meta_Tag_v2_Ant.xlsx</w:t>
+      </w:r>
+      <w:r>
+        <w:t xml:space="preserve"> </w:t>
+      </w:r>
+      <w:r>
+        <w:t xml:space="preserve">(stato al 7/7/2026): 88 URL (22 regioni e province, 58 residenze, 8 pagine editoriali) con title, H1 e description attuali e suggeriti. Decisione di luglio: H1 suggeriti non applicati (nomi coerenti con GBP; H1 solo dove mancavano, fatto nello sprint 1); title e description importati con script. Da verificare prima: che sia la versione validata richiesta nel calendario, 6 title suggeriti oltre 65 caratteri, pagine cambiate dopo luglio; le pagine dell'audit fuori dagli 88 URL (title/description lunghi, mancanti, duplicati) vanno coperte a parte. Su alcuni articoli il title attuale ripete «| Anni Azzurri | Anni Azzurri»: probabile suffisso aggiunto dal template a un longtitle che lo contiene già, da correggere nel template.</w:t>
       </w:r>
     </w:p>
     <w:p>

</xml_diff>

<commit_message>
Piano: indicazioni della strategia AEO/GEO da applicare negli sprint
Co-Authored-By: Claude Opus 5.5 <noreply@anthropic.com>
Claude-Session: https://claude.ai/code/session_01Rr1X44gsg7BUwMzrRvYrc2
</commit_message>
<xml_diff>
--- a/docs/docx/piano-sprint-1.docx
+++ b/docs/docx/piano-sprint-1.docx
@@ -2,7 +2,7 @@
 <file path=word/document.xml><?xml version="1.0" encoding="utf-8"?>
 <w:document xmlns:w="http://schemas.openxmlformats.org/wordprocessingml/2006/main" xmlns:m="http://schemas.openxmlformats.org/officeDocument/2006/math" xmlns:r="http://schemas.openxmlformats.org/officeDocument/2006/relationships" xmlns:o="urn:schemas-microsoft-com:office:office" xmlns:v="urn:schemas-microsoft-com:vml" xmlns:w10="urn:schemas-microsoft-com:office:word" xmlns:a="http://schemas.openxmlformats.org/drawingml/2006/main" xmlns:pic="http://schemas.openxmlformats.org/drawingml/2006/picture" xmlns:wp="http://schemas.openxmlformats.org/drawingml/2006/wordprocessingDrawing">
   <w:body>
-    <w:bookmarkStart w:id="26" w:name="Xff2d8b895f42074f3d940c259894f313a91b2c2"/>
+    <w:bookmarkStart w:id="27" w:name="Xff2d8b895f42074f3d940c259894f313a91b2c2"/>
     <w:p>
       <w:pPr>
         <w:pStyle w:val="Heading1"/>
@@ -2976,13 +2976,33 @@
       </w:r>
     </w:p>
     <w:bookmarkEnd w:id="24"/>
-    <w:bookmarkStart w:id="25" w:name="X6106934d94086303083d981b094913fadf78d77"/>
+    <w:bookmarkStart w:id="25" w:name="X898b42ef2c7e59f20211f0633f37c3831eecc50"/>
     <w:p>
       <w:pPr>
         <w:pStyle w:val="Heading2"/>
       </w:pPr>
       <w:r>
-        <w:t xml:space="preserve">Preparazione per lo sprint 2 (da avviare nella settimana del 26)</w:t>
+        <w:t xml:space="preserve">Indicazioni dalla strategia AEO/GEO (22 ottobre,</w:t>
+      </w:r>
+      <w:r>
+        <w:t xml:space="preserve"> </w:t>
+      </w:r>
+      <w:r>
+        <w:rPr>
+          <w:rStyle w:val="VerbatimChar"/>
+        </w:rPr>
+        <w:t xml:space="preserve">claude/strategia-aeo-geo.md</w:t>
+      </w:r>
+      <w:r>
+        <w:t xml:space="preserve">)</w:t>
+      </w:r>
+    </w:p>
+    <w:p>
+      <w:pPr>
+        <w:pStyle w:val="FirstParagraph"/>
+      </w:pPr>
+      <w:r>
+        <w:t xml:space="preserve">Dentro il perimetro, da applicare negli sprint:</w:t>
       </w:r>
     </w:p>
     <w:p>
@@ -2994,7 +3014,41 @@
         <w:pStyle w:val="Compact"/>
       </w:pPr>
       <w:r>
-        <w:t xml:space="preserve">Script di import dei dati anagrafici dall'export Yext corretto nelle TV dei due siti (import 2-6 novembre), con report delle differenze su KOS.</w:t>
+        <w:rPr>
+          <w:bCs/>
+          <w:b/>
+        </w:rPr>
+        <w:t xml:space="preserve">Tipo delle residenze</w:t>
+      </w:r>
+      <w:r>
+        <w:t xml:space="preserve">:</w:t>
+      </w:r>
+      <w:r>
+        <w:t xml:space="preserve"> </w:t>
+      </w:r>
+      <w:r>
+        <w:rPr>
+          <w:rStyle w:val="VerbatimChar"/>
+        </w:rPr>
+        <w:t xml:space="preserve">NursingHome</w:t>
+      </w:r>
+      <w:r>
+        <w:t xml:space="preserve"> </w:t>
+      </w:r>
+      <w:r>
+        <w:t xml:space="preserve">non esiste su schema.org (verificato su 30.1); convenzione corretta il 22/10. Decidere con l'agenzia prima dello sprint 3 (proposta</w:t>
+      </w:r>
+      <w:r>
+        <w:t xml:space="preserve"> </w:t>
+      </w:r>
+      <w:r>
+        <w:rPr>
+          <w:rStyle w:val="VerbatimChar"/>
+        </w:rPr>
+        <w:t xml:space="preserve">["MedicalOrganization", "LocalBusiness"]</w:t>
+      </w:r>
+      <w:r>
+        <w:t xml:space="preserve">).</w:t>
       </w:r>
     </w:p>
     <w:p>
@@ -3006,7 +3060,59 @@
         <w:pStyle w:val="Compact"/>
       </w:pPr>
       <w:r>
-        <w:t xml:space="preserve">Creazione delle TV anagrafiche su AA.</w:t>
+        <w:rPr>
+          <w:bCs/>
+          <w:b/>
+        </w:rPr>
+        <w:t xml:space="preserve">Medici KOS (voce 11, sprint 3)</w:t>
+      </w:r>
+      <w:r>
+        <w:t xml:space="preserve">:</w:t>
+      </w:r>
+      <w:r>
+        <w:t xml:space="preserve"> </w:t>
+      </w:r>
+      <w:r>
+        <w:rPr>
+          <w:rStyle w:val="VerbatimChar"/>
+        </w:rPr>
+        <w:t xml:space="preserve">IndividualPhysician</w:t>
+      </w:r>
+      <w:r>
+        <w:t xml:space="preserve"> </w:t>
+      </w:r>
+      <w:r>
+        <w:t xml:space="preserve">con</w:t>
+      </w:r>
+      <w:r>
+        <w:t xml:space="preserve"> </w:t>
+      </w:r>
+      <w:r>
+        <w:rPr>
+          <w:rStyle w:val="VerbatimChar"/>
+        </w:rPr>
+        <w:t xml:space="preserve">practicesAt</w:t>
+      </w:r>
+      <w:r>
+        <w:t xml:space="preserve"> </w:t>
+      </w:r>
+      <w:r>
+        <w:t xml:space="preserve">verso il</w:t>
+      </w:r>
+      <w:r>
+        <w:t xml:space="preserve"> </w:t>
+      </w:r>
+      <w:r>
+        <w:rPr>
+          <w:rStyle w:val="VerbatimChar"/>
+        </w:rPr>
+        <w:t xml:space="preserve">#localbusiness</w:t>
+      </w:r>
+      <w:r>
+        <w:t xml:space="preserve"> </w:t>
+      </w:r>
+      <w:r>
+        <w:t xml:space="preserve">della struttura.</w:t>
       </w:r>
     </w:p>
     <w:p>
@@ -3022,25 +3128,37 @@
           <w:bCs/>
           <w:b/>
         </w:rPr>
-        <w:t xml:space="preserve">[AA] Title e description (20) e H2 (6), sprint 2</w:t>
-      </w:r>
-      <w:r>
-        <w:t xml:space="preserve">: fonte dei testi</w:t>
-      </w:r>
-      <w:r>
-        <w:t xml:space="preserve"> </w:t>
-      </w:r>
-      <w:r>
-        <w:rPr>
-          <w:rStyle w:val="VerbatimChar"/>
-        </w:rPr>
-        <w:t xml:space="preserve">202607_PWC_AnniAzzurri_Ottimizzazioni_Meta_Tag_v2_Ant.xlsx</w:t>
-      </w:r>
-      <w:r>
-        <w:t xml:space="preserve"> </w:t>
-      </w:r>
-      <w:r>
-        <w:t xml:space="preserve">(stato al 7/7/2026): 88 URL (22 regioni e province, 58 residenze, 8 pagine editoriali) con title, H1 e description attuali e suggeriti. Decisione di luglio: H1 suggeriti non applicati (nomi coerenti con GBP; H1 solo dove mancavano, fatto nello sprint 1); title e description importati con script. Da verificare prima: che sia la versione validata richiesta nel calendario, 6 title suggeriti oltre 65 caratteri, pagine cambiate dopo luglio; le pagine dell'audit fuori dagli 88 URL (title/description lunghi, mancanti, duplicati) vanno coperte a parte. Su alcuni articoli il title attuale ripete «| Anni Azzurri | Anni Azzurri»: probabile suffisso aggiunto dal template a un longtitle che lo contiene già, da correggere nel template.</w:t>
+        <w:t xml:space="preserve">Collaudo di ogni sprint</w:t>
+      </w:r>
+      <w:r>
+        <w:t xml:space="preserve">: controllare anche la pagina servita senza consenso Cookiebot (testi, contatti, dato strutturato presenti); un solo</w:t>
+      </w:r>
+      <w:r>
+        <w:t xml:space="preserve"> </w:t>
+      </w:r>
+      <w:r>
+        <w:rPr>
+          <w:rStyle w:val="VerbatimChar"/>
+        </w:rPr>
+        <w:t xml:space="preserve">@graph</w:t>
+      </w:r>
+      <w:r>
+        <w:t xml:space="preserve"> </w:t>
+      </w:r>
+      <w:r>
+        <w:t xml:space="preserve">valido, H1, canonical, sitemap su un campione per template (estendere</w:t>
+      </w:r>
+      <w:r>
+        <w:t xml:space="preserve"> </w:t>
+      </w:r>
+      <w:r>
+        <w:rPr>
+          <w:rStyle w:val="VerbatimChar"/>
+        </w:rPr>
+        <w:t xml:space="preserve">verifica-rilascio-*.ps1</w:t>
+      </w:r>
+      <w:r>
+        <w:t xml:space="preserve">).</w:t>
       </w:r>
     </w:p>
     <w:p>
@@ -3056,58 +3174,10 @@
           <w:bCs/>
           <w:b/>
         </w:rPr>
-        <w:t xml:space="preserve">Segreti scritti nel codice</w:t>
-      </w:r>
-      <w:r>
-        <w:t xml:space="preserve"> </w:t>
-      </w:r>
-      <w:r>
-        <w:t xml:space="preserve">(emersi dalla baseline del 19 ottobre, sostituiti con segnaposto nel repository): chiave YouTube Data API in</w:t>
-      </w:r>
-      <w:r>
-        <w:t xml:space="preserve"> </w:t>
-      </w:r>
-      <w:r>
-        <w:rPr>
-          <w:rStyle w:val="VerbatimChar"/>
-        </w:rPr>
-        <w:t xml:space="preserve">syncYoutubeVideos</w:t>
-      </w:r>
-      <w:r>
-        <w:t xml:space="preserve"> </w:t>
-      </w:r>
-      <w:r>
-        <w:t xml:space="preserve">e token Arca24 in</w:t>
-      </w:r>
-      <w:r>
-        <w:t xml:space="preserve"> </w:t>
-      </w:r>
-      <w:r>
-        <w:rPr>
-          <w:rStyle w:val="VerbatimChar"/>
-        </w:rPr>
-        <w:t xml:space="preserve">arca24Import</w:t>
-      </w:r>
-      <w:r>
-        <w:t xml:space="preserve"> </w:t>
-      </w:r>
-      <w:r>
-        <w:t xml:space="preserve">(KOS), chiave di cifratura in</w:t>
-      </w:r>
-      <w:r>
-        <w:t xml:space="preserve"> </w:t>
-      </w:r>
-      <w:r>
-        <w:rPr>
-          <w:rStyle w:val="VerbatimChar"/>
-        </w:rPr>
-        <w:t xml:space="preserve">countContact</w:t>
-      </w:r>
-      <w:r>
-        <w:t xml:space="preserve"> </w:t>
-      </w:r>
-      <w:r>
-        <w:t xml:space="preserve">(AA). Quando questi snippet diventano statici, i valori vanno spostati in impostazioni di sistema; valutare con KOS la rigenerazione della chiave YouTube.</w:t>
+        <w:t xml:space="preserve">Title e description AA (voce 20, sprint 2)</w:t>
+      </w:r>
+      <w:r>
+        <w:t xml:space="preserve">: prima dell'import, controllare in Search Console la ripartizione delle query tra «RSA», «casa di riposo», «residenza per anziani» e usare i termini più cercati; testi generati o importati sempre rivisti.</w:t>
       </w:r>
     </w:p>
     <w:p>
@@ -3119,6 +3189,257 @@
         <w:pStyle w:val="Compact"/>
       </w:pPr>
       <w:r>
+        <w:rPr>
+          <w:bCs/>
+          <w:b/>
+        </w:rPr>
+        <w:t xml:space="preserve">Schede struttura (sprint 2 KOS, sprint 3 AA)</w:t>
+      </w:r>
+      <w:r>
+        <w:t xml:space="preserve">: togliere lo script Yext che inietta il dato; le schede devono differire nella sostanza (servizi, nuclei, contatti), non solo nel nome.</w:t>
+      </w:r>
+    </w:p>
+    <w:p>
+      <w:pPr>
+        <w:numPr>
+          <w:ilvl w:val="0"/>
+          <w:numId w:val="1007"/>
+        </w:numPr>
+        <w:pStyle w:val="Compact"/>
+      </w:pPr>
+      <w:r>
+        <w:rPr>
+          <w:bCs/>
+          <w:b/>
+        </w:rPr>
+        <w:t xml:space="preserve">Articoli (voce 10 KOS, sprint 3)</w:t>
+      </w:r>
+      <w:r>
+        <w:t xml:space="preserve">:</w:t>
+      </w:r>
+      <w:r>
+        <w:t xml:space="preserve"> </w:t>
+      </w:r>
+      <w:r>
+        <w:rPr>
+          <w:rStyle w:val="VerbatimChar"/>
+        </w:rPr>
+        <w:t xml:space="preserve">MedicalWebPage</w:t>
+      </w:r>
+      <w:r>
+        <w:t xml:space="preserve"> </w:t>
+      </w:r>
+      <w:r>
+        <w:t xml:space="preserve">con</w:t>
+      </w:r>
+      <w:r>
+        <w:t xml:space="preserve"> </w:t>
+      </w:r>
+      <w:r>
+        <w:rPr>
+          <w:rStyle w:val="VerbatimChar"/>
+        </w:rPr>
+        <w:t xml:space="preserve">lastReviewed</w:t>
+      </w:r>
+      <w:r>
+        <w:t xml:space="preserve">/</w:t>
+      </w:r>
+      <w:r>
+        <w:rPr>
+          <w:rStyle w:val="VerbatimChar"/>
+        </w:rPr>
+        <w:t xml:space="preserve">reviewedBy</w:t>
+      </w:r>
+      <w:r>
+        <w:t xml:space="preserve"> </w:t>
+      </w:r>
+      <w:r>
+        <w:t xml:space="preserve">solo dove c'è un revisore reale; autore = ente finché KOS non ha firme; data visibile coerente con</w:t>
+      </w:r>
+      <w:r>
+        <w:t xml:space="preserve"> </w:t>
+      </w:r>
+      <w:r>
+        <w:rPr>
+          <w:rStyle w:val="VerbatimChar"/>
+        </w:rPr>
+        <w:t xml:space="preserve">dateModified</w:t>
+      </w:r>
+      <w:r>
+        <w:t xml:space="preserve">.</w:t>
+      </w:r>
+    </w:p>
+    <w:p>
+      <w:pPr>
+        <w:numPr>
+          <w:ilvl w:val="0"/>
+          <w:numId w:val="1007"/>
+        </w:numPr>
+        <w:pStyle w:val="Compact"/>
+      </w:pPr>
+      <w:r>
+        <w:rPr>
+          <w:bCs/>
+          <w:b/>
+        </w:rPr>
+        <w:t xml:space="preserve">FAQ</w:t>
+      </w:r>
+      <w:r>
+        <w:t xml:space="preserve">: il risultato FAQ di Google non è più mostrato (maggio 2026): FAQ come testo visibile, markup facoltativo.</w:t>
+      </w:r>
+    </w:p>
+    <w:p>
+      <w:pPr>
+        <w:pStyle w:val="FirstParagraph"/>
+      </w:pPr>
+      <w:r>
+        <w:t xml:space="preserve">Fuori perimetro, da proporre (non nei documenti condivisi): baseline di misura entro fine novembre (Search Console, Bing AI Performance, canale AI in GA4, set di prompt ripetuti), IndexNow alla pubblicazione, domanda «come ci ha conosciuto?» nei moduli, profili Google dopo RetailTune (vedi analisi del documento PWC Local del 22/10: niente parole chiave nei nomi; test di categoria su un campione; programma recensioni).</w:t>
+      </w:r>
+    </w:p>
+    <w:bookmarkEnd w:id="25"/>
+    <w:bookmarkStart w:id="26" w:name="X6106934d94086303083d981b094913fadf78d77"/>
+    <w:p>
+      <w:pPr>
+        <w:pStyle w:val="Heading2"/>
+      </w:pPr>
+      <w:r>
+        <w:t xml:space="preserve">Preparazione per lo sprint 2 (da avviare nella settimana del 26)</w:t>
+      </w:r>
+    </w:p>
+    <w:p>
+      <w:pPr>
+        <w:numPr>
+          <w:ilvl w:val="0"/>
+          <w:numId w:val="1008"/>
+        </w:numPr>
+        <w:pStyle w:val="Compact"/>
+      </w:pPr>
+      <w:r>
+        <w:t xml:space="preserve">Script di import dei dati anagrafici dall'export Yext corretto nelle TV dei due siti (import 2-6 novembre), con report delle differenze su KOS.</w:t>
+      </w:r>
+    </w:p>
+    <w:p>
+      <w:pPr>
+        <w:numPr>
+          <w:ilvl w:val="0"/>
+          <w:numId w:val="1008"/>
+        </w:numPr>
+        <w:pStyle w:val="Compact"/>
+      </w:pPr>
+      <w:r>
+        <w:t xml:space="preserve">Creazione delle TV anagrafiche su AA.</w:t>
+      </w:r>
+    </w:p>
+    <w:p>
+      <w:pPr>
+        <w:numPr>
+          <w:ilvl w:val="0"/>
+          <w:numId w:val="1008"/>
+        </w:numPr>
+        <w:pStyle w:val="Compact"/>
+      </w:pPr>
+      <w:r>
+        <w:rPr>
+          <w:bCs/>
+          <w:b/>
+        </w:rPr>
+        <w:t xml:space="preserve">[AA] Title e description (20) e H2 (6), sprint 2</w:t>
+      </w:r>
+      <w:r>
+        <w:t xml:space="preserve">: fonte dei testi</w:t>
+      </w:r>
+      <w:r>
+        <w:t xml:space="preserve"> </w:t>
+      </w:r>
+      <w:r>
+        <w:rPr>
+          <w:rStyle w:val="VerbatimChar"/>
+        </w:rPr>
+        <w:t xml:space="preserve">202607_PWC_AnniAzzurri_Ottimizzazioni_Meta_Tag_v2_Ant.xlsx</w:t>
+      </w:r>
+      <w:r>
+        <w:t xml:space="preserve"> </w:t>
+      </w:r>
+      <w:r>
+        <w:t xml:space="preserve">(stato al 7/7/2026): 88 URL (22 regioni e province, 58 residenze, 8 pagine editoriali) con title, H1 e description attuali e suggeriti. Decisione di luglio: H1 suggeriti non applicati (nomi coerenti con GBP; H1 solo dove mancavano, fatto nello sprint 1); title e description importati con script. Da verificare prima: che sia la versione validata richiesta nel calendario, 6 title suggeriti oltre 65 caratteri, pagine cambiate dopo luglio; le pagine dell'audit fuori dagli 88 URL (title/description lunghi, mancanti, duplicati) vanno coperte a parte. Su alcuni articoli il title attuale ripete «| Anni Azzurri | Anni Azzurri»: probabile suffisso aggiunto dal template a un longtitle che lo contiene già, da correggere nel template.</w:t>
+      </w:r>
+    </w:p>
+    <w:p>
+      <w:pPr>
+        <w:numPr>
+          <w:ilvl w:val="0"/>
+          <w:numId w:val="1008"/>
+        </w:numPr>
+        <w:pStyle w:val="Compact"/>
+      </w:pPr>
+      <w:r>
+        <w:rPr>
+          <w:bCs/>
+          <w:b/>
+        </w:rPr>
+        <w:t xml:space="preserve">Segreti scritti nel codice</w:t>
+      </w:r>
+      <w:r>
+        <w:t xml:space="preserve"> </w:t>
+      </w:r>
+      <w:r>
+        <w:t xml:space="preserve">(emersi dalla baseline del 19 ottobre, sostituiti con segnaposto nel repository): chiave YouTube Data API in</w:t>
+      </w:r>
+      <w:r>
+        <w:t xml:space="preserve"> </w:t>
+      </w:r>
+      <w:r>
+        <w:rPr>
+          <w:rStyle w:val="VerbatimChar"/>
+        </w:rPr>
+        <w:t xml:space="preserve">syncYoutubeVideos</w:t>
+      </w:r>
+      <w:r>
+        <w:t xml:space="preserve"> </w:t>
+      </w:r>
+      <w:r>
+        <w:t xml:space="preserve">e token Arca24 in</w:t>
+      </w:r>
+      <w:r>
+        <w:t xml:space="preserve"> </w:t>
+      </w:r>
+      <w:r>
+        <w:rPr>
+          <w:rStyle w:val="VerbatimChar"/>
+        </w:rPr>
+        <w:t xml:space="preserve">arca24Import</w:t>
+      </w:r>
+      <w:r>
+        <w:t xml:space="preserve"> </w:t>
+      </w:r>
+      <w:r>
+        <w:t xml:space="preserve">(KOS), chiave di cifratura in</w:t>
+      </w:r>
+      <w:r>
+        <w:t xml:space="preserve"> </w:t>
+      </w:r>
+      <w:r>
+        <w:rPr>
+          <w:rStyle w:val="VerbatimChar"/>
+        </w:rPr>
+        <w:t xml:space="preserve">countContact</w:t>
+      </w:r>
+      <w:r>
+        <w:t xml:space="preserve"> </w:t>
+      </w:r>
+      <w:r>
+        <w:t xml:space="preserve">(AA). Quando questi snippet diventano statici, i valori vanno spostati in impostazioni di sistema; valutare con KOS la rigenerazione della chiave YouTube.</w:t>
+      </w:r>
+    </w:p>
+    <w:p>
+      <w:pPr>
+        <w:numPr>
+          <w:ilvl w:val="0"/>
+          <w:numId w:val="1008"/>
+        </w:numPr>
+        <w:pStyle w:val="Compact"/>
+      </w:pPr>
+      <w:r>
         <w:t xml:space="preserve">Attività già registrate per lo sprint 2: cache di</w:t>
       </w:r>
       <w:r>
@@ -3146,8 +3467,8 @@
         <w:t xml:space="preserve">, redirect cartelle documenti (KOS); immagini e PDF mancanti (AA).</w:t>
       </w:r>
     </w:p>
-    <w:bookmarkEnd w:id="25"/>
     <w:bookmarkEnd w:id="26"/>
+    <w:bookmarkEnd w:id="27"/>
     <w:sectPr/>
   </w:body>
 </w:document>
@@ -3688,6 +4009,9 @@
     <w:abstractNumId w:val="991"/>
   </w:num>
   <w:num w:numId="1007">
+    <w:abstractNumId w:val="991"/>
+  </w:num>
+  <w:num w:numId="1008">
     <w:abstractNumId w:val="991"/>
   </w:num>
 </w:numbering>

</xml_diff>

<commit_message>
Piano: avvio ufficiale dopo la firma, sprint 2 anticipato sullo stage
Co-Authored-By: Claude Opus 5.5 <noreply@anthropic.com>
Claude-Session: https://claude.ai/code/session_01Rr1X44gsg7BUwMzrRvYrc2
</commit_message>
<xml_diff>
--- a/docs/docx/piano-sprint-1.docx
+++ b/docs/docx/piano-sprint-1.docx
@@ -23,6 +23,24 @@
       </w:r>
       <w:r>
         <w:t xml:space="preserve">Scadenza RetailTune: specifiche dei widget, tipologie e attributi entro venerdì 23 ottobre (percorso critico della linea C: import preliminare entro 6 novembre, widget di test entro 16 novembre).</w:t>
+      </w:r>
+    </w:p>
+    <w:p>
+      <w:pPr>
+        <w:pStyle w:val="BodyText"/>
+      </w:pPr>
+      <w:r>
+        <w:rPr>
+          <w:bCs/>
+          <w:b/>
+        </w:rPr>
+        <w:t xml:space="preserve">Aggiornamento 22 ottobre:</w:t>
+      </w:r>
+      <w:r>
+        <w:t xml:space="preserve"> </w:t>
+      </w:r>
+      <w:r>
+        <w:t xml:space="preserve">la firma dei contratti arriva entro la settimana, avvio ufficiale non prima del 26 ottobre. Decisione di Danilo: le date di consegna degli sprint delle linee A e B restano dove possibile; il cronoprogramma dell'integrazione RetailTune (linea C) si rifà alla firma. Lo sprint 2 parte subito sullo stage (prima KOS 9 e 12-13, poi AA 1 e 6, KOS 2); in produzione dopo la firma. Prima di toccare title e description: export di Search Console degli ultimi 16 mesi per entrambi i siti.</w:t>
       </w:r>
     </w:p>
     <w:p>

</xml_diff>

<commit_message>
KOS-24 archivio e analisi del JSON-LD inserito da Yext; KOS 9/12/13 in produzione nel piano
Co-Authored-By: Claude Opus 5.5 <noreply@anthropic.com>
Claude-Session: https://claude.ai/code/session_01Rr1X44gsg7BUwMzrRvYrc2
</commit_message>
<xml_diff>
--- a/docs/docx/piano-sprint-1.docx
+++ b/docs/docx/piano-sprint-1.docx
@@ -40,7 +40,59 @@
         <w:t xml:space="preserve"> </w:t>
       </w:r>
       <w:r>
-        <w:t xml:space="preserve">la firma dei contratti arriva entro la settimana, avvio ufficiale non prima del 26 ottobre. Decisione di Danilo: le date di consegna degli sprint delle linee A e B restano dove possibile; il cronoprogramma dell'integrazione RetailTune (linea C) si rifà alla firma. Lo sprint 2 parte subito sullo stage (prima KOS 9 e 12-13, poi AA 1 e 6, KOS 2); in produzione dopo la firma. Prima di toccare title e description: export di Search Console degli ultimi 16 mesi per entrambi i siti.</w:t>
+        <w:t xml:space="preserve">la firma dei contratti arriva entro la settimana, avvio ufficiale non prima del 26 ottobre. Decisione di Danilo: le date di consegna degli sprint delle linee A e B restano dove possibile; il cronoprogramma dell'integrazione RetailTune (linea C) si rifà alla firma. Lo sprint 2 parte subito sullo stage (prima KOS 9 e 12-13, poi AA 1 e 6, KOS 2); in produzione dopo la firma.</w:t>
+      </w:r>
+      <w:r>
+        <w:t xml:space="preserve"> </w:t>
+      </w:r>
+      <w:r>
+        <w:rPr>
+          <w:bCs/>
+          <w:b/>
+        </w:rPr>
+        <w:t xml:space="preserve">Eccezione decisa il 22/10: KOS 9, 12 e 13 in produzione subito</w:t>
+      </w:r>
+      <w:r>
+        <w:t xml:space="preserve"> </w:t>
+      </w:r>
+      <w:r>
+        <w:t xml:space="preserve">(collaudo superato su stage e produzione, 0 errori nei validatori; coesistenza con il blocco Yext delle schede verificata senza conflitti, perché descrivono entità diverse). Dettaglio, evidenze e ripristino in</w:t>
+      </w:r>
+      <w:r>
+        <w:t xml:space="preserve"> </w:t>
+      </w:r>
+      <w:r>
+        <w:rPr>
+          <w:rStyle w:val="VerbatimChar"/>
+        </w:rPr>
+        <w:t xml:space="preserve">docs/kos-9-12-13.md</w:t>
+      </w:r>
+      <w:r>
+        <w:t xml:space="preserve">. Voce 24: il nodo</w:t>
+      </w:r>
+      <w:r>
+        <w:t xml:space="preserve"> </w:t>
+      </w:r>
+      <w:r>
+        <w:rPr>
+          <w:rStyle w:val="VerbatimChar"/>
+        </w:rPr>
+        <w:t xml:space="preserve">#localbusiness</w:t>
+      </w:r>
+      <w:r>
+        <w:t xml:space="preserve"> </w:t>
+      </w:r>
+      <w:r>
+        <w:t xml:space="preserve">si rilascia insieme alla rimozione dello script Yext dalle schede, mai prima (altrimenti la stessa struttura sarebbe descritta due volte); prima: archivio ed elenco dei difetti del JSON-LD Yext (</w:t>
+      </w:r>
+      <w:r>
+        <w:rPr>
+          <w:rStyle w:val="VerbatimChar"/>
+        </w:rPr>
+        <w:t xml:space="preserve">scripts/checks/yext-schema.php</w:t>
+      </w:r>
+      <w:r>
+        <w:t xml:space="preserve">), verifica dei campi visibili riempiti da Yext, conferma che la perdita delle statistiche Knowledge Tags fino alla migrazione è accettabile, dati della scheda (orari, telefono, email) verificati con KOS. Prima di toccare title e description: export di Search Console degli ultimi 16 mesi per entrambi i siti.</w:t>
       </w:r>
     </w:p>
     <w:p>

</xml_diff>

<commit_message>
Anomalie Yext: aggiunti orari, id temporanei ed email dall'analisi del JSON-LD (KOS-24)
Co-Authored-By: Claude Opus 5.5 <noreply@anthropic.com>
Claude-Session: https://claude.ai/code/session_01Rr1X44gsg7BUwMzrRvYrc2
</commit_message>
<xml_diff>
--- a/docs/docx/piano-sprint-1.docx
+++ b/docs/docx/piano-sprint-1.docx
@@ -550,7 +550,44 @@
         <w:t xml:space="preserve">Villalba</w:t>
       </w:r>
       <w:r>
-        <w:t xml:space="preserve">); Parco di Veio con nome e link della residenza AA; Punto Prelievi Delta senza sito web; tipologie di Corte Carcare, Corte Orero e Villa Margherita Vicenza; indirizzi (Clinica Dentale Porto Potenza Picena 217/194, Parco di Veio 41/43), 11 telefoni e 4 email diversi. Analisi AA fatta il 19 ottobre (59 entità Yext / 64 pagine residenza e centro diurno, query</w:t>
+        <w:t xml:space="preserve">); Parco di Veio con nome e link della residenza AA; Punto Prelievi Delta senza sito web; tipologie di Corte Carcare, Corte Orero e Villa Margherita Vicenza; indirizzi (Clinica Dentale Porto Potenza Picena 217/194, Parco di Veio 41/43), 11 telefoni e 4 email diversi.</w:t>
+      </w:r>
+      <w:r>
+        <w:t xml:space="preserve"> </w:t>
+      </w:r>
+      <w:r>
+        <w:rPr>
+          <w:bCs/>
+          <w:b/>
+        </w:rPr>
+        <w:t xml:space="preserve">Aggiunte il 22/10 dall'analisi del JSON-LD Yext</w:t>
+      </w:r>
+      <w:r>
+        <w:t xml:space="preserve"> </w:t>
+      </w:r>
+      <w:r>
+        <w:t xml:space="preserve">(</w:t>
+      </w:r>
+      <w:r>
+        <w:rPr>
+          <w:rStyle w:val="VerbatimChar"/>
+        </w:rPr>
+        <w:t xml:space="preserve">docs/yext-schema-kos.md</w:t>
+      </w:r>
+      <w:r>
+        <w:t xml:space="preserve">, foglio</w:t>
+      </w:r>
+      <w:r>
+        <w:t xml:space="preserve"> </w:t>
+      </w:r>
+      <w:r>
+        <w:rPr>
+          <w:rStyle w:val="VerbatimChar"/>
+        </w:rPr>
+        <w:t xml:space="preserve">docs/evidenze/yext-schema-kosgroup-20261022/dati-da-verificare.csv</w:t>
+      </w:r>
+      <w:r>
+        <w:t xml:space="preserve">): 20 schede con lo stesso orario sette giorni su sette (08:00-20:00 su 11, tra cui comunità psichiatriche e Ospedale San Pancrazio), uguale anche sui profili Google perché alimentati da Yext: KOS conferma gli orari e chiarisce cosa rappresentano per le strutture residenziali (apertura, visite, accettazione); id «Temporary 1» e «Temporary 7» nella TV di Villa Pineta e Villa Armonia; 9 email assenti; brand «0» su Casa Varazze; destinazione di Villa Margherita Vicenza (due schede, una sola entità). Le correzioni fatte in Yext arrivano anche ai profili Google e all'import RetailTune. Analisi AA fatta il 19 ottobre (59 entità Yext / 64 pagine residenza e centro diurno, query</w:t>
       </w:r>
       <w:r>
         <w:t xml:space="preserve"> </w:t>

</xml_diff>

<commit_message>
Piano e istruzioni: interventi del 8-22/10 su TTFB, link assoluti e sitemap (report archiviato)
Co-Authored-By: Claude Opus 5.5 <noreply@anthropic.com>
Claude-Session: https://claude.ai/code/session_01Rr1X44gsg7BUwMzrRvYrc2
</commit_message>
<xml_diff>
--- a/docs/docx/piano-sprint-1.docx
+++ b/docs/docx/piano-sprint-1.docx
@@ -93,6 +93,56 @@
       </w:r>
       <w:r>
         <w:t xml:space="preserve">), verifica dei campi visibili riempiti da Yext, conferma che la perdita delle statistiche Knowledge Tags fino alla migrazione è accettabile, dati della scheda (orari, telefono, email) verificati con KOS. Prima di toccare title e description: export di Search Console degli ultimi 16 mesi per entrambi i siti.</w:t>
+      </w:r>
+      <w:r>
+        <w:t xml:space="preserve"> </w:t>
+      </w:r>
+      <w:r>
+        <w:rPr>
+          <w:bCs/>
+          <w:b/>
+        </w:rPr>
+        <w:t xml:space="preserve">Interventi di Danilo su prestazioni, link e sitemap (8-22/10, fuori progetto, report in</w:t>
+      </w:r>
+      <w:r>
+        <w:rPr>
+          <w:bCs/>
+          <w:b/>
+        </w:rPr>
+        <w:t xml:space="preserve"> </w:t>
+      </w:r>
+      <w:r>
+        <w:rPr>
+          <w:rStyle w:val="VerbatimChar"/>
+          <w:bCs/>
+          <w:b/>
+        </w:rPr>
+        <w:t xml:space="preserve">docs/riferimenti/handoff-ttfb-20261022.md</w:t>
+      </w:r>
+      <w:r>
+        <w:rPr>
+          <w:bCs/>
+          <w:b/>
+        </w:rPr>
+        <w:t xml:space="preserve">):</w:t>
+      </w:r>
+      <w:r>
+        <w:t xml:space="preserve"> </w:t>
+      </w:r>
+      <w:r>
+        <w:t xml:space="preserve">KOS 2 (TTFB) — causa principale a livello di rete (SYN scartati per TIME_WAIT lato server, ticket aperto con MODX Cloud, ipotesi Cloud Edge); al progetto restano la parte applicativa (cache di</w:t>
+      </w:r>
+      <w:r>
+        <w:t xml:space="preserve"> </w:t>
+      </w:r>
+      <w:r>
+        <w:rPr>
+          <w:rStyle w:val="VerbatimChar"/>
+        </w:rPr>
+        <w:t xml:space="preserve">docList</w:t>
+      </w:r>
+      <w:r>
+        <w:t xml:space="preserve">, pagine a ~1 s a cache fredda, chiamate non in cache negli head) e la misura CrUX di novembre come evidenza. URL annidati: 404 su entrambi i siti (KOS a livello nginx), link interni tutti assoluti (0/860 KOS, 0/552 AA): i 404 da URL annidati del log AA si chiudono rilanciando il conteggio sulle righe dopo il 21/10. Sitemap AA rifatta con pdoSitemap (448 URL) e noindex legato a «Ricercabile»: da reinviare in Search Console. og:image corretta su tutte le pagine KOS e sulle 128 residenze AA (utile per AA 1). Da coordinare: consolidamento degli head KOS (hreflang, noindex, Canonical) con la voce 24 (JSON-LD delle landing); eventuale Cloud Edge con l'accesso dei crawler AI (KOS-6, AA-19 chiuse sullo stato attuale).</w:t>
       </w:r>
     </w:p>
     <w:p>

</xml_diff>

<commit_message>
Piano: head KOS e temi TTFB guidati da questo progetto; scostamento AA-6 da motivare in consegna
Co-Authored-By: Claude Opus 5.5 <noreply@anthropic.com>
Claude-Session: https://claude.ai/code/session_01Rr1X44gsg7BUwMzrRvYrc2
</commit_message>
<xml_diff>
--- a/docs/docx/piano-sprint-1.docx
+++ b/docs/docx/piano-sprint-1.docx
@@ -142,7 +142,35 @@
         <w:t xml:space="preserve">docList</w:t>
       </w:r>
       <w:r>
-        <w:t xml:space="preserve">, pagine a ~1 s a cache fredda, chiamate non in cache negli head) e la misura CrUX di novembre come evidenza. URL annidati: 404 su entrambi i siti (KOS a livello nginx), link interni tutti assoluti (0/860 KOS, 0/552 AA): i 404 da URL annidati del log AA si chiudono rilanciando il conteggio sulle righe dopo il 21/10. Sitemap AA rifatta con pdoSitemap (448 URL) e noindex legato a «Ricercabile»: da reinviare in Search Console. og:image corretta su tutte le pagine KOS e sulle 128 residenze AA (utile per AA 1). Da coordinare: consolidamento degli head KOS (hreflang, noindex, Canonical) con la voce 24 (JSON-LD delle landing); eventuale Cloud Edge con l'accesso dei crawler AI (KOS-6, AA-19 chiuse sullo stato attuale).</w:t>
+        <w:t xml:space="preserve">, pagine a ~1 s a cache fredda, chiamate non in cache negli head) e la misura CrUX di novembre come evidenza. URL annidati: 404 su entrambi i siti (KOS a livello nginx), link interni tutti assoluti (0/860 KOS, 0/552 AA): i 404 da URL annidati del log AA si chiudono rilanciando il conteggio sulle righe dopo il 21/10. Sitemap AA rifatta con pdoSitemap (448 URL) e noindex legato a «Ricercabile»: da reinviare in Search Console. og:image corretta su tutte le pagine KOS e sulle 128 residenze AA (utile per AA 1). Dal 22/10 questi temi si guidano da questo progetto (l'altra chat è conclusa): consolidamento degli head KOS (hreflang, noindex, Canonical, CSS) nello stesso rilascio della voce 24 (JSON-LD delle landing); eventuale Cloud Edge solo dopo verifica dell'accesso dei crawler AI (KOS-6, AA-19 chiuse sullo stato attuale).</w:t>
+      </w:r>
+      <w:r>
+        <w:t xml:space="preserve"> </w:t>
+      </w:r>
+      <w:r>
+        <w:rPr>
+          <w:bCs/>
+          <w:b/>
+        </w:rPr>
+        <w:t xml:space="preserve">AA-6, scostamento deciso il 22/10:</w:t>
+      </w:r>
+      <w:r>
+        <w:t xml:space="preserve"> </w:t>
+      </w:r>
+      <w:r>
+        <w:t xml:space="preserve">la frase introduttiva sotto l'H1 delle residenze diventa paragrafo, non H2 come propone l'audit; voci dell'accordion H2. Da motivare nella nota di consegna dello sprint 2 (testo in</w:t>
+      </w:r>
+      <w:r>
+        <w:t xml:space="preserve"> </w:t>
+      </w:r>
+      <w:r>
+        <w:rPr>
+          <w:rStyle w:val="VerbatimChar"/>
+        </w:rPr>
+        <w:t xml:space="preserve">docs/aa-1-6.md</w:t>
+      </w:r>
+      <w:r>
+        <w:t xml:space="preserve">).</w:t>
       </w:r>
     </w:p>
     <w:p>

</xml_diff>

<commit_message>
Piano: proposta fuori piano per le immagini delle news ad alta densità (dal 2027)
Co-Authored-By: Claude Opus 5.5 <noreply@anthropic.com>
Claude-Session: https://claude.ai/code/session_01Rr1X44gsg7BUwMzrRvYrc2
</commit_message>
<xml_diff>
--- a/docs/docx/piano-sprint-1.docx
+++ b/docs/docx/piano-sprint-1.docx
@@ -3186,6 +3186,106 @@
       </w:r>
       <w:r>
         <w:t xml:space="preserve">con URL, referrer e conteggio, oppure evento GA4) per trovare link rotti e redirect da creare. Su anniazzurri.it oggi la pagina d'errore è la home (status corretto, esperienza no). Non avviare prima dell'approvazione.</w:t>
+      </w:r>
+    </w:p>
+    <w:p>
+      <w:pPr>
+        <w:numPr>
+          <w:ilvl w:val="0"/>
+          <w:numId w:val="1006"/>
+        </w:numPr>
+        <w:pStyle w:val="Compact"/>
+      </w:pPr>
+      <w:r>
+        <w:rPr>
+          <w:bCs/>
+          <w:b/>
+        </w:rPr>
+        <w:t xml:space="preserve">[AA, dopo il progetto: dal 1° gennaio 2027, da decidere] Immagini delle news per schermi ad alta densità</w:t>
+      </w:r>
+      <w:r>
+        <w:t xml:space="preserve"> </w:t>
+      </w:r>
+      <w:r>
+        <w:t xml:space="preserve">(proposta del 24 ottobre). Oggi la foto della news si prepara a 980×551 (misura di visualizzazione della testata dell'articolo): sugli schermi Retina è meno nitida del possibile. Intervento: foto caricate al doppio (1960×1102, JPG di qualità alta, senza ricompressione esterna); nel template dell'articolo (</w:t>
+      </w:r>
+      <w:r>
+        <w:rPr>
+          <w:rStyle w:val="VerbatimChar"/>
+        </w:rPr>
+        <w:t xml:space="preserve">interna-articolo</w:t>
+      </w:r>
+      <w:r>
+        <w:t xml:space="preserve">,</w:t>
+      </w:r>
+      <w:r>
+        <w:t xml:space="preserve"> </w:t>
+      </w:r>
+      <w:r>
+        <w:rPr>
+          <w:rStyle w:val="VerbatimChar"/>
+        </w:rPr>
+        <w:t xml:space="preserve">albero-dei-ricordi</w:t>
+      </w:r>
+      <w:r>
+        <w:t xml:space="preserve">,</w:t>
+      </w:r>
+      <w:r>
+        <w:t xml:space="preserve"> </w:t>
+      </w:r>
+      <w:r>
+        <w:rPr>
+          <w:rStyle w:val="VerbatimChar"/>
+        </w:rPr>
+        <w:t xml:space="preserve">interna-speaker-per-un-giorno</w:t>
+      </w:r>
+      <w:r>
+        <w:t xml:space="preserve">) larghezza massima di visualizzazione fissata a 980 px e</w:t>
+      </w:r>
+      <w:r>
+        <w:t xml:space="preserve"> </w:t>
+      </w:r>
+      <w:r>
+        <w:rPr>
+          <w:rStyle w:val="VerbatimChar"/>
+        </w:rPr>
+        <w:t xml:space="preserve">sizes</w:t>
+      </w:r>
+      <w:r>
+        <w:t xml:space="preserve"> </w:t>
+      </w:r>
+      <w:r>
+        <w:t xml:space="preserve">coerente, così la pagina resta identica e il browser sceglie la variante 2x dal</w:t>
+      </w:r>
+      <w:r>
+        <w:t xml:space="preserve"> </w:t>
+      </w:r>
+      <w:r>
+        <w:rPr>
+          <w:rStyle w:val="VerbatimChar"/>
+        </w:rPr>
+        <w:t xml:space="preserve">srcset</w:t>
+      </w:r>
+      <w:r>
+        <w:t xml:space="preserve"> </w:t>
+      </w:r>
+      <w:r>
+        <w:t xml:space="preserve">(la libreria genera già le varianti fino alla larghezza del file). Da valutare anche per le card dell'elenco e per</w:t>
+      </w:r>
+      <w:r>
+        <w:t xml:space="preserve"> </w:t>
+      </w:r>
+      <w:r>
+        <w:rPr>
+          <w:rStyle w:val="VerbatimChar"/>
+        </w:rPr>
+        <w:t xml:space="preserve">og:image</w:t>
+      </w:r>
+      <w:r>
+        <w:t xml:space="preserve"> </w:t>
+      </w:r>
+      <w:r>
+        <w:t xml:space="preserve">(1200×630 consigliato dai social). Stima indicativa mezza giornata, collaudo compreso; le foto già pubblicate restano a 980 senza effetti negativi. Non avviare prima dell'approvazione.</w:t>
       </w:r>
     </w:p>
     <w:bookmarkEnd w:id="24"/>

</xml_diff>

<commit_message>
AA og:image con lo snippet comune ogImage: immagine della pagina se esiste, altrimenti quella di condivisione del sito; dimensioni dal file (fuori perimetro, segnalazione dell'agenzia)
Co-Authored-By: Claude Opus 5.5 <noreply@anthropic.com>
Claude-Session: https://claude.ai/code/session_01Rr1X44gsg7BUwMzrRvYrc2
</commit_message>
<xml_diff>
--- a/docs/docx/piano-sprint-1.docx
+++ b/docs/docx/piano-sprint-1.docx
@@ -3286,6 +3286,139 @@
       </w:r>
       <w:r>
         <w:t xml:space="preserve">(1200×630 consigliato dai social). Stima indicativa mezza giornata, collaudo compreso; le foto già pubblicate restano a 980 senza effetti negativi. Non avviare prima dell'approvazione.</w:t>
+      </w:r>
+    </w:p>
+    <w:p>
+      <w:pPr>
+        <w:numPr>
+          <w:ilvl w:val="0"/>
+          <w:numId w:val="1006"/>
+        </w:numPr>
+        <w:pStyle w:val="Compact"/>
+      </w:pPr>
+      <w:r>
+        <w:rPr>
+          <w:bCs/>
+          <w:b/>
+        </w:rPr>
+        <w:t xml:space="preserve">[AA] og:image con immagine di ripiego</w:t>
+      </w:r>
+      <w:r>
+        <w:t xml:space="preserve"> </w:t>
+      </w:r>
+      <w:r>
+        <w:t xml:space="preserve">(segnalazione dell'agenzia, fuori perimetro e non quotata; fatto sullo stage il 24/10 su richiesta di Danilo). Stessa soluzione già in uso su kosgroup.com: snippet comune</w:t>
+      </w:r>
+      <w:r>
+        <w:t xml:space="preserve"> </w:t>
+      </w:r>
+      <w:r>
+        <w:rPr>
+          <w:rStyle w:val="VerbatimChar"/>
+        </w:rPr>
+        <w:t xml:space="preserve">ogImage</w:t>
+      </w:r>
+      <w:r>
+        <w:t xml:space="preserve"> </w:t>
+      </w:r>
+      <w:r>
+        <w:t xml:space="preserve">(</w:t>
+      </w:r>
+      <w:r>
+        <w:rPr>
+          <w:rStyle w:val="VerbatimChar"/>
+        </w:rPr>
+        <w:t xml:space="preserve">shared/snippets/ogImage.php</w:t>
+      </w:r>
+      <w:r>
+        <w:t xml:space="preserve">, in cache) che usa l'immagine della pagina solo se il file esiste, altrimenti</w:t>
+      </w:r>
+      <w:r>
+        <w:t xml:space="preserve"> </w:t>
+      </w:r>
+      <w:r>
+        <w:rPr>
+          <w:rStyle w:val="VerbatimChar"/>
+        </w:rPr>
+        <w:t xml:space="preserve">assets/img/anni-azzurri-condivisione-social.jpg</w:t>
+      </w:r>
+      <w:r>
+        <w:t xml:space="preserve">, con larghezza, altezza e tipo letti dal file (prima fissi a 980×551 sulle news). 26 head e il template</w:t>
+      </w:r>
+      <w:r>
+        <w:t xml:space="preserve"> </w:t>
+      </w:r>
+      <w:r>
+        <w:rPr>
+          <w:rStyle w:val="VerbatimChar"/>
+        </w:rPr>
+        <w:t xml:space="preserve">convegnoAA</w:t>
+      </w:r>
+      <w:r>
+        <w:t xml:space="preserve"> </w:t>
+      </w:r>
+      <w:r>
+        <w:t xml:space="preserve">(</w:t>
+      </w:r>
+      <w:r>
+        <w:rPr>
+          <w:rStyle w:val="VerbatimChar"/>
+        </w:rPr>
+        <w:t xml:space="preserve">scripts/og/converti-og-image.py</w:t>
+      </w:r>
+      <w:r>
+        <w:t xml:space="preserve">, pacchetto</w:t>
+      </w:r>
+      <w:r>
+        <w:t xml:space="preserve"> </w:t>
+      </w:r>
+      <w:r>
+        <w:rPr>
+          <w:rStyle w:val="VerbatimChar"/>
+        </w:rPr>
+        <w:t xml:space="preserve">anniazzurri/deploy/aa-og-image.json</w:t>
+      </w:r>
+      <w:r>
+        <w:t xml:space="preserve">). Caso emerso: la pagina News (template</w:t>
+      </w:r>
+      <w:r>
+        <w:t xml:space="preserve"> </w:t>
+      </w:r>
+      <w:r>
+        <w:rPr>
+          <w:rStyle w:val="VerbatimChar"/>
+        </w:rPr>
+        <w:t xml:space="preserve">news</w:t>
+      </w:r>
+      <w:r>
+        <w:t xml:space="preserve">, head</w:t>
+      </w:r>
+      <w:r>
+        <w:t xml:space="preserve"> </w:t>
+      </w:r>
+      <w:r>
+        <w:rPr>
+          <w:rStyle w:val="VerbatimChar"/>
+        </w:rPr>
+        <w:t xml:space="preserve">head-news</w:t>
+      </w:r>
+      <w:r>
+        <w:t xml:space="preserve">) usciva con</w:t>
+      </w:r>
+      <w:r>
+        <w:t xml:space="preserve"> </w:t>
+      </w:r>
+      <w:r>
+        <w:rPr>
+          <w:rStyle w:val="VerbatimChar"/>
+        </w:rPr>
+        <w:t xml:space="preserve">og:image</w:t>
+      </w:r>
+      <w:r>
+        <w:t xml:space="preserve"> </w:t>
+      </w:r>
+      <w:r>
+        <w:t xml:space="preserve">vuoto. In produzione prima del pacchetto markup AA-1/6, che contiene 5 degli stessi head. Il nuovo snippet è compatibile con quello di kosgroup.com: su KOS si sostituisce nel consolidamento degli head.</w:t>
       </w:r>
     </w:p>
     <w:bookmarkEnd w:id="24"/>

</xml_diff>

<commit_message>
Piano: verifiche per lunedì 26/10 emerse dal collaudo (pagina di prova Melograno Argento Vivo, nomi dei direttori, widget su azzurramente)
Co-Authored-By: Claude Opus 5.5 <noreply@anthropic.com>
Claude-Session: https://claude.ai/code/session_01Rr1X44gsg7BUwMzrRvYrc2
</commit_message>
<xml_diff>
--- a/docs/docx/piano-sprint-1.docx
+++ b/docs/docx/piano-sprint-1.docx
@@ -2,7 +2,7 @@
 <file path=word/document.xml><?xml version="1.0" encoding="utf-8"?>
 <w:document xmlns:w="http://schemas.openxmlformats.org/wordprocessingml/2006/main" xmlns:m="http://schemas.openxmlformats.org/officeDocument/2006/math" xmlns:r="http://schemas.openxmlformats.org/officeDocument/2006/relationships" xmlns:o="urn:schemas-microsoft-com:office:office" xmlns:v="urn:schemas-microsoft-com:vml" xmlns:w10="urn:schemas-microsoft-com:office:word" xmlns:a="http://schemas.openxmlformats.org/drawingml/2006/main" xmlns:pic="http://schemas.openxmlformats.org/drawingml/2006/picture" xmlns:wp="http://schemas.openxmlformats.org/drawingml/2006/wordprocessingDrawing">
   <w:body>
-    <w:bookmarkStart w:id="27" w:name="Xff2d8b895f42074f3d940c259894f313a91b2c2"/>
+    <w:bookmarkStart w:id="28" w:name="Xff2d8b895f42074f3d940c259894f313a91b2c2"/>
     <w:p>
       <w:pPr>
         <w:pStyle w:val="Heading1"/>
@@ -3450,33 +3450,13 @@
       </w:r>
     </w:p>
     <w:bookmarkEnd w:id="24"/>
-    <w:bookmarkStart w:id="25" w:name="X898b42ef2c7e59f20211f0633f37c3831eecc50"/>
+    <w:bookmarkStart w:id="25" w:name="Xccbd241b55281545db5ae3150331824f0f75f18"/>
     <w:p>
       <w:pPr>
         <w:pStyle w:val="Heading2"/>
       </w:pPr>
       <w:r>
-        <w:t xml:space="preserve">Indicazioni dalla strategia AEO/GEO (22 ottobre,</w:t>
-      </w:r>
-      <w:r>
-        <w:t xml:space="preserve"> </w:t>
-      </w:r>
-      <w:r>
-        <w:rPr>
-          <w:rStyle w:val="VerbatimChar"/>
-        </w:rPr>
-        <w:t xml:space="preserve">claude/strategia-aeo-geo.md</w:t>
-      </w:r>
-      <w:r>
-        <w:t xml:space="preserve">)</w:t>
-      </w:r>
-    </w:p>
-    <w:p>
-      <w:pPr>
-        <w:pStyle w:val="FirstParagraph"/>
-      </w:pPr>
-      <w:r>
-        <w:t xml:space="preserve">Dentro il perimetro, da applicare negli sprint:</w:t>
+        <w:t xml:space="preserve">Da verificare lunedì 26 ottobre (emerso dal collaudo del 24/10)</w:t>
       </w:r>
     </w:p>
     <w:p>
@@ -3492,34 +3472,102 @@
           <w:bCs/>
           <w:b/>
         </w:rPr>
-        <w:t xml:space="preserve">Tipo delle residenze</w:t>
-      </w:r>
-      <w:r>
-        <w:t xml:space="preserve">:</w:t>
-      </w:r>
-      <w:r>
-        <w:t xml:space="preserve"> </w:t>
-      </w:r>
-      <w:r>
-        <w:rPr>
-          <w:rStyle w:val="VerbatimChar"/>
-        </w:rPr>
-        <w:t xml:space="preserve">NursingHome</w:t>
-      </w:r>
-      <w:r>
-        <w:t xml:space="preserve"> </w:t>
-      </w:r>
-      <w:r>
-        <w:t xml:space="preserve">non esiste su schema.org (verificato su 30.1); convenzione corretta il 22/10. Decidere con l'agenzia prima dello sprint 3 (proposta</w:t>
-      </w:r>
-      <w:r>
-        <w:t xml:space="preserve"> </w:t>
-      </w:r>
-      <w:r>
-        <w:rPr>
-          <w:rStyle w:val="VerbatimChar"/>
-        </w:rPr>
-        <w:t xml:space="preserve">["MedicalOrganization", "LocalBusiness"]</w:t>
+        <w:t xml:space="preserve">[AA] Pagina</w:t>
+      </w:r>
+      <w:r>
+        <w:rPr>
+          <w:bCs/>
+          <w:b/>
+        </w:rPr>
+        <w:t xml:space="preserve"> </w:t>
+      </w:r>
+      <w:r>
+        <w:rPr>
+          <w:rStyle w:val="VerbatimChar"/>
+          <w:bCs/>
+          <w:b/>
+        </w:rPr>
+        <w:t xml:space="preserve">/melograno-argento-vivo</w:t>
+      </w:r>
+      <w:r>
+        <w:rPr>
+          <w:bCs/>
+          <w:b/>
+        </w:rPr>
+        <w:t xml:space="preserve"> </w:t>
+      </w:r>
+      <w:r>
+        <w:rPr>
+          <w:bCs/>
+          <w:b/>
+        </w:rPr>
+        <w:t xml:space="preserve">(risorsa 489)</w:t>
+      </w:r>
+      <w:r>
+        <w:t xml:space="preserve">: copia della scheda Melograno (risorsa 35) con in più un box sul servizio Argento Vivo; pubblicata e ricercabile, stesso title e H1 della scheda, nessun link interno. Danilo chiede ai responsabili se era una pagina da pubblicare (box da portare nella scheda vera) o una prova abbandonata. Se prova: non pubblicata o eliminata, 301 verso</w:t>
+      </w:r>
+      <w:r>
+        <w:t xml:space="preserve"> </w:t>
+      </w:r>
+      <w:r>
+        <w:rPr>
+          <w:rStyle w:val="VerbatimChar"/>
+        </w:rPr>
+        <w:t xml:space="preserve">/residenza-anni-azzurri-melograno</w:t>
+      </w:r>
+      <w:r>
+        <w:t xml:space="preserve"> </w:t>
+      </w:r>
+      <w:r>
+        <w:t xml:space="preserve">nelle regole web (</w:t>
+      </w:r>
+      <w:r>
+        <w:rPr>
+          <w:rStyle w:val="VerbatimChar"/>
+        </w:rPr>
+        <w:t xml:space="preserve">location = /melograno-argento-vivo</w:t>
+      </w:r>
+      <w:r>
+        <w:t xml:space="preserve">), chunk</w:t>
+      </w:r>
+      <w:r>
+        <w:t xml:space="preserve"> </w:t>
+      </w:r>
+      <w:r>
+        <w:rPr>
+          <w:rStyle w:val="VerbatimChar"/>
+        </w:rPr>
+        <w:t xml:space="preserve">melograno-argento-vivo</w:t>
+      </w:r>
+      <w:r>
+        <w:t xml:space="preserve"> </w:t>
+      </w:r>
+      <w:r>
+        <w:t xml:space="preserve">e</w:t>
+      </w:r>
+      <w:r>
+        <w:t xml:space="preserve"> </w:t>
+      </w:r>
+      <w:r>
+        <w:rPr>
+          <w:rStyle w:val="VerbatimChar"/>
+        </w:rPr>
+        <w:t xml:space="preserve">comfort-melograno-argento-vivo</w:t>
+      </w:r>
+      <w:r>
+        <w:t xml:space="preserve"> </w:t>
+      </w:r>
+      <w:r>
+        <w:t xml:space="preserve">inutilizzati. Controllare anche se la residenza compare due volte negli elenchi per regione e provincia. Foto del direttore mancante già sistemata il 24/10 (copia di</w:t>
+      </w:r>
+      <w:r>
+        <w:t xml:space="preserve"> </w:t>
+      </w:r>
+      <w:r>
+        <w:rPr>
+          <w:rStyle w:val="VerbatimChar"/>
+        </w:rPr>
+        <w:t xml:space="preserve">dir-residenza-anni-azzurri-melograno.jpg</w:t>
       </w:r>
       <w:r>
         <w:t xml:space="preserve">).</w:t>
@@ -3538,55 +3586,13 @@
           <w:bCs/>
           <w:b/>
         </w:rPr>
-        <w:t xml:space="preserve">Medici KOS (voce 11, sprint 3)</w:t>
-      </w:r>
-      <w:r>
-        <w:t xml:space="preserve">:</w:t>
-      </w:r>
-      <w:r>
-        <w:t xml:space="preserve"> </w:t>
-      </w:r>
-      <w:r>
-        <w:rPr>
-          <w:rStyle w:val="VerbatimChar"/>
-        </w:rPr>
-        <w:t xml:space="preserve">IndividualPhysician</w:t>
-      </w:r>
-      <w:r>
-        <w:t xml:space="preserve"> </w:t>
-      </w:r>
-      <w:r>
-        <w:t xml:space="preserve">con</w:t>
-      </w:r>
-      <w:r>
-        <w:t xml:space="preserve"> </w:t>
-      </w:r>
-      <w:r>
-        <w:rPr>
-          <w:rStyle w:val="VerbatimChar"/>
-        </w:rPr>
-        <w:t xml:space="preserve">practicesAt</w:t>
-      </w:r>
-      <w:r>
-        <w:t xml:space="preserve"> </w:t>
-      </w:r>
-      <w:r>
-        <w:t xml:space="preserve">verso il</w:t>
-      </w:r>
-      <w:r>
-        <w:t xml:space="preserve"> </w:t>
-      </w:r>
-      <w:r>
-        <w:rPr>
-          <w:rStyle w:val="VerbatimChar"/>
-        </w:rPr>
-        <w:t xml:space="preserve">#localbusiness</w:t>
-      </w:r>
-      <w:r>
-        <w:t xml:space="preserve"> </w:t>
-      </w:r>
-      <w:r>
-        <w:t xml:space="preserve">della struttura.</w:t>
+        <w:t xml:space="preserve">[AA] Direttori con nomi diversi tra scheda e landing</w:t>
+      </w:r>
+      <w:r>
+        <w:t xml:space="preserve"> </w:t>
+      </w:r>
+      <w:r>
+        <w:t xml:space="preserve">(7 residenze: Il Giardino, Mestre, Parco Sempione, Sant'Anna, Sant'Ambrogio, Santena, Tonengo) e «Direttore» al posto di «Direttrice» (Campi Bisenzio, Beato Angelico, Santa Maria in Chienti, San Rocco): da segnalare a KOS; dopo la correzione si rigenera il pacchetto dei contenuti e l'alt delle foto si allinea.</w:t>
       </w:r>
     </w:p>
     <w:p>
@@ -3602,164 +3608,50 @@
           <w:bCs/>
           <w:b/>
         </w:rPr>
-        <w:t xml:space="preserve">Collaudo di ogni sprint</w:t>
-      </w:r>
-      <w:r>
-        <w:t xml:space="preserve">: controllare anche la pagina servita senza consenso Cookiebot (testi, contatti, dato strutturato presenti); un solo</w:t>
-      </w:r>
-      <w:r>
-        <w:t xml:space="preserve"> </w:t>
-      </w:r>
-      <w:r>
-        <w:rPr>
-          <w:rStyle w:val="VerbatimChar"/>
-        </w:rPr>
-        <w:t xml:space="preserve">@graph</w:t>
-      </w:r>
-      <w:r>
-        <w:t xml:space="preserve"> </w:t>
-      </w:r>
-      <w:r>
-        <w:t xml:space="preserve">valido, H1, canonical, sitemap su un campione per template (estendere</w:t>
-      </w:r>
-      <w:r>
-        <w:t xml:space="preserve"> </w:t>
-      </w:r>
-      <w:r>
-        <w:rPr>
-          <w:rStyle w:val="VerbatimChar"/>
-        </w:rPr>
-        <w:t xml:space="preserve">verifica-rilascio-*.ps1</w:t>
-      </w:r>
-      <w:r>
-        <w:t xml:space="preserve">).</w:t>
-      </w:r>
-    </w:p>
-    <w:p>
-      <w:pPr>
-        <w:numPr>
-          <w:ilvl w:val="0"/>
-          <w:numId w:val="1007"/>
-        </w:numPr>
-        <w:pStyle w:val="Compact"/>
-      </w:pPr>
-      <w:r>
-        <w:rPr>
-          <w:bCs/>
-          <w:b/>
-        </w:rPr>
-        <w:t xml:space="preserve">Title e description AA (voce 20, sprint 2)</w:t>
-      </w:r>
-      <w:r>
-        <w:t xml:space="preserve">: prima dell'import, controllare in Search Console la ripartizione delle query tra «RSA», «casa di riposo», «residenza per anziani» e usare i termini più cercati; testi generati o importati sempre rivisti.</w:t>
-      </w:r>
-    </w:p>
-    <w:p>
-      <w:pPr>
-        <w:numPr>
-          <w:ilvl w:val="0"/>
-          <w:numId w:val="1007"/>
-        </w:numPr>
-        <w:pStyle w:val="Compact"/>
-      </w:pPr>
-      <w:r>
-        <w:rPr>
-          <w:bCs/>
-          <w:b/>
-        </w:rPr>
-        <w:t xml:space="preserve">Schede struttura (sprint 2 KOS, sprint 3 AA)</w:t>
-      </w:r>
-      <w:r>
-        <w:t xml:space="preserve">: togliere lo script Yext che inietta il dato; le schede devono differire nella sostanza (servizi, nuclei, contatti), non solo nel nome.</w:t>
-      </w:r>
-    </w:p>
-    <w:p>
-      <w:pPr>
-        <w:numPr>
-          <w:ilvl w:val="0"/>
-          <w:numId w:val="1007"/>
-        </w:numPr>
-        <w:pStyle w:val="Compact"/>
-      </w:pPr>
-      <w:r>
-        <w:rPr>
-          <w:bCs/>
-          <w:b/>
-        </w:rPr>
-        <w:t xml:space="preserve">Articoli (voce 10 KOS, sprint 3)</w:t>
-      </w:r>
-      <w:r>
-        <w:t xml:space="preserve">:</w:t>
-      </w:r>
-      <w:r>
-        <w:t xml:space="preserve"> </w:t>
-      </w:r>
-      <w:r>
-        <w:rPr>
-          <w:rStyle w:val="VerbatimChar"/>
-        </w:rPr>
-        <w:t xml:space="preserve">MedicalWebPage</w:t>
-      </w:r>
-      <w:r>
-        <w:t xml:space="preserve"> </w:t>
-      </w:r>
-      <w:r>
-        <w:t xml:space="preserve">con</w:t>
-      </w:r>
-      <w:r>
-        <w:t xml:space="preserve"> </w:t>
-      </w:r>
-      <w:r>
-        <w:rPr>
-          <w:rStyle w:val="VerbatimChar"/>
-        </w:rPr>
-        <w:t xml:space="preserve">lastReviewed</w:t>
-      </w:r>
-      <w:r>
-        <w:t xml:space="preserve">/</w:t>
-      </w:r>
-      <w:r>
-        <w:rPr>
-          <w:rStyle w:val="VerbatimChar"/>
-        </w:rPr>
-        <w:t xml:space="preserve">reviewedBy</w:t>
-      </w:r>
-      <w:r>
-        <w:t xml:space="preserve"> </w:t>
-      </w:r>
-      <w:r>
-        <w:t xml:space="preserve">solo dove c'è un revisore reale; autore = ente finché KOS non ha firme; data visibile coerente con</w:t>
-      </w:r>
-      <w:r>
-        <w:t xml:space="preserve"> </w:t>
-      </w:r>
-      <w:r>
-        <w:rPr>
-          <w:rStyle w:val="VerbatimChar"/>
-        </w:rPr>
-        <w:t xml:space="preserve">dateModified</w:t>
-      </w:r>
-      <w:r>
-        <w:t xml:space="preserve">.</w:t>
-      </w:r>
-    </w:p>
-    <w:p>
-      <w:pPr>
-        <w:numPr>
-          <w:ilvl w:val="0"/>
-          <w:numId w:val="1007"/>
-        </w:numPr>
-        <w:pStyle w:val="Compact"/>
-      </w:pPr>
-      <w:r>
-        <w:rPr>
-          <w:bCs/>
-          <w:b/>
-        </w:rPr>
-        <w:t xml:space="preserve">FAQ</w:t>
-      </w:r>
-      <w:r>
-        <w:t xml:space="preserve">: il risultato FAQ di Google non è più mostrato (maggio 2026): FAQ come testo visibile, markup facoltativo.</w:t>
+        <w:t xml:space="preserve">[AA] Widget di accessibilità e chat su</w:t>
+      </w:r>
+      <w:r>
+        <w:rPr>
+          <w:bCs/>
+          <w:b/>
+        </w:rPr>
+        <w:t xml:space="preserve"> </w:t>
+      </w:r>
+      <w:r>
+        <w:rPr>
+          <w:rStyle w:val="VerbatimChar"/>
+          <w:bCs/>
+          <w:b/>
+        </w:rPr>
+        <w:t xml:space="preserve">/azzurramente</w:t>
+      </w:r>
+      <w:r>
+        <w:t xml:space="preserve"> </w:t>
+      </w:r>
+      <w:r>
+        <w:t xml:space="preserve">(solo in produzione): coprono il titolo «Cos'è AzzurraMente»; da segnalare a chi gestisce i widget.</w:t>
+      </w:r>
+    </w:p>
+    <w:bookmarkEnd w:id="25"/>
+    <w:bookmarkStart w:id="26" w:name="X898b42ef2c7e59f20211f0633f37c3831eecc50"/>
+    <w:p>
+      <w:pPr>
+        <w:pStyle w:val="Heading2"/>
+      </w:pPr>
+      <w:r>
+        <w:t xml:space="preserve">Indicazioni dalla strategia AEO/GEO (22 ottobre,</w:t>
+      </w:r>
+      <w:r>
+        <w:t xml:space="preserve"> </w:t>
+      </w:r>
+      <w:r>
+        <w:rPr>
+          <w:rStyle w:val="VerbatimChar"/>
+        </w:rPr>
+        <w:t xml:space="preserve">claude/strategia-aeo-geo.md</w:t>
+      </w:r>
+      <w:r>
+        <w:t xml:space="preserve">)</w:t>
       </w:r>
     </w:p>
     <w:p>
@@ -3767,17 +3659,7 @@
         <w:pStyle w:val="FirstParagraph"/>
       </w:pPr>
       <w:r>
-        <w:t xml:space="preserve">Fuori perimetro, da proporre (non nei documenti condivisi): baseline di misura entro fine novembre (Search Console, Bing AI Performance, canale AI in GA4, set di prompt ripetuti), IndexNow alla pubblicazione, domanda «come ci ha conosciuto?» nei moduli, profili Google dopo RetailTune (vedi analisi del documento PWC Local del 22/10: niente parole chiave nei nomi; test di categoria su un campione; programma recensioni).</w:t>
-      </w:r>
-    </w:p>
-    <w:bookmarkEnd w:id="25"/>
-    <w:bookmarkStart w:id="26" w:name="X6106934d94086303083d981b094913fadf78d77"/>
-    <w:p>
-      <w:pPr>
-        <w:pStyle w:val="Heading2"/>
-      </w:pPr>
-      <w:r>
-        <w:t xml:space="preserve">Preparazione per lo sprint 2 (da avviare nella settimana del 26)</w:t>
+        <w:t xml:space="preserve">Dentro il perimetro, da applicare negli sprint:</w:t>
       </w:r>
     </w:p>
     <w:p>
@@ -3789,7 +3671,41 @@
         <w:pStyle w:val="Compact"/>
       </w:pPr>
       <w:r>
-        <w:t xml:space="preserve">Script di import dei dati anagrafici dall'export Yext corretto nelle TV dei due siti (import 2-6 novembre), con report delle differenze su KOS.</w:t>
+        <w:rPr>
+          <w:bCs/>
+          <w:b/>
+        </w:rPr>
+        <w:t xml:space="preserve">Tipo delle residenze</w:t>
+      </w:r>
+      <w:r>
+        <w:t xml:space="preserve">:</w:t>
+      </w:r>
+      <w:r>
+        <w:t xml:space="preserve"> </w:t>
+      </w:r>
+      <w:r>
+        <w:rPr>
+          <w:rStyle w:val="VerbatimChar"/>
+        </w:rPr>
+        <w:t xml:space="preserve">NursingHome</w:t>
+      </w:r>
+      <w:r>
+        <w:t xml:space="preserve"> </w:t>
+      </w:r>
+      <w:r>
+        <w:t xml:space="preserve">non esiste su schema.org (verificato su 30.1); convenzione corretta il 22/10. Decidere con l'agenzia prima dello sprint 3 (proposta</w:t>
+      </w:r>
+      <w:r>
+        <w:t xml:space="preserve"> </w:t>
+      </w:r>
+      <w:r>
+        <w:rPr>
+          <w:rStyle w:val="VerbatimChar"/>
+        </w:rPr>
+        <w:t xml:space="preserve">["MedicalOrganization", "LocalBusiness"]</w:t>
+      </w:r>
+      <w:r>
+        <w:t xml:space="preserve">).</w:t>
       </w:r>
     </w:p>
     <w:p>
@@ -3801,7 +3717,59 @@
         <w:pStyle w:val="Compact"/>
       </w:pPr>
       <w:r>
-        <w:t xml:space="preserve">Creazione delle TV anagrafiche su AA.</w:t>
+        <w:rPr>
+          <w:bCs/>
+          <w:b/>
+        </w:rPr>
+        <w:t xml:space="preserve">Medici KOS (voce 11, sprint 3)</w:t>
+      </w:r>
+      <w:r>
+        <w:t xml:space="preserve">:</w:t>
+      </w:r>
+      <w:r>
+        <w:t xml:space="preserve"> </w:t>
+      </w:r>
+      <w:r>
+        <w:rPr>
+          <w:rStyle w:val="VerbatimChar"/>
+        </w:rPr>
+        <w:t xml:space="preserve">IndividualPhysician</w:t>
+      </w:r>
+      <w:r>
+        <w:t xml:space="preserve"> </w:t>
+      </w:r>
+      <w:r>
+        <w:t xml:space="preserve">con</w:t>
+      </w:r>
+      <w:r>
+        <w:t xml:space="preserve"> </w:t>
+      </w:r>
+      <w:r>
+        <w:rPr>
+          <w:rStyle w:val="VerbatimChar"/>
+        </w:rPr>
+        <w:t xml:space="preserve">practicesAt</w:t>
+      </w:r>
+      <w:r>
+        <w:t xml:space="preserve"> </w:t>
+      </w:r>
+      <w:r>
+        <w:t xml:space="preserve">verso il</w:t>
+      </w:r>
+      <w:r>
+        <w:t xml:space="preserve"> </w:t>
+      </w:r>
+      <w:r>
+        <w:rPr>
+          <w:rStyle w:val="VerbatimChar"/>
+        </w:rPr>
+        <w:t xml:space="preserve">#localbusiness</w:t>
+      </w:r>
+      <w:r>
+        <w:t xml:space="preserve"> </w:t>
+      </w:r>
+      <w:r>
+        <w:t xml:space="preserve">della struttura.</w:t>
       </w:r>
     </w:p>
     <w:p>
@@ -3817,25 +3785,37 @@
           <w:bCs/>
           <w:b/>
         </w:rPr>
-        <w:t xml:space="preserve">[AA] Title e description (20) e H2 (6), sprint 2</w:t>
-      </w:r>
-      <w:r>
-        <w:t xml:space="preserve">: fonte dei testi</w:t>
-      </w:r>
-      <w:r>
-        <w:t xml:space="preserve"> </w:t>
-      </w:r>
-      <w:r>
-        <w:rPr>
-          <w:rStyle w:val="VerbatimChar"/>
-        </w:rPr>
-        <w:t xml:space="preserve">202607_PWC_AnniAzzurri_Ottimizzazioni_Meta_Tag_v2_Ant.xlsx</w:t>
-      </w:r>
-      <w:r>
-        <w:t xml:space="preserve"> </w:t>
-      </w:r>
-      <w:r>
-        <w:t xml:space="preserve">(stato al 7/7/2026): 88 URL (22 regioni e province, 58 residenze, 8 pagine editoriali) con title, H1 e description attuali e suggeriti. Decisione di luglio: H1 suggeriti non applicati (nomi coerenti con GBP; H1 solo dove mancavano, fatto nello sprint 1); title e description importati con script. Da verificare prima: che sia la versione validata richiesta nel calendario, 6 title suggeriti oltre 65 caratteri, pagine cambiate dopo luglio; le pagine dell'audit fuori dagli 88 URL (title/description lunghi, mancanti, duplicati) vanno coperte a parte. Su alcuni articoli il title attuale ripete «| Anni Azzurri | Anni Azzurri»: probabile suffisso aggiunto dal template a un longtitle che lo contiene già, da correggere nel template.</w:t>
+        <w:t xml:space="preserve">Collaudo di ogni sprint</w:t>
+      </w:r>
+      <w:r>
+        <w:t xml:space="preserve">: controllare anche la pagina servita senza consenso Cookiebot (testi, contatti, dato strutturato presenti); un solo</w:t>
+      </w:r>
+      <w:r>
+        <w:t xml:space="preserve"> </w:t>
+      </w:r>
+      <w:r>
+        <w:rPr>
+          <w:rStyle w:val="VerbatimChar"/>
+        </w:rPr>
+        <w:t xml:space="preserve">@graph</w:t>
+      </w:r>
+      <w:r>
+        <w:t xml:space="preserve"> </w:t>
+      </w:r>
+      <w:r>
+        <w:t xml:space="preserve">valido, H1, canonical, sitemap su un campione per template (estendere</w:t>
+      </w:r>
+      <w:r>
+        <w:t xml:space="preserve"> </w:t>
+      </w:r>
+      <w:r>
+        <w:rPr>
+          <w:rStyle w:val="VerbatimChar"/>
+        </w:rPr>
+        <w:t xml:space="preserve">verifica-rilascio-*.ps1</w:t>
+      </w:r>
+      <w:r>
+        <w:t xml:space="preserve">).</w:t>
       </w:r>
     </w:p>
     <w:p>
@@ -3851,58 +3831,10 @@
           <w:bCs/>
           <w:b/>
         </w:rPr>
-        <w:t xml:space="preserve">Segreti scritti nel codice</w:t>
-      </w:r>
-      <w:r>
-        <w:t xml:space="preserve"> </w:t>
-      </w:r>
-      <w:r>
-        <w:t xml:space="preserve">(emersi dalla baseline del 19 ottobre, sostituiti con segnaposto nel repository): chiave YouTube Data API in</w:t>
-      </w:r>
-      <w:r>
-        <w:t xml:space="preserve"> </w:t>
-      </w:r>
-      <w:r>
-        <w:rPr>
-          <w:rStyle w:val="VerbatimChar"/>
-        </w:rPr>
-        <w:t xml:space="preserve">syncYoutubeVideos</w:t>
-      </w:r>
-      <w:r>
-        <w:t xml:space="preserve"> </w:t>
-      </w:r>
-      <w:r>
-        <w:t xml:space="preserve">e token Arca24 in</w:t>
-      </w:r>
-      <w:r>
-        <w:t xml:space="preserve"> </w:t>
-      </w:r>
-      <w:r>
-        <w:rPr>
-          <w:rStyle w:val="VerbatimChar"/>
-        </w:rPr>
-        <w:t xml:space="preserve">arca24Import</w:t>
-      </w:r>
-      <w:r>
-        <w:t xml:space="preserve"> </w:t>
-      </w:r>
-      <w:r>
-        <w:t xml:space="preserve">(KOS), chiave di cifratura in</w:t>
-      </w:r>
-      <w:r>
-        <w:t xml:space="preserve"> </w:t>
-      </w:r>
-      <w:r>
-        <w:rPr>
-          <w:rStyle w:val="VerbatimChar"/>
-        </w:rPr>
-        <w:t xml:space="preserve">countContact</w:t>
-      </w:r>
-      <w:r>
-        <w:t xml:space="preserve"> </w:t>
-      </w:r>
-      <w:r>
-        <w:t xml:space="preserve">(AA). Quando questi snippet diventano statici, i valori vanno spostati in impostazioni di sistema; valutare con KOS la rigenerazione della chiave YouTube.</w:t>
+        <w:t xml:space="preserve">Title e description AA (voce 20, sprint 2)</w:t>
+      </w:r>
+      <w:r>
+        <w:t xml:space="preserve">: prima dell'import, controllare in Search Console la ripartizione delle query tra «RSA», «casa di riposo», «residenza per anziani» e usare i termini più cercati; testi generati o importati sempre rivisti.</w:t>
       </w:r>
     </w:p>
     <w:p>
@@ -3914,6 +3846,257 @@
         <w:pStyle w:val="Compact"/>
       </w:pPr>
       <w:r>
+        <w:rPr>
+          <w:bCs/>
+          <w:b/>
+        </w:rPr>
+        <w:t xml:space="preserve">Schede struttura (sprint 2 KOS, sprint 3 AA)</w:t>
+      </w:r>
+      <w:r>
+        <w:t xml:space="preserve">: togliere lo script Yext che inietta il dato; le schede devono differire nella sostanza (servizi, nuclei, contatti), non solo nel nome.</w:t>
+      </w:r>
+    </w:p>
+    <w:p>
+      <w:pPr>
+        <w:numPr>
+          <w:ilvl w:val="0"/>
+          <w:numId w:val="1008"/>
+        </w:numPr>
+        <w:pStyle w:val="Compact"/>
+      </w:pPr>
+      <w:r>
+        <w:rPr>
+          <w:bCs/>
+          <w:b/>
+        </w:rPr>
+        <w:t xml:space="preserve">Articoli (voce 10 KOS, sprint 3)</w:t>
+      </w:r>
+      <w:r>
+        <w:t xml:space="preserve">:</w:t>
+      </w:r>
+      <w:r>
+        <w:t xml:space="preserve"> </w:t>
+      </w:r>
+      <w:r>
+        <w:rPr>
+          <w:rStyle w:val="VerbatimChar"/>
+        </w:rPr>
+        <w:t xml:space="preserve">MedicalWebPage</w:t>
+      </w:r>
+      <w:r>
+        <w:t xml:space="preserve"> </w:t>
+      </w:r>
+      <w:r>
+        <w:t xml:space="preserve">con</w:t>
+      </w:r>
+      <w:r>
+        <w:t xml:space="preserve"> </w:t>
+      </w:r>
+      <w:r>
+        <w:rPr>
+          <w:rStyle w:val="VerbatimChar"/>
+        </w:rPr>
+        <w:t xml:space="preserve">lastReviewed</w:t>
+      </w:r>
+      <w:r>
+        <w:t xml:space="preserve">/</w:t>
+      </w:r>
+      <w:r>
+        <w:rPr>
+          <w:rStyle w:val="VerbatimChar"/>
+        </w:rPr>
+        <w:t xml:space="preserve">reviewedBy</w:t>
+      </w:r>
+      <w:r>
+        <w:t xml:space="preserve"> </w:t>
+      </w:r>
+      <w:r>
+        <w:t xml:space="preserve">solo dove c'è un revisore reale; autore = ente finché KOS non ha firme; data visibile coerente con</w:t>
+      </w:r>
+      <w:r>
+        <w:t xml:space="preserve"> </w:t>
+      </w:r>
+      <w:r>
+        <w:rPr>
+          <w:rStyle w:val="VerbatimChar"/>
+        </w:rPr>
+        <w:t xml:space="preserve">dateModified</w:t>
+      </w:r>
+      <w:r>
+        <w:t xml:space="preserve">.</w:t>
+      </w:r>
+    </w:p>
+    <w:p>
+      <w:pPr>
+        <w:numPr>
+          <w:ilvl w:val="0"/>
+          <w:numId w:val="1008"/>
+        </w:numPr>
+        <w:pStyle w:val="Compact"/>
+      </w:pPr>
+      <w:r>
+        <w:rPr>
+          <w:bCs/>
+          <w:b/>
+        </w:rPr>
+        <w:t xml:space="preserve">FAQ</w:t>
+      </w:r>
+      <w:r>
+        <w:t xml:space="preserve">: il risultato FAQ di Google non è più mostrato (maggio 2026): FAQ come testo visibile, markup facoltativo.</w:t>
+      </w:r>
+    </w:p>
+    <w:p>
+      <w:pPr>
+        <w:pStyle w:val="FirstParagraph"/>
+      </w:pPr>
+      <w:r>
+        <w:t xml:space="preserve">Fuori perimetro, da proporre (non nei documenti condivisi): baseline di misura entro fine novembre (Search Console, Bing AI Performance, canale AI in GA4, set di prompt ripetuti), IndexNow alla pubblicazione, domanda «come ci ha conosciuto?» nei moduli, profili Google dopo RetailTune (vedi analisi del documento PWC Local del 22/10: niente parole chiave nei nomi; test di categoria su un campione; programma recensioni).</w:t>
+      </w:r>
+    </w:p>
+    <w:bookmarkEnd w:id="26"/>
+    <w:bookmarkStart w:id="27" w:name="X6106934d94086303083d981b094913fadf78d77"/>
+    <w:p>
+      <w:pPr>
+        <w:pStyle w:val="Heading2"/>
+      </w:pPr>
+      <w:r>
+        <w:t xml:space="preserve">Preparazione per lo sprint 2 (da avviare nella settimana del 26)</w:t>
+      </w:r>
+    </w:p>
+    <w:p>
+      <w:pPr>
+        <w:numPr>
+          <w:ilvl w:val="0"/>
+          <w:numId w:val="1009"/>
+        </w:numPr>
+        <w:pStyle w:val="Compact"/>
+      </w:pPr>
+      <w:r>
+        <w:t xml:space="preserve">Script di import dei dati anagrafici dall'export Yext corretto nelle TV dei due siti (import 2-6 novembre), con report delle differenze su KOS.</w:t>
+      </w:r>
+    </w:p>
+    <w:p>
+      <w:pPr>
+        <w:numPr>
+          <w:ilvl w:val="0"/>
+          <w:numId w:val="1009"/>
+        </w:numPr>
+        <w:pStyle w:val="Compact"/>
+      </w:pPr>
+      <w:r>
+        <w:t xml:space="preserve">Creazione delle TV anagrafiche su AA.</w:t>
+      </w:r>
+    </w:p>
+    <w:p>
+      <w:pPr>
+        <w:numPr>
+          <w:ilvl w:val="0"/>
+          <w:numId w:val="1009"/>
+        </w:numPr>
+        <w:pStyle w:val="Compact"/>
+      </w:pPr>
+      <w:r>
+        <w:rPr>
+          <w:bCs/>
+          <w:b/>
+        </w:rPr>
+        <w:t xml:space="preserve">[AA] Title e description (20) e H2 (6), sprint 2</w:t>
+      </w:r>
+      <w:r>
+        <w:t xml:space="preserve">: fonte dei testi</w:t>
+      </w:r>
+      <w:r>
+        <w:t xml:space="preserve"> </w:t>
+      </w:r>
+      <w:r>
+        <w:rPr>
+          <w:rStyle w:val="VerbatimChar"/>
+        </w:rPr>
+        <w:t xml:space="preserve">202607_PWC_AnniAzzurri_Ottimizzazioni_Meta_Tag_v2_Ant.xlsx</w:t>
+      </w:r>
+      <w:r>
+        <w:t xml:space="preserve"> </w:t>
+      </w:r>
+      <w:r>
+        <w:t xml:space="preserve">(stato al 7/7/2026): 88 URL (22 regioni e province, 58 residenze, 8 pagine editoriali) con title, H1 e description attuali e suggeriti. Decisione di luglio: H1 suggeriti non applicati (nomi coerenti con GBP; H1 solo dove mancavano, fatto nello sprint 1); title e description importati con script. Da verificare prima: che sia la versione validata richiesta nel calendario, 6 title suggeriti oltre 65 caratteri, pagine cambiate dopo luglio; le pagine dell'audit fuori dagli 88 URL (title/description lunghi, mancanti, duplicati) vanno coperte a parte. Su alcuni articoli il title attuale ripete «| Anni Azzurri | Anni Azzurri»: probabile suffisso aggiunto dal template a un longtitle che lo contiene già, da correggere nel template.</w:t>
+      </w:r>
+    </w:p>
+    <w:p>
+      <w:pPr>
+        <w:numPr>
+          <w:ilvl w:val="0"/>
+          <w:numId w:val="1009"/>
+        </w:numPr>
+        <w:pStyle w:val="Compact"/>
+      </w:pPr>
+      <w:r>
+        <w:rPr>
+          <w:bCs/>
+          <w:b/>
+        </w:rPr>
+        <w:t xml:space="preserve">Segreti scritti nel codice</w:t>
+      </w:r>
+      <w:r>
+        <w:t xml:space="preserve"> </w:t>
+      </w:r>
+      <w:r>
+        <w:t xml:space="preserve">(emersi dalla baseline del 19 ottobre, sostituiti con segnaposto nel repository): chiave YouTube Data API in</w:t>
+      </w:r>
+      <w:r>
+        <w:t xml:space="preserve"> </w:t>
+      </w:r>
+      <w:r>
+        <w:rPr>
+          <w:rStyle w:val="VerbatimChar"/>
+        </w:rPr>
+        <w:t xml:space="preserve">syncYoutubeVideos</w:t>
+      </w:r>
+      <w:r>
+        <w:t xml:space="preserve"> </w:t>
+      </w:r>
+      <w:r>
+        <w:t xml:space="preserve">e token Arca24 in</w:t>
+      </w:r>
+      <w:r>
+        <w:t xml:space="preserve"> </w:t>
+      </w:r>
+      <w:r>
+        <w:rPr>
+          <w:rStyle w:val="VerbatimChar"/>
+        </w:rPr>
+        <w:t xml:space="preserve">arca24Import</w:t>
+      </w:r>
+      <w:r>
+        <w:t xml:space="preserve"> </w:t>
+      </w:r>
+      <w:r>
+        <w:t xml:space="preserve">(KOS), chiave di cifratura in</w:t>
+      </w:r>
+      <w:r>
+        <w:t xml:space="preserve"> </w:t>
+      </w:r>
+      <w:r>
+        <w:rPr>
+          <w:rStyle w:val="VerbatimChar"/>
+        </w:rPr>
+        <w:t xml:space="preserve">countContact</w:t>
+      </w:r>
+      <w:r>
+        <w:t xml:space="preserve"> </w:t>
+      </w:r>
+      <w:r>
+        <w:t xml:space="preserve">(AA). Quando questi snippet diventano statici, i valori vanno spostati in impostazioni di sistema; valutare con KOS la rigenerazione della chiave YouTube.</w:t>
+      </w:r>
+    </w:p>
+    <w:p>
+      <w:pPr>
+        <w:numPr>
+          <w:ilvl w:val="0"/>
+          <w:numId w:val="1009"/>
+        </w:numPr>
+        <w:pStyle w:val="Compact"/>
+      </w:pPr>
+      <w:r>
         <w:t xml:space="preserve">Attività già registrate per lo sprint 2: cache di</w:t>
       </w:r>
       <w:r>
@@ -3941,8 +4124,8 @@
         <w:t xml:space="preserve">, redirect cartelle documenti (KOS); immagini e PDF mancanti (AA).</w:t>
       </w:r>
     </w:p>
-    <w:bookmarkEnd w:id="26"/>
     <w:bookmarkEnd w:id="27"/>
+    <w:bookmarkEnd w:id="28"/>
     <w:sectPr/>
   </w:body>
 </w:document>
@@ -4486,6 +4669,9 @@
     <w:abstractNumId w:val="991"/>
   </w:num>
   <w:num w:numId="1008">
+    <w:abstractNumId w:val="991"/>
+  </w:num>
+  <w:num w:numId="1009">
     <w:abstractNumId w:val="991"/>
   </w:num>
 </w:numbering>

</xml_diff>

<commit_message>
Piano: link a PDF rotti da verificare lunedì (AA-3)
Co-Authored-By: Claude Opus 5.5 <noreply@anthropic.com>
Claude-Session: https://claude.ai/code/session_01Rr1X44gsg7BUwMzrRvYrc2
</commit_message>
<xml_diff>
--- a/docs/docx/piano-sprint-1.docx
+++ b/docs/docx/piano-sprint-1.docx
@@ -3593,6 +3593,88 @@
       </w:r>
       <w:r>
         <w:t xml:space="preserve">(7 residenze: Il Giardino, Mestre, Parco Sempione, Sant'Anna, Sant'Ambrogio, Santena, Tonengo) e «Direttore» al posto di «Direttrice» (Campi Bisenzio, Beato Angelico, Santa Maria in Chienti, San Rocco): da segnalare a KOS; dopo la correzione si rigenera il pacchetto dei contenuti e l'alt delle foto si allinea.</w:t>
+      </w:r>
+    </w:p>
+    <w:p>
+      <w:pPr>
+        <w:numPr>
+          <w:ilvl w:val="0"/>
+          <w:numId w:val="1007"/>
+        </w:numPr>
+        <w:pStyle w:val="Compact"/>
+      </w:pPr>
+      <w:r>
+        <w:rPr>
+          <w:bCs/>
+          <w:b/>
+        </w:rPr>
+        <w:t xml:space="preserve">[AA] Link a PDF rotti nel sito (AA-3, scansione del 24/10)</w:t>
+      </w:r>
+      <w:r>
+        <w:t xml:space="preserve">: questionari di ammissione ASL-MB socio-anagrafico e sanitario (pagina Documentazione, risorsa 167), Carta dei servizi di La Margherita (chunk</w:t>
+      </w:r>
+      <w:r>
+        <w:t xml:space="preserve"> </w:t>
+      </w:r>
+      <w:r>
+        <w:rPr>
+          <w:rStyle w:val="VerbatimChar"/>
+        </w:rPr>
+        <w:t xml:space="preserve">cdsList</w:t>
+      </w:r>
+      <w:r>
+        <w:t xml:space="preserve">), informativa privacy del modulo</w:t>
+      </w:r>
+      <w:r>
+        <w:t xml:space="preserve"> </w:t>
+      </w:r>
+      <w:r>
+        <w:rPr>
+          <w:rStyle w:val="VerbatimChar"/>
+        </w:rPr>
+        <w:t xml:space="preserve">registrationFormKAfree</w:t>
+      </w:r>
+      <w:r>
+        <w:t xml:space="preserve"> </w:t>
+      </w:r>
+      <w:r>
+        <w:t xml:space="preserve">(</w:t>
+      </w:r>
+      <w:r>
+        <w:rPr>
+          <w:rStyle w:val="VerbatimChar"/>
+        </w:rPr>
+        <w:t xml:space="preserve">/assets/files/formazione/informativa-convegni-Kos-Care.pdf</w:t>
+      </w:r>
+      <w:r>
+        <w:t xml:space="preserve">; verificare se il modulo è ancora in uso e quale informativa usare: il modulo attuale</w:t>
+      </w:r>
+      <w:r>
+        <w:t xml:space="preserve"> </w:t>
+      </w:r>
+      <w:r>
+        <w:rPr>
+          <w:rStyle w:val="VerbatimChar"/>
+        </w:rPr>
+        <w:t xml:space="preserve">ecmIscrizione</w:t>
+      </w:r>
+      <w:r>
+        <w:t xml:space="preserve"> </w:t>
+      </w:r>
+      <w:r>
+        <w:t xml:space="preserve">usa</w:t>
+      </w:r>
+      <w:r>
+        <w:t xml:space="preserve"> </w:t>
+      </w:r>
+      <w:r>
+        <w:rPr>
+          <w:rStyle w:val="VerbatimChar"/>
+        </w:rPr>
+        <w:t xml:space="preserve">/assets/doc/KOS-Care_GDPR_Informativa.pdf</w:t>
+      </w:r>
+      <w:r>
+        <w:t xml:space="preserve">). Chiedere i documenti alle strutture o togliere i link.</w:t>
       </w:r>
     </w:p>
     <w:p>

</xml_diff>

<commit_message>
Piano: ambienti di sviluppo in GA4 e cloud KOS aperto ai motori, da verificare lunedì
Co-Authored-By: Claude Opus 5.5 <noreply@anthropic.com>
Claude-Session: https://claude.ai/code/session_01Rr1X44gsg7BUwMzrRvYrc2
</commit_message>
<xml_diff>
--- a/docs/docx/piano-sprint-1.docx
+++ b/docs/docx/piano-sprint-1.docx
@@ -3675,6 +3675,232 @@
       </w:r>
       <w:r>
         <w:t xml:space="preserve">). Chiedere i documenti alle strutture o togliere i link.</w:t>
+      </w:r>
+    </w:p>
+    <w:p>
+      <w:pPr>
+        <w:numPr>
+          <w:ilvl w:val="0"/>
+          <w:numId w:val="1007"/>
+        </w:numPr>
+        <w:pStyle w:val="Compact"/>
+      </w:pPr>
+      <w:r>
+        <w:rPr>
+          <w:bCs/>
+          <w:b/>
+        </w:rPr>
+        <w:t xml:space="preserve">[2 siti] Traffico degli ambienti di sviluppo in GA4</w:t>
+      </w:r>
+      <w:r>
+        <w:t xml:space="preserve"> </w:t>
+      </w:r>
+      <w:r>
+        <w:t xml:space="preserve">(BigQuery, 24/10): eventi da 7 host</w:t>
+      </w:r>
+      <w:r>
+        <w:t xml:space="preserve"> </w:t>
+      </w:r>
+      <w:r>
+        <w:rPr>
+          <w:rStyle w:val="VerbatimChar"/>
+        </w:rPr>
+        <w:t xml:space="preserve">*.modx.dev</w:t>
+      </w:r>
+      <w:r>
+        <w:t xml:space="preserve"> </w:t>
+      </w:r>
+      <w:r>
+        <w:t xml:space="preserve">da gennaio, perché le copie dei siti contengono lo stesso Tag Manager. Condizione «Page Hostname» sui tag di misura nei contenitori GTM dei due siti (lasciare</w:t>
+      </w:r>
+      <w:r>
+        <w:t xml:space="preserve"> </w:t>
+      </w:r>
+      <w:r>
+        <w:rPr>
+          <w:rStyle w:val="VerbatimChar"/>
+        </w:rPr>
+        <w:t xml:space="preserve">app.tuotempo.com</w:t>
+      </w:r>
+      <w:r>
+        <w:t xml:space="preserve">, prenotazioni); nelle analisi BigQuery escludere gli host</w:t>
+      </w:r>
+      <w:r>
+        <w:t xml:space="preserve"> </w:t>
+      </w:r>
+      <w:r>
+        <w:rPr>
+          <w:rStyle w:val="VerbatimChar"/>
+        </w:rPr>
+        <w:t xml:space="preserve">modx.dev</w:t>
+      </w:r>
+      <w:r>
+        <w:t xml:space="preserve">.</w:t>
+      </w:r>
+    </w:p>
+    <w:p>
+      <w:pPr>
+        <w:numPr>
+          <w:ilvl w:val="0"/>
+          <w:numId w:val="1007"/>
+        </w:numPr>
+        <w:pStyle w:val="Compact"/>
+      </w:pPr>
+      <w:r>
+        <w:rPr>
+          <w:bCs/>
+          <w:b/>
+        </w:rPr>
+        <w:t xml:space="preserve">[KOS]</w:t>
+      </w:r>
+      <w:r>
+        <w:rPr>
+          <w:bCs/>
+          <w:b/>
+        </w:rPr>
+        <w:t xml:space="preserve"> </w:t>
+      </w:r>
+      <w:r>
+        <w:rPr>
+          <w:rStyle w:val="VerbatimChar"/>
+          <w:bCs/>
+          <w:b/>
+        </w:rPr>
+        <w:t xml:space="preserve">7ydxba3m.modx.dev</w:t>
+      </w:r>
+      <w:r>
+        <w:rPr>
+          <w:bCs/>
+          <w:b/>
+        </w:rPr>
+        <w:t xml:space="preserve"> </w:t>
+      </w:r>
+      <w:r>
+        <w:rPr>
+          <w:bCs/>
+          <w:b/>
+        </w:rPr>
+        <w:t xml:space="preserve">aperto ai motori</w:t>
+      </w:r>
+      <w:r>
+        <w:t xml:space="preserve">: copia di kosgroup.com con 2.089 utenti in GA4 da gennaio e URL annidati da crawler; risponde 200 senza password né</w:t>
+      </w:r>
+      <w:r>
+        <w:t xml:space="preserve"> </w:t>
+      </w:r>
+      <w:r>
+        <w:rPr>
+          <w:rStyle w:val="VerbatimChar"/>
+        </w:rPr>
+        <w:t xml:space="preserve">X-Robots-Tag: noindex</w:t>
+      </w:r>
+      <w:r>
+        <w:t xml:space="preserve"> </w:t>
+      </w:r>
+      <w:r>
+        <w:t xml:space="preserve">(24/10), con le stesse regole web della produzione. Subito, senza effetti per chi lo usa:</w:t>
+      </w:r>
+      <w:r>
+        <w:t xml:space="preserve"> </w:t>
+      </w:r>
+      <w:r>
+        <w:rPr>
+          <w:rStyle w:val="VerbatimChar"/>
+        </w:rPr>
+        <w:t xml:space="preserve">add_header X-Robots-Tag "noindex, nofollow" always;</w:t>
+      </w:r>
+      <w:r>
+        <w:t xml:space="preserve"> </w:t>
+      </w:r>
+      <w:r>
+        <w:t xml:space="preserve">nelle sue regole web; poi verificare chi lo usa e proteggerlo con password o spegnerlo. Controllare</w:t>
+      </w:r>
+      <w:r>
+        <w:t xml:space="preserve"> </w:t>
+      </w:r>
+      <w:r>
+        <w:rPr>
+          <w:rStyle w:val="VerbatimChar"/>
+        </w:rPr>
+        <w:t xml:space="preserve">site:7ydxba3m.modx.dev</w:t>
+      </w:r>
+      <w:r>
+        <w:t xml:space="preserve"> </w:t>
+      </w:r>
+      <w:r>
+        <w:t xml:space="preserve">su Google e il canonical delle sue pagine. Gli altri cloud di sviluppo con traffico:</w:t>
+      </w:r>
+      <w:r>
+        <w:t xml:space="preserve"> </w:t>
+      </w:r>
+      <w:r>
+        <w:rPr>
+          <w:rStyle w:val="VerbatimChar"/>
+        </w:rPr>
+        <w:t xml:space="preserve">c28rmnd0</w:t>
+      </w:r>
+      <w:r>
+        <w:t xml:space="preserve">,</w:t>
+      </w:r>
+      <w:r>
+        <w:t xml:space="preserve"> </w:t>
+      </w:r>
+      <w:r>
+        <w:rPr>
+          <w:rStyle w:val="VerbatimChar"/>
+        </w:rPr>
+        <w:t xml:space="preserve">2q20ekw7</w:t>
+      </w:r>
+      <w:r>
+        <w:t xml:space="preserve">,</w:t>
+      </w:r>
+      <w:r>
+        <w:t xml:space="preserve"> </w:t>
+      </w:r>
+      <w:r>
+        <w:rPr>
+          <w:rStyle w:val="VerbatimChar"/>
+        </w:rPr>
+        <w:t xml:space="preserve">h94ms727</w:t>
+      </w:r>
+      <w:r>
+        <w:t xml:space="preserve">,</w:t>
+      </w:r>
+      <w:r>
+        <w:t xml:space="preserve"> </w:t>
+      </w:r>
+      <w:r>
+        <w:rPr>
+          <w:rStyle w:val="VerbatimChar"/>
+        </w:rPr>
+        <w:t xml:space="preserve">lussyiah</w:t>
+      </w:r>
+      <w:r>
+        <w:t xml:space="preserve">,</w:t>
+      </w:r>
+      <w:r>
+        <w:t xml:space="preserve"> </w:t>
+      </w:r>
+      <w:r>
+        <w:rPr>
+          <w:rStyle w:val="VerbatimChar"/>
+        </w:rPr>
+        <w:t xml:space="preserve">nnzdgwzr</w:t>
+      </w:r>
+      <w:r>
+        <w:t xml:space="preserve">,</w:t>
+      </w:r>
+      <w:r>
+        <w:t xml:space="preserve"> </w:t>
+      </w:r>
+      <w:r>
+        <w:rPr>
+          <w:rStyle w:val="VerbatimChar"/>
+        </w:rPr>
+        <w:t xml:space="preserve">b0k2gmat</w:t>
+      </w:r>
+      <w:r>
+        <w:t xml:space="preserve">.</w:t>
       </w:r>
     </w:p>
     <w:p>

</xml_diff>

<commit_message>
KOS regole web: 301 dall'indirizzo tecnico 7ydxba3m.modx.dev a kosgroup.com (attivo in produzione dal 24/10)
Co-Authored-By: Claude Opus 5.5 <noreply@anthropic.com>
Claude-Session: https://claude.ai/code/session_01Rr1X44gsg7BUwMzrRvYrc2
</commit_message>
<xml_diff>
--- a/docs/docx/piano-sprint-1.docx
+++ b/docs/docx/piano-sprint-1.docx
@@ -3780,58 +3780,68 @@
           <w:bCs/>
           <w:b/>
         </w:rPr>
-        <w:t xml:space="preserve">aperto ai motori</w:t>
-      </w:r>
-      <w:r>
-        <w:t xml:space="preserve">: copia di kosgroup.com con 2.089 utenti in GA4 da gennaio e URL annidati da crawler; risponde 200 senza password né</w:t>
-      </w:r>
-      <w:r>
-        <w:t xml:space="preserve"> </w:t>
-      </w:r>
-      <w:r>
-        <w:rPr>
-          <w:rStyle w:val="VerbatimChar"/>
-        </w:rPr>
-        <w:t xml:space="preserve">X-Robots-Tag: noindex</w:t>
-      </w:r>
-      <w:r>
-        <w:t xml:space="preserve"> </w:t>
-      </w:r>
-      <w:r>
-        <w:t xml:space="preserve">(24/10), con le stesse regole web della produzione. Subito, senza effetti per chi lo usa:</w:t>
-      </w:r>
-      <w:r>
-        <w:t xml:space="preserve"> </w:t>
-      </w:r>
-      <w:r>
-        <w:rPr>
-          <w:rStyle w:val="VerbatimChar"/>
-        </w:rPr>
-        <w:t xml:space="preserve">add_header X-Robots-Tag "noindex, nofollow" always;</w:t>
-      </w:r>
-      <w:r>
-        <w:t xml:space="preserve"> </w:t>
-      </w:r>
-      <w:r>
-        <w:t xml:space="preserve">nelle sue regole web; poi verificare chi lo usa e proteggerlo con password o spegnerlo. Controllare</w:t>
-      </w:r>
-      <w:r>
-        <w:t xml:space="preserve"> </w:t>
-      </w:r>
-      <w:r>
-        <w:rPr>
-          <w:rStyle w:val="VerbatimChar"/>
-        </w:rPr>
-        <w:t xml:space="preserve">site:7ydxba3m.modx.dev</w:t>
-      </w:r>
-      <w:r>
-        <w:t xml:space="preserve"> </w:t>
-      </w:r>
-      <w:r>
-        <w:t xml:space="preserve">su Google e il canonical delle sue pagine. Gli altri cloud di sviluppo con traffico:</w:t>
-      </w:r>
-      <w:r>
-        <w:t xml:space="preserve"> </w:t>
+        <w:t xml:space="preserve">= indirizzo tecnico MODX Cloud della produzione kosgroup.com</w:t>
+      </w:r>
+      <w:r>
+        <w:t xml:space="preserve">, raggiungibile e visitato dai crawler (2.089 utenti in GA4 da gennaio):</w:t>
+      </w:r>
+      <w:r>
+        <w:t xml:space="preserve"> </w:t>
+      </w:r>
+      <w:r>
+        <w:rPr>
+          <w:bCs/>
+          <w:b/>
+        </w:rPr>
+        <w:t xml:space="preserve">risolto il 24/10</w:t>
+      </w:r>
+      <w:r>
+        <w:t xml:space="preserve"> </w:t>
+      </w:r>
+      <w:r>
+        <w:t xml:space="preserve">con un 301 verso</w:t>
+      </w:r>
+      <w:r>
+        <w:t xml:space="preserve"> </w:t>
+      </w:r>
+      <w:r>
+        <w:rPr>
+          <w:rStyle w:val="VerbatimChar"/>
+        </w:rPr>
+        <w:t xml:space="preserve">https://kosgroup.com$request_uri</w:t>
+      </w:r>
+      <w:r>
+        <w:t xml:space="preserve"> </w:t>
+      </w:r>
+      <w:r>
+        <w:t xml:space="preserve">all'inizio delle regole web di produzione (in</w:t>
+      </w:r>
+      <w:r>
+        <w:t xml:space="preserve"> </w:t>
+      </w:r>
+      <w:r>
+        <w:rPr>
+          <w:rStyle w:val="VerbatimChar"/>
+        </w:rPr>
+        <w:t xml:space="preserve">kosgroup/files/web-rules/web-rules.conf</w:t>
+      </w:r>
+      <w:r>
+        <w:t xml:space="preserve">). Da fare: stesso controllo sull'indirizzo</w:t>
+      </w:r>
+      <w:r>
+        <w:t xml:space="preserve"> </w:t>
+      </w:r>
+      <w:r>
+        <w:rPr>
+          <w:rStyle w:val="VerbatimChar"/>
+        </w:rPr>
+        <w:t xml:space="preserve">*.modx.dev</w:t>
+      </w:r>
+      <w:r>
+        <w:t xml:space="preserve"> </w:t>
+      </w:r>
+      <w:r>
+        <w:t xml:space="preserve">del cloud di produzione AA (c0072); verificare chi usa gli altri cloud di sviluppo con traffico in GA4 (</w:t>
       </w:r>
       <w:r>
         <w:rPr>
@@ -3888,19 +3898,7 @@
         <w:t xml:space="preserve">nnzdgwzr</w:t>
       </w:r>
       <w:r>
-        <w:t xml:space="preserve">,</w:t>
-      </w:r>
-      <w:r>
-        <w:t xml:space="preserve"> </w:t>
-      </w:r>
-      <w:r>
-        <w:rPr>
-          <w:rStyle w:val="VerbatimChar"/>
-        </w:rPr>
-        <w:t xml:space="preserve">b0k2gmat</w:t>
-      </w:r>
-      <w:r>
-        <w:t xml:space="preserve">.</w:t>
+        <w:t xml:space="preserve">) e proteggerli con password o spegnerli.</w:t>
       </w:r>
     </w:p>
     <w:p>

</xml_diff>

<commit_message>
Piano: indirizzo tecnico AA già reindirizzato
Co-Authored-By: Claude Opus 5.5 <noreply@anthropic.com>
Claude-Session: https://claude.ai/code/session_01Rr1X44gsg7BUwMzrRvYrc2
</commit_message>
<xml_diff>
--- a/docs/docx/piano-sprint-1.docx
+++ b/docs/docx/piano-sprint-1.docx
@@ -3826,22 +3826,31 @@
         <w:t xml:space="preserve">kosgroup/files/web-rules/web-rules.conf</w:t>
       </w:r>
       <w:r>
-        <w:t xml:space="preserve">). Da fare: stesso controllo sull'indirizzo</w:t>
-      </w:r>
-      <w:r>
-        <w:t xml:space="preserve"> </w:t>
-      </w:r>
-      <w:r>
-        <w:rPr>
-          <w:rStyle w:val="VerbatimChar"/>
-        </w:rPr>
-        <w:t xml:space="preserve">*.modx.dev</w:t>
-      </w:r>
-      <w:r>
-        <w:t xml:space="preserve"> </w:t>
-      </w:r>
-      <w:r>
-        <w:t xml:space="preserve">del cloud di produzione AA (c0072); verificare chi usa gli altri cloud di sviluppo con traffico in GA4 (</w:t>
+        <w:t xml:space="preserve">). Indirizzo tecnico AA (</w:t>
+      </w:r>
+      <w:r>
+        <w:rPr>
+          <w:rStyle w:val="VerbatimChar"/>
+        </w:rPr>
+        <w:t xml:space="preserve">z6naauhv.modx.dev</w:t>
+      </w:r>
+      <w:r>
+        <w:t xml:space="preserve">): già reindirizzato a</w:t>
+      </w:r>
+      <w:r>
+        <w:t xml:space="preserve"> </w:t>
+      </w:r>
+      <w:r>
+        <w:rPr>
+          <w:rStyle w:val="VerbatimChar"/>
+        </w:rPr>
+        <w:t xml:space="preserve">anniazzurri.it</w:t>
+      </w:r>
+      <w:r>
+        <w:t xml:space="preserve"> </w:t>
+      </w:r>
+      <w:r>
+        <w:t xml:space="preserve">dalla regola generica sugli host (verificato il 24/10). Da fare: verificare chi usa gli altri cloud di sviluppo con traffico in GA4 (</w:t>
       </w:r>
       <w:r>
         <w:rPr>

</xml_diff>

<commit_message>
Piano: stato delle fonti di dati in BigQuery
Co-Authored-By: Claude Opus 5.5 <noreply@anthropic.com>
Claude-Session: https://claude.ai/code/session_01Rr1X44gsg7BUwMzrRvYrc2
</commit_message>
<xml_diff>
--- a/docs/docx/piano-sprint-1.docx
+++ b/docs/docx/piano-sprint-1.docx
@@ -2,7 +2,7 @@
 <file path=word/document.xml><?xml version="1.0" encoding="utf-8"?>
 <w:document xmlns:w="http://schemas.openxmlformats.org/wordprocessingml/2006/main" xmlns:m="http://schemas.openxmlformats.org/officeDocument/2006/math" xmlns:r="http://schemas.openxmlformats.org/officeDocument/2006/relationships" xmlns:o="urn:schemas-microsoft-com:office:office" xmlns:v="urn:schemas-microsoft-com:vml" xmlns:w10="urn:schemas-microsoft-com:office:word" xmlns:a="http://schemas.openxmlformats.org/drawingml/2006/main" xmlns:pic="http://schemas.openxmlformats.org/drawingml/2006/picture" xmlns:wp="http://schemas.openxmlformats.org/drawingml/2006/wordprocessingDrawing">
   <w:body>
-    <w:bookmarkStart w:id="28" w:name="Xff2d8b895f42074f3d940c259894f313a91b2c2"/>
+    <w:bookmarkStart w:id="29" w:name="Xff2d8b895f42074f3d940c259894f313a91b2c2"/>
     <w:p>
       <w:pPr>
         <w:pStyle w:val="Heading1"/>
@@ -3450,7 +3450,317 @@
       </w:r>
     </w:p>
     <w:bookmarkEnd w:id="24"/>
-    <w:bookmarkStart w:id="25" w:name="Xccbd241b55281545db5ae3150331824f0f75f18"/>
+    <w:bookmarkStart w:id="25" w:name="X2f7b8a8cb6c76346057b6b4373b191c4b022592"/>
+    <w:p>
+      <w:pPr>
+        <w:pStyle w:val="Heading2"/>
+      </w:pPr>
+      <w:r>
+        <w:t xml:space="preserve">Dati in BigQuery (</w:t>
+      </w:r>
+      <w:r>
+        <w:rPr>
+          <w:rStyle w:val="VerbatimChar"/>
+        </w:rPr>
+        <w:t xml:space="preserve">kos-analytics-482819</w:t>
+      </w:r>
+      <w:r>
+        <w:t xml:space="preserve">, località</w:t>
+      </w:r>
+      <w:r>
+        <w:t xml:space="preserve"> </w:t>
+      </w:r>
+      <w:r>
+        <w:rPr>
+          <w:rStyle w:val="VerbatimChar"/>
+        </w:rPr>
+        <w:t xml:space="preserve">europe-west3</w:t>
+      </w:r>
+      <w:r>
+        <w:t xml:space="preserve">) — stato al 24 ottobre</w:t>
+      </w:r>
+    </w:p>
+    <w:tbl>
+      <w:tblPr>
+        <w:tblStyle w:val="Table"/>
+        <w:tblW w:type="auto" w:w="0"/>
+        <w:tblLook w:firstRow="1" w:lastRow="0" w:firstColumn="0" w:lastColumn="0" w:noHBand="0" w:noVBand="0" w:val="0020"/>
+        <w:jc w:val="start"/>
+      </w:tblPr>
+      <w:tblGrid>
+        <w:gridCol w:w="3960"/>
+        <w:gridCol w:w="3960"/>
+      </w:tblGrid>
+      <w:tr>
+        <w:trPr>
+          <w:tblHeader w:val="true"/>
+        </w:trPr>
+        <w:tc>
+          <w:tcPr/>
+          <w:p>
+            <w:pPr>
+              <w:pStyle w:val="Compact"/>
+              <w:jc w:val="left"/>
+            </w:pPr>
+            <w:r>
+              <w:t xml:space="preserve">Fonte</w:t>
+            </w:r>
+          </w:p>
+        </w:tc>
+        <w:tc>
+          <w:tcPr/>
+          <w:p>
+            <w:pPr>
+              <w:pStyle w:val="Compact"/>
+              <w:jc w:val="left"/>
+            </w:pPr>
+            <w:r>
+              <w:t xml:space="preserve">Stato</w:t>
+            </w:r>
+          </w:p>
+        </w:tc>
+      </w:tr>
+      <w:tr>
+        <w:tc>
+          <w:tcPr/>
+          <w:p>
+            <w:pPr>
+              <w:pStyle w:val="Compact"/>
+              <w:jc w:val="left"/>
+            </w:pPr>
+            <w:r>
+              <w:t xml:space="preserve">GA4 kosgroup.com</w:t>
+            </w:r>
+          </w:p>
+        </w:tc>
+        <w:tc>
+          <w:tcPr/>
+          <w:p>
+            <w:pPr>
+              <w:pStyle w:val="Compact"/>
+              <w:jc w:val="left"/>
+            </w:pPr>
+            <w:r>
+              <w:t xml:space="preserve">attivo dal 30/12/2025 (</w:t>
+            </w:r>
+            <w:r>
+              <w:rPr>
+                <w:rStyle w:val="VerbatimChar"/>
+              </w:rPr>
+              <w:t xml:space="preserve">analytics_333083624</w:t>
+            </w:r>
+            <w:r>
+              <w:t xml:space="preserve">), giornaliero; contiene anche traffico degli ambienti</w:t>
+            </w:r>
+            <w:r>
+              <w:t xml:space="preserve"> </w:t>
+            </w:r>
+            <w:r>
+              <w:rPr>
+                <w:rStyle w:val="VerbatimChar"/>
+              </w:rPr>
+              <w:t xml:space="preserve">*.modx.dev</w:t>
+            </w:r>
+            <w:r>
+              <w:t xml:space="preserve"> </w:t>
+            </w:r>
+            <w:r>
+              <w:t xml:space="preserve">(da escludere)</w:t>
+            </w:r>
+          </w:p>
+        </w:tc>
+      </w:tr>
+      <w:tr>
+        <w:tc>
+          <w:tcPr/>
+          <w:p>
+            <w:pPr>
+              <w:pStyle w:val="Compact"/>
+              <w:jc w:val="left"/>
+            </w:pPr>
+            <w:r>
+              <w:t xml:space="preserve">GA4 anniazzurri.it</w:t>
+            </w:r>
+          </w:p>
+        </w:tc>
+        <w:tc>
+          <w:tcPr/>
+          <w:p>
+            <w:pPr>
+              <w:pStyle w:val="Compact"/>
+              <w:jc w:val="left"/>
+            </w:pPr>
+            <w:r>
+              <w:t xml:space="preserve">collegamento creato il 24/10 (giornaliero); dati dal giorno successivo</w:t>
+            </w:r>
+          </w:p>
+        </w:tc>
+      </w:tr>
+      <w:tr>
+        <w:tc>
+          <w:tcPr/>
+          <w:p>
+            <w:pPr>
+              <w:pStyle w:val="Compact"/>
+              <w:jc w:val="left"/>
+            </w:pPr>
+            <w:r>
+              <w:t xml:space="preserve">Google Ads</w:t>
+            </w:r>
+          </w:p>
+        </w:tc>
+        <w:tc>
+          <w:tcPr/>
+          <w:p>
+            <w:pPr>
+              <w:pStyle w:val="Compact"/>
+              <w:jc w:val="left"/>
+            </w:pPr>
+            <w:r>
+              <w:t xml:space="preserve">attivo (</w:t>
+            </w:r>
+            <w:r>
+              <w:rPr>
+                <w:rStyle w:val="VerbatimChar"/>
+              </w:rPr>
+              <w:t xml:space="preserve">google_ads_kos</w:t>
+            </w:r>
+            <w:r>
+              <w:t xml:space="preserve">, account 8545219698)</w:t>
+            </w:r>
+          </w:p>
+        </w:tc>
+      </w:tr>
+      <w:tr>
+        <w:tc>
+          <w:tcPr/>
+          <w:p>
+            <w:pPr>
+              <w:pStyle w:val="Compact"/>
+              <w:jc w:val="left"/>
+            </w:pPr>
+            <w:r>
+              <w:t xml:space="preserve">Search Console dei due siti</w:t>
+            </w:r>
+          </w:p>
+        </w:tc>
+        <w:tc>
+          <w:tcPr/>
+          <w:p>
+            <w:pPr>
+              <w:pStyle w:val="Compact"/>
+              <w:jc w:val="left"/>
+            </w:pPr>
+            <w:r>
+              <w:t xml:space="preserve">esportazione collettiva già attiva da marzo 2025 verso il progetto dell'agenzia (</w:t>
+            </w:r>
+            <w:r>
+              <w:rPr>
+                <w:rStyle w:val="VerbatimChar"/>
+              </w:rPr>
+              <w:t xml:space="preserve">import-gsc</w:t>
+            </w:r>
+            <w:r>
+              <w:t xml:space="preserve">,</w:t>
+            </w:r>
+            <w:r>
+              <w:t xml:space="preserve"> </w:t>
+            </w:r>
+            <w:r>
+              <w:rPr>
+                <w:rStyle w:val="VerbatimChar"/>
+              </w:rPr>
+              <w:t xml:space="preserve">europe-west6</w:t>
+            </w:r>
+            <w:r>
+              <w:t xml:space="preserve">, una sola esportazione per proprietà): chiesto l'accesso in lettura ai due dataset per una copia giornaliera pianificata in</w:t>
+            </w:r>
+            <w:r>
+              <w:t xml:space="preserve"> </w:t>
+            </w:r>
+            <w:r>
+              <w:rPr>
+                <w:rStyle w:val="VerbatimChar"/>
+              </w:rPr>
+              <w:t xml:space="preserve">europe-west3</w:t>
+            </w:r>
+            <w:r>
+              <w:t xml:space="preserve"> </w:t>
+            </w:r>
+            <w:r>
+              <w:t xml:space="preserve">(</w:t>
+            </w:r>
+            <w:r>
+              <w:rPr>
+                <w:rStyle w:val="VerbatimChar"/>
+              </w:rPr>
+              <w:t xml:space="preserve">searchconsole_aa</w:t>
+            </w:r>
+            <w:r>
+              <w:t xml:space="preserve">,</w:t>
+            </w:r>
+            <w:r>
+              <w:t xml:space="preserve"> </w:t>
+            </w:r>
+            <w:r>
+              <w:rPr>
+                <w:rStyle w:val="VerbatimChar"/>
+              </w:rPr>
+              <w:t xml:space="preserve">searchconsole_kos</w:t>
+            </w:r>
+            <w:r>
+              <w:t xml:space="preserve">). Lo storico via API (</w:t>
+            </w:r>
+            <w:r>
+              <w:rPr>
+                <w:rStyle w:val="VerbatimChar"/>
+              </w:rPr>
+              <w:t xml:space="preserve">scripts/gsc/storico-search-console.py</w:t>
+            </w:r>
+            <w:r>
+              <w:t xml:space="preserve">) non serve, resta come ripiego</w:t>
+            </w:r>
+          </w:p>
+        </w:tc>
+      </w:tr>
+      <w:tr>
+        <w:tc>
+          <w:tcPr/>
+          <w:p>
+            <w:pPr>
+              <w:pStyle w:val="Compact"/>
+              <w:jc w:val="left"/>
+            </w:pPr>
+            <w:r>
+              <w:t xml:space="preserve">Tabelle di corrispondenza</w:t>
+            </w:r>
+          </w:p>
+        </w:tc>
+        <w:tc>
+          <w:tcPr/>
+          <w:p>
+            <w:pPr>
+              <w:pStyle w:val="Compact"/>
+              <w:jc w:val="left"/>
+            </w:pPr>
+            <w:r>
+              <w:rPr>
+                <w:rStyle w:val="VerbatimChar"/>
+              </w:rPr>
+              <w:t xml:space="preserve">kos_lookup</w:t>
+            </w:r>
+            <w:r>
+              <w:t xml:space="preserve"> </w:t>
+            </w:r>
+            <w:r>
+              <w:t xml:space="preserve">(campagne, aree, URL)</w:t>
+            </w:r>
+          </w:p>
+        </w:tc>
+      </w:tr>
+    </w:tbl>
+    <w:bookmarkEnd w:id="25"/>
+    <w:bookmarkStart w:id="26" w:name="Xccbd241b55281545db5ae3150331824f0f75f18"/>
     <w:p>
       <w:pPr>
         <w:pStyle w:val="Heading2"/>
@@ -3947,8 +4257,8 @@
         <w:t xml:space="preserve">(solo in produzione): coprono il titolo «Cos'è AzzurraMente»; da segnalare a chi gestisce i widget.</w:t>
       </w:r>
     </w:p>
-    <w:bookmarkEnd w:id="25"/>
-    <w:bookmarkStart w:id="26" w:name="X898b42ef2c7e59f20211f0633f37c3831eecc50"/>
+    <w:bookmarkEnd w:id="26"/>
+    <w:bookmarkStart w:id="27" w:name="X898b42ef2c7e59f20211f0633f37c3831eecc50"/>
     <w:p>
       <w:pPr>
         <w:pStyle w:val="Heading2"/>
@@ -4268,8 +4578,8 @@
         <w:t xml:space="preserve">Fuori perimetro, da proporre (non nei documenti condivisi): baseline di misura entro fine novembre (Search Console, Bing AI Performance, canale AI in GA4, set di prompt ripetuti), IndexNow alla pubblicazione, domanda «come ci ha conosciuto?» nei moduli, profili Google dopo RetailTune (vedi analisi del documento PWC Local del 22/10: niente parole chiave nei nomi; test di categoria su un campione; programma recensioni).</w:t>
       </w:r>
     </w:p>
-    <w:bookmarkEnd w:id="26"/>
-    <w:bookmarkStart w:id="27" w:name="X6106934d94086303083d981b094913fadf78d77"/>
+    <w:bookmarkEnd w:id="27"/>
+    <w:bookmarkStart w:id="28" w:name="X6106934d94086303083d981b094913fadf78d77"/>
     <w:p>
       <w:pPr>
         <w:pStyle w:val="Heading2"/>
@@ -4439,8 +4749,8 @@
         <w:t xml:space="preserve">, redirect cartelle documenti (KOS); immagini e PDF mancanti (AA).</w:t>
       </w:r>
     </w:p>
-    <w:bookmarkEnd w:id="27"/>
     <w:bookmarkEnd w:id="28"/>
+    <w:bookmarkEnd w:id="29"/>
     <w:sectPr/>
   </w:body>
 </w:document>

</xml_diff>

<commit_message>
Piano: GA4 AA in BigQuery solo eventi, dati utente KOS disattivati
Co-Authored-By: Claude Opus 5.5 <noreply@anthropic.com>
Claude-Session: https://claude.ai/code/session_01Rr1X44gsg7BUwMzrRvYrc2
</commit_message>
<xml_diff>
--- a/docs/docx/piano-sprint-1.docx
+++ b/docs/docx/piano-sprint-1.docx
@@ -3565,7 +3565,22 @@
               <w:t xml:space="preserve"> </w:t>
             </w:r>
             <w:r>
-              <w:t xml:space="preserve">(da escludere)</w:t>
+              <w:t xml:space="preserve">(da escludere). Esportazione dei dati utente disattivata il 24/10 (non usata da nessuna vista; minimizzazione): le tabelle</w:t>
+            </w:r>
+            <w:r>
+              <w:t xml:space="preserve"> </w:t>
+            </w:r>
+            <w:r>
+              <w:rPr>
+                <w:rStyle w:val="VerbatimChar"/>
+              </w:rPr>
+              <w:t xml:space="preserve">pseudonymous_users_*</w:t>
+            </w:r>
+            <w:r>
+              <w:t xml:space="preserve"> </w:t>
+            </w:r>
+            <w:r>
+              <w:t xml:space="preserve">30/12/2025-23/10/2026 restano, da decidere se cancellarle</w:t>
             </w:r>
           </w:p>
         </w:tc>
@@ -3591,7 +3606,7 @@
               <w:jc w:val="left"/>
             </w:pPr>
             <w:r>
-              <w:t xml:space="preserve">collegamento creato il 24/10 (giornaliero); dati dal giorno successivo</w:t>
+              <w:t xml:space="preserve">collegamento creato il 24/10: solo eventi, giornaliero, senza dati utente; dati dal giorno successivo</w:t>
             </w:r>
           </w:p>
         </w:tc>

</xml_diff>

<commit_message>
KOS-2 voce 24: analisi degli head KOS e proposta di consolidamento; finestre di rilascio dello sprint 2
Co-Authored-By: Claude Opus 5.5 <noreply@anthropic.com>
Claude-Session: https://claude.ai/code/session_01Rr1X44gsg7BUwMzrRvYrc2
</commit_message>
<xml_diff>
--- a/docs/docx/piano-sprint-1.docx
+++ b/docs/docx/piano-sprint-1.docx
@@ -2,7 +2,7 @@
 <file path=word/document.xml><?xml version="1.0" encoding="utf-8"?>
 <w:document xmlns:w="http://schemas.openxmlformats.org/wordprocessingml/2006/main" xmlns:m="http://schemas.openxmlformats.org/officeDocument/2006/math" xmlns:r="http://schemas.openxmlformats.org/officeDocument/2006/relationships" xmlns:o="urn:schemas-microsoft-com:office:office" xmlns:v="urn:schemas-microsoft-com:vml" xmlns:w10="urn:schemas-microsoft-com:office:word" xmlns:a="http://schemas.openxmlformats.org/drawingml/2006/main" xmlns:pic="http://schemas.openxmlformats.org/drawingml/2006/picture" xmlns:wp="http://schemas.openxmlformats.org/drawingml/2006/wordprocessingDrawing">
   <w:body>
-    <w:bookmarkStart w:id="29" w:name="Xff2d8b895f42074f3d940c259894f313a91b2c2"/>
+    <w:bookmarkStart w:id="30" w:name="Xff2d8b895f42074f3d940c259894f313a91b2c2"/>
     <w:p>
       <w:pPr>
         <w:pStyle w:val="Heading1"/>
@@ -3775,7 +3775,125 @@
       </w:tr>
     </w:tbl>
     <w:bookmarkEnd w:id="25"/>
-    <w:bookmarkStart w:id="26" w:name="Xccbd241b55281545db5ae3150331824f0f75f18"/>
+    <w:bookmarkStart w:id="26" w:name="rilascio-dello-sprint-2-deciso-il-2410"/>
+    <w:p>
+      <w:pPr>
+        <w:pStyle w:val="Heading2"/>
+      </w:pPr>
+      <w:r>
+        <w:t xml:space="preserve">Rilascio dello sprint 2 (deciso il 24/10)</w:t>
+      </w:r>
+    </w:p>
+    <w:p>
+      <w:pPr>
+        <w:pStyle w:val="FirstParagraph"/>
+      </w:pPr>
+      <w:r>
+        <w:t xml:space="preserve">Danilo vuole chiudere le lavorazioni presto per dedicarsi a RetailTune e alla dismissione di Yext. Finestre possibili:</w:t>
+      </w:r>
+      <w:r>
+        <w:t xml:space="preserve"> </w:t>
+      </w:r>
+      <w:r>
+        <w:t xml:space="preserve">prima della consegna dello sprint 1 (entro il 29/10, così Cerved/ProWeb verificano lo stato finale) oppure dopo la</w:t>
+      </w:r>
+      <w:r>
+        <w:t xml:space="preserve"> </w:t>
+      </w:r>
+      <w:r>
+        <w:t xml:space="preserve">verifica dello sprint 1 (9-11/11).</w:t>
+      </w:r>
+      <w:r>
+        <w:t xml:space="preserve"> </w:t>
+      </w:r>
+      <w:r>
+        <w:rPr>
+          <w:bCs/>
+          <w:b/>
+        </w:rPr>
+        <w:t xml:space="preserve">Da evitare 30/10-6/11</w:t>
+      </w:r>
+      <w:r>
+        <w:t xml:space="preserve"> </w:t>
+      </w:r>
+      <w:r>
+        <w:t xml:space="preserve">(verifica dello sprint 1): i pacchetti dello sprint 2</w:t>
+      </w:r>
+      <w:r>
+        <w:t xml:space="preserve"> </w:t>
+      </w:r>
+      <w:r>
+        <w:t xml:space="preserve">toccano elementi consegnati con lo sprint 1 (footer,</w:t>
+      </w:r>
+      <w:r>
+        <w:t xml:space="preserve"> </w:t>
+      </w:r>
+      <w:r>
+        <w:rPr>
+          <w:rStyle w:val="VerbatimChar"/>
+        </w:rPr>
+        <w:t xml:space="preserve">head-sportello-sociale</w:t>
+      </w:r>
+      <w:r>
+        <w:t xml:space="preserve">,</w:t>
+      </w:r>
+      <w:r>
+        <w:t xml:space="preserve"> </w:t>
+      </w:r>
+      <w:r>
+        <w:rPr>
+          <w:rStyle w:val="VerbatimChar"/>
+        </w:rPr>
+        <w:t xml:space="preserve">convegnoAA</w:t>
+      </w:r>
+      <w:r>
+        <w:t xml:space="preserve">,</w:t>
+      </w:r>
+      <w:r>
+        <w:t xml:space="preserve"> </w:t>
+      </w:r>
+      <w:r>
+        <w:rPr>
+          <w:rStyle w:val="VerbatimChar"/>
+        </w:rPr>
+        <w:t xml:space="preserve">heading-home2</w:t>
+      </w:r>
+      <w:r>
+        <w:t xml:space="preserve">). Prima del</w:t>
+      </w:r>
+      <w:r>
+        <w:t xml:space="preserve"> </w:t>
+      </w:r>
+      <w:r>
+        <w:t xml:space="preserve">rilascio: esportazione fresca dei contenuti e rigenerazione dei pacchetti; dopo: collaudo visivo e validatori sulle</w:t>
+      </w:r>
+      <w:r>
+        <w:t xml:space="preserve"> </w:t>
+      </w:r>
+      <w:r>
+        <w:t xml:space="preserve">voci dello sprint 1. Il dato CrUX di novembre rifletterà il rilascio in proporzione ai giorni (evidenza piena a dicembre).</w:t>
+      </w:r>
+      <w:r>
+        <w:t xml:space="preserve"> </w:t>
+      </w:r>
+      <w:r>
+        <w:t xml:space="preserve">Analisi del consolidamento degli head KOS:</w:t>
+      </w:r>
+      <w:r>
+        <w:t xml:space="preserve"> </w:t>
+      </w:r>
+      <w:r>
+        <w:rPr>
+          <w:rStyle w:val="VerbatimChar"/>
+        </w:rPr>
+        <w:t xml:space="preserve">docs/kos-head-consolidamento.md</w:t>
+      </w:r>
+      <w:r>
+        <w:t xml:space="preserve">.</w:t>
+      </w:r>
+    </w:p>
+    <w:bookmarkEnd w:id="26"/>
+    <w:bookmarkStart w:id="27" w:name="Xccbd241b55281545db5ae3150331824f0f75f18"/>
     <w:p>
       <w:pPr>
         <w:pStyle w:val="Heading2"/>
@@ -4272,8 +4390,8 @@
         <w:t xml:space="preserve">(solo in produzione): coprono il titolo «Cos'è AzzurraMente»; da segnalare a chi gestisce i widget.</w:t>
       </w:r>
     </w:p>
-    <w:bookmarkEnd w:id="26"/>
-    <w:bookmarkStart w:id="27" w:name="X898b42ef2c7e59f20211f0633f37c3831eecc50"/>
+    <w:bookmarkEnd w:id="27"/>
+    <w:bookmarkStart w:id="28" w:name="X898b42ef2c7e59f20211f0633f37c3831eecc50"/>
     <w:p>
       <w:pPr>
         <w:pStyle w:val="Heading2"/>
@@ -4593,8 +4711,8 @@
         <w:t xml:space="preserve">Fuori perimetro, da proporre (non nei documenti condivisi): baseline di misura entro fine novembre (Search Console, Bing AI Performance, canale AI in GA4, set di prompt ripetuti), IndexNow alla pubblicazione, domanda «come ci ha conosciuto?» nei moduli, profili Google dopo RetailTune (vedi analisi del documento PWC Local del 22/10: niente parole chiave nei nomi; test di categoria su un campione; programma recensioni).</w:t>
       </w:r>
     </w:p>
-    <w:bookmarkEnd w:id="27"/>
-    <w:bookmarkStart w:id="28" w:name="X6106934d94086303083d981b094913fadf78d77"/>
+    <w:bookmarkEnd w:id="28"/>
+    <w:bookmarkStart w:id="29" w:name="X6106934d94086303083d981b094913fadf78d77"/>
     <w:p>
       <w:pPr>
         <w:pStyle w:val="Heading2"/>
@@ -4764,8 +4882,8 @@
         <w:t xml:space="preserve">, redirect cartelle documenti (KOS); immagini e PDF mancanti (AA).</w:t>
       </w:r>
     </w:p>
-    <w:bookmarkEnd w:id="28"/>
     <w:bookmarkEnd w:id="29"/>
+    <w:bookmarkEnd w:id="30"/>
     <w:sectPr/>
   </w:body>
 </w:document>

</xml_diff>

<commit_message>
Piano: verifica dello sprint 1 spostata al 9-14/11, rilascio dello sprint 2 entro il 6/11; conteggio delle risorse per template (sola lettura)
Co-Authored-By: Claude Opus 5.5 <noreply@anthropic.com>
Claude-Session: https://claude.ai/code/session_01Rr1X44gsg7BUwMzrRvYrc2
</commit_message>
<xml_diff>
--- a/docs/docx/piano-sprint-1.docx
+++ b/docs/docx/piano-sprint-1.docx
@@ -3789,41 +3789,62 @@
         <w:pStyle w:val="FirstParagraph"/>
       </w:pPr>
       <w:r>
-        <w:t xml:space="preserve">Danilo vuole chiudere le lavorazioni presto per dedicarsi a RetailTune e alla dismissione di Yext. Finestre possibili:</w:t>
-      </w:r>
-      <w:r>
-        <w:t xml:space="preserve"> </w:t>
-      </w:r>
-      <w:r>
-        <w:t xml:space="preserve">prima della consegna dello sprint 1 (entro il 29/10, così Cerved/ProWeb verificano lo stato finale) oppure dopo la</w:t>
-      </w:r>
-      <w:r>
-        <w:t xml:space="preserve"> </w:t>
-      </w:r>
-      <w:r>
-        <w:t xml:space="preserve">verifica dello sprint 1 (9-11/11).</w:t>
-      </w:r>
-      <w:r>
-        <w:t xml:space="preserve"> </w:t>
-      </w:r>
-      <w:r>
-        <w:rPr>
-          <w:bCs/>
-          <w:b/>
-        </w:rPr>
-        <w:t xml:space="preserve">Da evitare 30/10-6/11</w:t>
-      </w:r>
-      <w:r>
-        <w:t xml:space="preserve"> </w:t>
-      </w:r>
-      <w:r>
-        <w:t xml:space="preserve">(verifica dello sprint 1): i pacchetti dello sprint 2</w:t>
-      </w:r>
-      <w:r>
-        <w:t xml:space="preserve"> </w:t>
-      </w:r>
-      <w:r>
-        <w:t xml:space="preserve">toccano elementi consegnati con lo sprint 1 (footer,</w:t>
+        <w:t xml:space="preserve">Danilo vuole chiudere le lavorazioni presto per dedicarsi a RetailTune e alla dismissione di Yext.</w:t>
+      </w:r>
+      <w:r>
+        <w:t xml:space="preserve"> </w:t>
+      </w:r>
+      <w:r>
+        <w:rPr>
+          <w:bCs/>
+          <w:b/>
+        </w:rPr>
+        <w:t xml:space="preserve">Aggiornamento</w:t>
+      </w:r>
+      <w:r>
+        <w:rPr>
+          <w:bCs/>
+          <w:b/>
+        </w:rPr>
+        <w:t xml:space="preserve"> </w:t>
+      </w:r>
+      <w:r>
+        <w:rPr>
+          <w:bCs/>
+          <w:b/>
+        </w:rPr>
+        <w:t xml:space="preserve">24/10: l'agenzia sposta la prima verifica (sprint 1) alla settimana 9-14 novembre.</w:t>
+      </w:r>
+      <w:r>
+        <w:t xml:space="preserve"> </w:t>
+      </w:r>
+      <w:r>
+        <w:t xml:space="preserve">Finestra di rilascio dello sprint 2:</w:t>
+      </w:r>
+      <w:r>
+        <w:t xml:space="preserve"> </w:t>
+      </w:r>
+      <w:r>
+        <w:t xml:space="preserve">dal 26/10 al 6/11, cioè prima che inizi la verifica, così Cerved/ProWeb controllano lo stato finale.</w:t>
+      </w:r>
+      <w:r>
+        <w:t xml:space="preserve"> </w:t>
+      </w:r>
+      <w:r>
+        <w:rPr>
+          <w:bCs/>
+          <w:b/>
+        </w:rPr>
+        <w:t xml:space="preserve">Da evitare 9-14/11</w:t>
+      </w:r>
+      <w:r>
+        <w:t xml:space="preserve">:</w:t>
+      </w:r>
+      <w:r>
+        <w:t xml:space="preserve"> </w:t>
+      </w:r>
+      <w:r>
+        <w:t xml:space="preserve">i pacchetti dello sprint 2 toccano elementi consegnati con lo sprint 1 (footer,</w:t>
       </w:r>
       <w:r>
         <w:t xml:space="preserve"> </w:t>
@@ -3859,7 +3880,7 @@
         <w:t xml:space="preserve">heading-home2</w:t>
       </w:r>
       <w:r>
-        <w:t xml:space="preserve">). Prima del</w:t>
+        <w:t xml:space="preserve">), e la consegna dello sprint 2 del 13/11 cade nella stessa settimana: tutto va pubblicato prima. Prima del</w:t>
       </w:r>
       <w:r>
         <w:t xml:space="preserve"> </w:t>

</xml_diff>

<commit_message>
Piano: esclusione degli host modx.dev in GTM (metodo), ossigenopuro.anniazzurri.it traffico valido
Co-Authored-By: Claude Opus 5.5 <noreply@anthropic.com>
Claude-Session: https://claude.ai/code/session_01Rr1X44gsg7BUwMzrRvYrc2
</commit_message>
<xml_diff>
--- a/docs/docx/piano-sprint-1.docx
+++ b/docs/docx/piano-sprint-1.docx
@@ -4285,6 +4285,79 @@
       </w:r>
       <w:r>
         <w:t xml:space="preserve">.</w:t>
+      </w:r>
+      <w:r>
+        <w:t xml:space="preserve"> </w:t>
+      </w:r>
+      <w:r>
+        <w:rPr>
+          <w:bCs/>
+          <w:b/>
+        </w:rPr>
+        <w:t xml:space="preserve">25/10:</w:t>
+      </w:r>
+      <w:r>
+        <w:t xml:space="preserve"> </w:t>
+      </w:r>
+      <w:r>
+        <w:t xml:space="preserve">confermato da Danilo; anche il 24/10 GA4 AA ha 80 eventi dallo stage</w:t>
+      </w:r>
+      <w:r>
+        <w:t xml:space="preserve"> </w:t>
+      </w:r>
+      <w:r>
+        <w:rPr>
+          <w:rStyle w:val="VerbatimChar"/>
+        </w:rPr>
+        <w:t xml:space="preserve">tcm7b0i8.modx.dev</w:t>
+      </w:r>
+      <w:r>
+        <w:t xml:space="preserve"> </w:t>
+      </w:r>
+      <w:r>
+        <w:t xml:space="preserve">(collaudi). Metodo: in ciascun contenitore attivare la variabile «Page Hostname», creare l'attivatore di blocco «Escludi ambienti di sviluppo» (Evento personalizzato, nome evento</w:t>
+      </w:r>
+      <w:r>
+        <w:t xml:space="preserve"> </w:t>
+      </w:r>
+      <w:r>
+        <w:rPr>
+          <w:rStyle w:val="VerbatimChar"/>
+        </w:rPr>
+        <w:t xml:space="preserve">.*</w:t>
+      </w:r>
+      <w:r>
+        <w:t xml:space="preserve"> </w:t>
+      </w:r>
+      <w:r>
+        <w:t xml:space="preserve">come espressione regolare, condizione Page Hostname corrisponde a</w:t>
+      </w:r>
+      <w:r>
+        <w:t xml:space="preserve"> </w:t>
+      </w:r>
+      <w:r>
+        <w:rPr>
+          <w:rStyle w:val="VerbatimChar"/>
+        </w:rPr>
+        <w:t xml:space="preserve">\.modx\.dev$</w:t>
+      </w:r>
+      <w:r>
+        <w:t xml:space="preserve">) e aggiungerlo come eccezione a tutti i tag di misura e marketing (tag Google GA4, eventi GA4, Google Ads, altri pixel); verifica in Anteprima sullo stage e sulla produzione, poi pubblicazione.</w:t>
+      </w:r>
+      <w:r>
+        <w:t xml:space="preserve"> </w:t>
+      </w:r>
+      <w:r>
+        <w:rPr>
+          <w:rStyle w:val="VerbatimChar"/>
+        </w:rPr>
+        <w:t xml:space="preserve">ossigenopuro.anniazzurri.it</w:t>
+      </w:r>
+      <w:r>
+        <w:t xml:space="preserve"> </w:t>
+      </w:r>
+      <w:r>
+        <w:t xml:space="preserve">(minisito per gli OSS, moduli di contatto e invio CV) usa lo stesso contenitore AA ed è traffico valido: si tiene, distinto per host nelle analisi.</w:t>
       </w:r>
     </w:p>
     <w:p>

</xml_diff>

<commit_message>
Piano: proposta fuori piano, pagine delle condizioni come entità mediche (complemento della voce 24)
Co-Authored-By: Claude Opus 5.5 <noreply@anthropic.com>
Claude-Session: https://claude.ai/code/session_01Rr1X44gsg7BUwMzrRvYrc2
</commit_message>
<xml_diff>
--- a/docs/docx/piano-sprint-1.docx
+++ b/docs/docx/piano-sprint-1.docx
@@ -3018,7 +3018,6 @@
           <w:ilvl w:val="0"/>
           <w:numId w:val="1006"/>
         </w:numPr>
-        <w:pStyle w:val="Compact"/>
       </w:pPr>
       <w:r>
         <w:rPr>
@@ -3133,7 +3132,6 @@
           <w:ilvl w:val="0"/>
           <w:numId w:val="1006"/>
         </w:numPr>
-        <w:pStyle w:val="Compact"/>
       </w:pPr>
       <w:r>
         <w:rPr>
@@ -3194,7 +3192,6 @@
           <w:ilvl w:val="0"/>
           <w:numId w:val="1006"/>
         </w:numPr>
-        <w:pStyle w:val="Compact"/>
       </w:pPr>
       <w:r>
         <w:rPr>
@@ -3294,7 +3291,6 @@
           <w:ilvl w:val="0"/>
           <w:numId w:val="1006"/>
         </w:numPr>
-        <w:pStyle w:val="Compact"/>
       </w:pPr>
       <w:r>
         <w:rPr>
@@ -3447,6 +3443,219 @@
       </w:r>
       <w:r>
         <w:t xml:space="preserve">) entra nel consolidamento degli head, non prima.</w:t>
+      </w:r>
+    </w:p>
+    <w:p>
+      <w:pPr>
+        <w:numPr>
+          <w:ilvl w:val="0"/>
+          <w:numId w:val="1006"/>
+        </w:numPr>
+      </w:pPr>
+      <w:r>
+        <w:rPr>
+          <w:bCs/>
+          <w:b/>
+        </w:rPr>
+        <w:t xml:space="preserve">[KOS, da fare dopo la voce 24, da valutare se a consuntivo] Pagine delle condizioni come entità mediche</w:t>
+      </w:r>
+      <w:r>
+        <w:t xml:space="preserve"> </w:t>
+      </w:r>
+      <w:r>
+        <w:t xml:space="preserve">(proposta del 25 ottobre). Oggi la condizione trattata (es. «Disturbi d'ansia») compare nel nodo della struttura come</w:t>
+      </w:r>
+      <w:r>
+        <w:t xml:space="preserve"> </w:t>
+      </w:r>
+      <w:r>
+        <w:rPr>
+          <w:rStyle w:val="VerbatimChar"/>
+        </w:rPr>
+        <w:t xml:space="preserve">knowsAbout</w:t>
+      </w:r>
+      <w:r>
+        <w:t xml:space="preserve"> </w:t>
+      </w:r>
+      <w:r>
+        <w:t xml:space="preserve">→</w:t>
+      </w:r>
+      <w:r>
+        <w:t xml:space="preserve"> </w:t>
+      </w:r>
+      <w:r>
+        <w:rPr>
+          <w:rStyle w:val="VerbatimChar"/>
+        </w:rPr>
+        <w:t xml:space="preserve">MedicalCondition</w:t>
+      </w:r>
+      <w:r>
+        <w:t xml:space="preserve"> </w:t>
+      </w:r>
+      <w:r>
+        <w:t xml:space="preserve">con l'URL della pagina: schema.org non ha una proprietà «condizione trattata» per le strutture. Passo complementare: le pagine di «Servizi e cure» del ramo Psichiatria (12 condizioni) e Riabilitazione (es. Parkinson) diventano</w:t>
+      </w:r>
+      <w:r>
+        <w:t xml:space="preserve"> </w:t>
+      </w:r>
+      <w:r>
+        <w:rPr>
+          <w:rStyle w:val="VerbatimChar"/>
+        </w:rPr>
+        <w:t xml:space="preserve">MedicalWebPage</w:t>
+      </w:r>
+      <w:r>
+        <w:t xml:space="preserve"> </w:t>
+      </w:r>
+      <w:r>
+        <w:t xml:space="preserve">con</w:t>
+      </w:r>
+      <w:r>
+        <w:t xml:space="preserve"> </w:t>
+      </w:r>
+      <w:r>
+        <w:rPr>
+          <w:rStyle w:val="VerbatimChar"/>
+        </w:rPr>
+        <w:t xml:space="preserve">about</w:t>
+      </w:r>
+      <w:r>
+        <w:t xml:space="preserve"> </w:t>
+      </w:r>
+      <w:r>
+        <w:t xml:space="preserve">→</w:t>
+      </w:r>
+      <w:r>
+        <w:t xml:space="preserve"> </w:t>
+      </w:r>
+      <w:r>
+        <w:rPr>
+          <w:rStyle w:val="VerbatimChar"/>
+        </w:rPr>
+        <w:t xml:space="preserve">MedicalCondition</w:t>
+      </w:r>
+      <w:r>
+        <w:t xml:space="preserve"> </w:t>
+      </w:r>
+      <w:r>
+        <w:t xml:space="preserve">(</w:t>
+      </w:r>
+      <w:r>
+        <w:rPr>
+          <w:rStyle w:val="VerbatimChar"/>
+        </w:rPr>
+        <w:t xml:space="preserve">@id</w:t>
+      </w:r>
+      <w:r>
+        <w:t xml:space="preserve"> </w:t>
+      </w:r>
+      <w:r>
+        <w:rPr>
+          <w:rStyle w:val="VerbatimChar"/>
+        </w:rPr>
+        <w:t xml:space="preserve">{URL}#condition</w:t>
+      </w:r>
+      <w:r>
+        <w:t xml:space="preserve">, già previsto dalla convenzione con</w:t>
+      </w:r>
+      <w:r>
+        <w:t xml:space="preserve"> </w:t>
+      </w:r>
+      <w:r>
+        <w:rPr>
+          <w:rStyle w:val="VerbatimChar"/>
+        </w:rPr>
+        <w:t xml:space="preserve">frag_patologia</w:t>
+      </w:r>
+      <w:r>
+        <w:t xml:space="preserve">), nome, eventuali sinonimi (</w:t>
+      </w:r>
+      <w:r>
+        <w:rPr>
+          <w:rStyle w:val="VerbatimChar"/>
+        </w:rPr>
+        <w:t xml:space="preserve">alternateName</w:t>
+      </w:r>
+      <w:r>
+        <w:t xml:space="preserve">),</w:t>
+      </w:r>
+      <w:r>
+        <w:t xml:space="preserve"> </w:t>
+      </w:r>
+      <w:r>
+        <w:rPr>
+          <w:rStyle w:val="VerbatimChar"/>
+        </w:rPr>
+        <w:t xml:space="preserve">possibleTreatment</w:t>
+      </w:r>
+      <w:r>
+        <w:t xml:space="preserve"> </w:t>
+      </w:r>
+      <w:r>
+        <w:t xml:space="preserve">verso le pagine dei trattamenti e le strutture che la trattano lette al contrario dalle associazioni delle schede (</w:t>
+      </w:r>
+      <w:r>
+        <w:rPr>
+          <w:rStyle w:val="VerbatimChar"/>
+        </w:rPr>
+        <w:t xml:space="preserve">mentions</w:t>
+      </w:r>
+      <w:r>
+        <w:t xml:space="preserve"> </w:t>
+      </w:r>
+      <w:r>
+        <w:t xml:space="preserve">o</w:t>
+      </w:r>
+      <w:r>
+        <w:t xml:space="preserve"> </w:t>
+      </w:r>
+      <w:r>
+        <w:rPr>
+          <w:rStyle w:val="VerbatimChar"/>
+        </w:rPr>
+        <w:t xml:space="preserve">relevantSpecialty</w:t>
+      </w:r>
+      <w:r>
+        <w:t xml:space="preserve"> </w:t>
+      </w:r>
+      <w:r>
+        <w:t xml:space="preserve">più l'elenco delle strutture con</w:t>
+      </w:r>
+      <w:r>
+        <w:t xml:space="preserve"> </w:t>
+      </w:r>
+      <w:r>
+        <w:rPr>
+          <w:rStyle w:val="VerbatimChar"/>
+        </w:rPr>
+        <w:t xml:space="preserve">@id</w:t>
+      </w:r>
+      <w:r>
+        <w:t xml:space="preserve"> </w:t>
+      </w:r>
+      <w:r>
+        <w:rPr>
+          <w:rStyle w:val="VerbatimChar"/>
+        </w:rPr>
+        <w:t xml:space="preserve">#localbusiness</w:t>
+      </w:r>
+      <w:r>
+        <w:t xml:space="preserve">). Così il legame condizione ↔ struttura è descritto da entrambi i lati, come sul sito. Prerequisiti: associazioni confermate da KOS, tabella</w:t>
+      </w:r>
+      <w:r>
+        <w:t xml:space="preserve"> </w:t>
+      </w:r>
+      <w:r>
+        <w:rPr>
+          <w:rStyle w:val="VerbatimChar"/>
+        </w:rPr>
+        <w:t xml:space="preserve">srv.schema</w:t>
+      </w:r>
+      <w:r>
+        <w:t xml:space="preserve"> </w:t>
+      </w:r>
+      <w:r>
+        <w:t xml:space="preserve">approvata. Stima indicativa mezza giornata nella libreria comune più il collaudo; utile anche ad anniazzurri.it (patologie nelle residenze) con la stessa funzione.</w:t>
       </w:r>
     </w:p>
     <w:bookmarkEnd w:id="24"/>

</xml_diff>

<commit_message>
KOS-2: immagini ottimizzate sullo stage, collaudo visivo superato
Co-Authored-By: Claude Opus 5.5 <noreply@anthropic.com>
Claude-Session: https://claude.ai/code/session_01Rr1X44gsg7BUwMzrRvYrc2
</commit_message>
<xml_diff>
--- a/docs/docx/piano-sprint-1.docx
+++ b/docs/docx/piano-sprint-1.docx
@@ -4451,7 +4451,43 @@
         <w:t xml:space="preserve"> </w:t>
       </w:r>
       <w:r>
-        <w:t xml:space="preserve">(73 chunk, 5 template) dopo la verifica di novembre.</w:t>
+        <w:t xml:space="preserve">(73 chunk, 5 template) dopo la verifica di novembre. Sullo stage il 26/10</w:t>
+      </w:r>
+      <w:r>
+        <w:t xml:space="preserve"> </w:t>
+      </w:r>
+      <w:r>
+        <w:t xml:space="preserve">(14,1 → 5,8 MB, −59%; backup</w:t>
+      </w:r>
+      <w:r>
+        <w:t xml:space="preserve"> </w:t>
+      </w:r>
+      <w:r>
+        <w:rPr>
+          <w:rStyle w:val="VerbatimChar"/>
+        </w:rPr>
+        <w:t xml:space="preserve">immagini-20261026-144615</w:t>
+      </w:r>
+      <w:r>
+        <w:t xml:space="preserve">); collaudo visivo stage/produzione a 390 e 1366 px su 65 pagine:</w:t>
+      </w:r>
+      <w:r>
+        <w:t xml:space="preserve"> </w:t>
+      </w:r>
+      <w:r>
+        <w:t xml:space="preserve">tutte le pagine con immagini sostituite sotto lo 0,5% di pixel diversi (home, storia, management, governance, strutture,</w:t>
+      </w:r>
+      <w:r>
+        <w:t xml:space="preserve"> </w:t>
+      </w:r>
+      <w:r>
+        <w:t xml:space="preserve">lavorare in KOS, Villa dei Pini); le 12 combinazioni segnalate dipendono da contenuti diversi tra stage e produzione</w:t>
+      </w:r>
+      <w:r>
+        <w:t xml:space="preserve"> </w:t>
+      </w:r>
+      <w:r>
+        <w:t xml:space="preserve">(privacy aggiornata in produzione, carosello e mappa). Produzione: 27-28/10, poi nuova misura LCP per il «dopo».</w:t>
       </w:r>
     </w:p>
     <w:bookmarkEnd w:id="26"/>

</xml_diff>

<commit_message>
KOS-2: immagini ottimizzate in produzione, LCP mediano mobile da 7,8 a 4,3 s nella misura di laboratorio
Co-Authored-By: Claude Opus 5.5 <noreply@anthropic.com>
Claude-Session: https://claude.ai/code/session_01Rr1X44gsg7BUwMzrRvYrc2
</commit_message>
<xml_diff>
--- a/docs/docx/piano-sprint-1.docx
+++ b/docs/docx/piano-sprint-1.docx
@@ -4487,7 +4487,71 @@
         <w:t xml:space="preserve"> </w:t>
       </w:r>
       <w:r>
-        <w:t xml:space="preserve">(privacy più lunga in produzione, probabilmente per la dichiarazione dei cookie di Cookiebot che compare solo sul dominio autorizzato; carosello e mappa). Produzione: 27-28/10, poi nuova misura LCP per il «dopo».</w:t>
+        <w:t xml:space="preserve">(privacy più lunga in produzione, probabilmente per la dichiarazione dei cookie di Cookiebot che compare solo sul dominio autorizzato; carosello e mappa).</w:t>
+      </w:r>
+      <w:r>
+        <w:t xml:space="preserve"> </w:t>
+      </w:r>
+      <w:r>
+        <w:rPr>
+          <w:bCs/>
+          <w:b/>
+        </w:rPr>
+        <w:t xml:space="preserve">In produzione il 26/10 sera.</w:t>
+      </w:r>
+      <w:r>
+        <w:t xml:space="preserve"> </w:t>
+      </w:r>
+      <w:r>
+        <w:t xml:space="preserve">Misura del «dopo»</w:t>
+      </w:r>
+      <w:r>
+        <w:t xml:space="preserve"> </w:t>
+      </w:r>
+      <w:r>
+        <w:t xml:space="preserve">(stesse 65 pagine, 1 caricamento per pagina, indicativa): LCP mediano mobile 7,8 → 4,3 s (−45%), immagini non WebP</w:t>
+      </w:r>
+      <w:r>
+        <w:t xml:space="preserve"> </w:t>
+      </w:r>
+      <w:r>
+        <w:t xml:space="preserve">scaricate 73,8 → 37,6 MB; es. «La nostra storia» 16,9 → 8,9 s, home 13,2 → 6,7 s, governance 7-9 → 3,5 s, Prenota</w:t>
+      </w:r>
+      <w:r>
+        <w:t xml:space="preserve"> </w:t>
+      </w:r>
+      <w:r>
+        <w:t xml:space="preserve">online 5,2 → 2,6 s. Restano lenti: Villa dei Pini Civitanova (21 s: 99 immagini della galleria fuori schermo senza</w:t>
+      </w:r>
+      <w:r>
+        <w:t xml:space="preserve"> </w:t>
+      </w:r>
+      <w:r>
+        <w:t xml:space="preserve">caricamento differito, foto 01.jpg 210 KB), le pagine con il banner Cookiebot come elemento LCP (11), Settimana del</w:t>
+      </w:r>
+      <w:r>
+        <w:t xml:space="preserve"> </w:t>
+      </w:r>
+      <w:r>
+        <w:t xml:space="preserve">Cervello. Leve successive: caricamento differito delle immagini fuori schermo e conversione a</w:t>
+      </w:r>
+      <w:r>
+        <w:t xml:space="preserve"> </w:t>
+      </w:r>
+      <w:r>
+        <w:rPr>
+          <w:rStyle w:val="VerbatimChar"/>
+        </w:rPr>
+        <w:t xml:space="preserve">&lt;picture&gt;</w:t>
+      </w:r>
+      <w:r>
+        <w:t xml:space="preserve">; studio di</w:t>
+      </w:r>
+      <w:r>
+        <w:t xml:space="preserve"> </w:t>
+      </w:r>
+      <w:r>
+        <w:t xml:space="preserve">Cookiebot (precaricamento dello script).</w:t>
       </w:r>
     </w:p>
     <w:bookmarkEnd w:id="26"/>

</xml_diff>

<commit_message>
Piano: calendario della prova comparativa Meilisearch / Vertex AI Search per la sostituzione della ricerca Yext
Co-Authored-By: Claude Opus 5.5 <noreply@anthropic.com>
Claude-Session: https://claude.ai/code/session_01Rr1X44gsg7BUwMzrRvYrc2
</commit_message>
<xml_diff>
--- a/docs/docx/piano-sprint-1.docx
+++ b/docs/docx/piano-sprint-1.docx
@@ -2,7 +2,7 @@
 <file path=word/document.xml><?xml version="1.0" encoding="utf-8"?>
 <w:document xmlns:w="http://schemas.openxmlformats.org/wordprocessingml/2006/main" xmlns:m="http://schemas.openxmlformats.org/officeDocument/2006/math" xmlns:r="http://schemas.openxmlformats.org/officeDocument/2006/relationships" xmlns:o="urn:schemas-microsoft-com:office:office" xmlns:v="urn:schemas-microsoft-com:vml" xmlns:w10="urn:schemas-microsoft-com:office:word" xmlns:a="http://schemas.openxmlformats.org/drawingml/2006/main" xmlns:pic="http://schemas.openxmlformats.org/drawingml/2006/picture" xmlns:wp="http://schemas.openxmlformats.org/drawingml/2006/wordprocessingDrawing">
   <w:body>
-    <w:bookmarkStart w:id="30" w:name="Xff2d8b895f42074f3d940c259894f313a91b2c2"/>
+    <w:bookmarkStart w:id="31" w:name="Xff2d8b895f42074f3d940c259894f313a91b2c2"/>
     <w:p>
       <w:pPr>
         <w:pStyle w:val="Heading1"/>
@@ -4555,7 +4555,384 @@
       </w:r>
     </w:p>
     <w:bookmarkEnd w:id="26"/>
-    <w:bookmarkStart w:id="27" w:name="Xccbd241b55281545db5ae3150331824f0f75f18"/>
+    <w:bookmarkStart w:id="27" w:name="Xaa16755a13975bb21ff40475055306adf18ab77"/>
+    <w:p>
+      <w:pPr>
+        <w:pStyle w:val="Heading2"/>
+      </w:pPr>
+      <w:r>
+        <w:t xml:space="preserve">Sostituzione della ricerca Yext (linea C, deciso il 27/10)</w:t>
+      </w:r>
+    </w:p>
+    <w:p>
+      <w:pPr>
+        <w:pStyle w:val="FirstParagraph"/>
+      </w:pPr>
+      <w:r>
+        <w:t xml:space="preserve">Analisi nella chat «Sostituzione barra di ricerca Yext» (26/10): Yext Answers su entrambi i siti (KOS circa 2.150</w:t>
+      </w:r>
+      <w:r>
+        <w:t xml:space="preserve"> </w:t>
+      </w:r>
+      <w:r>
+        <w:t xml:space="preserve">ricerche al mese, AA 53); scelta tra</w:t>
+      </w:r>
+      <w:r>
+        <w:t xml:space="preserve"> </w:t>
+      </w:r>
+      <w:r>
+        <w:rPr>
+          <w:bCs/>
+          <w:b/>
+        </w:rPr>
+        <w:t xml:space="preserve">Meilisearch</w:t>
+      </w:r>
+      <w:r>
+        <w:t xml:space="preserve"> </w:t>
+      </w:r>
+      <w:r>
+        <w:t xml:space="preserve">e</w:t>
+      </w:r>
+      <w:r>
+        <w:t xml:space="preserve"> </w:t>
+      </w:r>
+      <w:r>
+        <w:rPr>
+          <w:bCs/>
+          <w:b/>
+        </w:rPr>
+        <w:t xml:space="preserve">Vertex AI Search</w:t>
+      </w:r>
+      <w:r>
+        <w:t xml:space="preserve"> </w:t>
+      </w:r>
+      <w:r>
+        <w:t xml:space="preserve">con una prova comparativa sulle query reali</w:t>
+      </w:r>
+      <w:r>
+        <w:t xml:space="preserve"> </w:t>
+      </w:r>
+      <w:r>
+        <w:t xml:space="preserve">dei CSV a 12 mesi. Il lavoro resta nel progetto (cartella</w:t>
+      </w:r>
+      <w:r>
+        <w:t xml:space="preserve"> </w:t>
+      </w:r>
+      <w:r>
+        <w:rPr>
+          <w:rStyle w:val="VerbatimChar"/>
+        </w:rPr>
+        <w:t xml:space="preserve">docs/ricerca/</w:t>
+      </w:r>
+      <w:r>
+        <w:t xml:space="preserve"> </w:t>
+      </w:r>
+      <w:r>
+        <w:t xml:space="preserve">e script nel repository); la prova si svolge</w:t>
+      </w:r>
+      <w:r>
+        <w:t xml:space="preserve"> </w:t>
+      </w:r>
+      <w:r>
+        <w:t xml:space="preserve">nella chat dedicata. Integrazioni decise il 27/10: terza variante Meilisearch con embedding Google in regione EU (per le</w:t>
+      </w:r>
+      <w:r>
+        <w:t xml:space="preserve"> </w:t>
+      </w:r>
+      <w:r>
+        <w:t xml:space="preserve">frasi di AA); chiave Meilisearch limitata agli indici della prova e con scadenza, progetto Google Cloud dedicato da</w:t>
+      </w:r>
+      <w:r>
+        <w:t xml:space="preserve"> </w:t>
+      </w:r>
+      <w:r>
+        <w:t xml:space="preserve">cancellare a fine prova; strutture indicizzate dalle TV della voce 24 dopo l'import (non da</w:t>
+      </w:r>
+      <w:r>
+        <w:t xml:space="preserve"> </w:t>
+      </w:r>
+      <w:r>
+        <w:rPr>
+          <w:rStyle w:val="VerbatimChar"/>
+        </w:rPr>
+        <w:t xml:space="preserve">strutture.txt</w:t>
+      </w:r>
+      <w:r>
+        <w:t xml:space="preserve">, non</w:t>
+      </w:r>
+      <w:r>
+        <w:t xml:space="preserve"> </w:t>
+      </w:r>
+      <w:r>
+        <w:t xml:space="preserve">aggiornato); query ripulite da email, numeri e frasi personali prima dell'invio ai servizi esterni. La prova non tocca i</w:t>
+      </w:r>
+      <w:r>
+        <w:t xml:space="preserve"> </w:t>
+      </w:r>
+      <w:r>
+        <w:t xml:space="preserve">siti: può svolgersi anche durante la verifica dell'agenzia.</w:t>
+      </w:r>
+    </w:p>
+    <w:tbl>
+      <w:tblPr>
+        <w:tblStyle w:val="Table"/>
+        <w:tblW w:type="auto" w:w="0"/>
+        <w:tblLook w:firstRow="1" w:lastRow="0" w:firstColumn="0" w:lastColumn="0" w:noHBand="0" w:noVBand="0" w:val="0020"/>
+        <w:jc w:val="start"/>
+      </w:tblPr>
+      <w:tblGrid>
+        <w:gridCol w:w="2640"/>
+        <w:gridCol w:w="2640"/>
+        <w:gridCol w:w="2640"/>
+      </w:tblGrid>
+      <w:tr>
+        <w:trPr>
+          <w:tblHeader w:val="true"/>
+        </w:trPr>
+        <w:tc>
+          <w:tcPr/>
+          <w:p>
+            <w:pPr>
+              <w:pStyle w:val="Compact"/>
+              <w:jc w:val="left"/>
+            </w:pPr>
+            <w:r>
+              <w:t xml:space="preserve">Quando</w:t>
+            </w:r>
+          </w:p>
+        </w:tc>
+        <w:tc>
+          <w:tcPr/>
+          <w:p>
+            <w:pPr>
+              <w:pStyle w:val="Compact"/>
+              <w:jc w:val="left"/>
+            </w:pPr>
+            <w:r>
+              <w:t xml:space="preserve">Attività</w:t>
+            </w:r>
+          </w:p>
+        </w:tc>
+        <w:tc>
+          <w:tcPr/>
+          <w:p>
+            <w:pPr>
+              <w:pStyle w:val="Compact"/>
+              <w:jc w:val="left"/>
+            </w:pPr>
+            <w:r>
+              <w:t xml:space="preserve">Da Danilo</w:t>
+            </w:r>
+          </w:p>
+        </w:tc>
+      </w:tr>
+      <w:tr>
+        <w:tc>
+          <w:tcPr/>
+          <w:p>
+            <w:pPr>
+              <w:pStyle w:val="Compact"/>
+              <w:jc w:val="left"/>
+            </w:pPr>
+            <w:r>
+              <w:t xml:space="preserve">29-30/10</w:t>
+            </w:r>
+          </w:p>
+        </w:tc>
+        <w:tc>
+          <w:tcPr/>
+          <w:p>
+            <w:pPr>
+              <w:pStyle w:val="Compact"/>
+              <w:jc w:val="left"/>
+            </w:pPr>
+            <w:r>
+              <w:t xml:space="preserve">Preparazione senza credenziali: set di query ripulito con risultati attesi, comuni → coordinate, sinonimi, esportazione dei contenuti in sola lettura</w:t>
+            </w:r>
+          </w:p>
+        </w:tc>
+        <w:tc>
+          <w:tcPr/>
+          <w:p>
+            <w:pPr>
+              <w:pStyle w:val="Compact"/>
+              <w:jc w:val="left"/>
+            </w:pPr>
+            <w:r>
+              <w:t xml:space="preserve">—</w:t>
+            </w:r>
+          </w:p>
+        </w:tc>
+      </w:tr>
+      <w:tr>
+        <w:tc>
+          <w:tcPr/>
+          <w:p>
+            <w:pPr>
+              <w:pStyle w:val="Compact"/>
+              <w:jc w:val="left"/>
+            </w:pPr>
+            <w:r>
+              <w:t xml:space="preserve">2/11</w:t>
+            </w:r>
+          </w:p>
+        </w:tc>
+        <w:tc>
+          <w:tcPr/>
+          <w:p>
+            <w:pPr>
+              <w:pStyle w:val="Compact"/>
+              <w:jc w:val="left"/>
+            </w:pPr>
+            <w:r>
+              <w:t xml:space="preserve">Creazione degli account (Meilisearch quel giorno: prova gratuita di 14 giorni)</w:t>
+            </w:r>
+          </w:p>
+        </w:tc>
+        <w:tc>
+          <w:tcPr/>
+          <w:p>
+            <w:pPr>
+              <w:pStyle w:val="Compact"/>
+              <w:jc w:val="left"/>
+            </w:pPr>
+            <w:r>
+              <w:t xml:space="preserve">Account Meilisearch (Parigi o Francoforte), progetto Google Cloud dedicato</w:t>
+            </w:r>
+          </w:p>
+        </w:tc>
+      </w:tr>
+      <w:tr>
+        <w:tc>
+          <w:tcPr/>
+          <w:p>
+            <w:pPr>
+              <w:pStyle w:val="Compact"/>
+              <w:jc w:val="left"/>
+            </w:pPr>
+            <w:r>
+              <w:t xml:space="preserve">3-6/11</w:t>
+            </w:r>
+          </w:p>
+        </w:tc>
+        <w:tc>
+          <w:tcPr/>
+          <w:p>
+            <w:pPr>
+              <w:pStyle w:val="Compact"/>
+              <w:jc w:val="left"/>
+            </w:pPr>
+            <w:r>
+              <w:t xml:space="preserve">Indicizzazione dopo l'import della voce 24, primo giro automatico, pagina di confronto affiancato</w:t>
+            </w:r>
+          </w:p>
+        </w:tc>
+        <w:tc>
+          <w:tcPr/>
+          <w:p>
+            <w:pPr>
+              <w:pStyle w:val="Compact"/>
+              <w:jc w:val="left"/>
+            </w:pPr>
+            <w:r>
+              <w:t xml:space="preserve">30 minuti di giudizio</w:t>
+            </w:r>
+          </w:p>
+        </w:tc>
+      </w:tr>
+      <w:tr>
+        <w:tc>
+          <w:tcPr/>
+          <w:p>
+            <w:pPr>
+              <w:pStyle w:val="Compact"/>
+              <w:jc w:val="left"/>
+            </w:pPr>
+            <w:r>
+              <w:t xml:space="preserve">9-13/11</w:t>
+            </w:r>
+          </w:p>
+        </w:tc>
+        <w:tc>
+          <w:tcPr/>
+          <w:p>
+            <w:pPr>
+              <w:pStyle w:val="Compact"/>
+              <w:jc w:val="left"/>
+            </w:pPr>
+            <w:r>
+              <w:t xml:space="preserve">Messa a punto alla pari, secondo giro, giudizio umano sulle frasi AA</w:t>
+            </w:r>
+          </w:p>
+        </w:tc>
+        <w:tc>
+          <w:tcPr/>
+          <w:p>
+            <w:pPr>
+              <w:pStyle w:val="Compact"/>
+              <w:jc w:val="left"/>
+            </w:pPr>
+            <w:r>
+              <w:t xml:space="preserve">Un'ora di giudizio</w:t>
+            </w:r>
+          </w:p>
+        </w:tc>
+      </w:tr>
+      <w:tr>
+        <w:tc>
+          <w:tcPr/>
+          <w:p>
+            <w:pPr>
+              <w:pStyle w:val="Compact"/>
+              <w:jc w:val="left"/>
+            </w:pPr>
+            <w:r>
+              <w:t xml:space="preserve">16/11</w:t>
+            </w:r>
+          </w:p>
+        </w:tc>
+        <w:tc>
+          <w:tcPr/>
+          <w:p>
+            <w:pPr>
+              <w:pStyle w:val="Compact"/>
+              <w:jc w:val="left"/>
+            </w:pPr>
+            <w:r>
+              <w:t xml:space="preserve">Rapporto e decisione (scade la prova Meilisearch)</w:t>
+            </w:r>
+          </w:p>
+        </w:tc>
+        <w:tc>
+          <w:tcPr/>
+          <w:p>
+            <w:pPr>
+              <w:pStyle w:val="Compact"/>
+              <w:jc w:val="left"/>
+            </w:pPr>
+            <w:r>
+              <w:t xml:space="preserve">Decisione</w:t>
+            </w:r>
+          </w:p>
+        </w:tc>
+      </w:tr>
+    </w:tbl>
+    <w:p>
+      <w:pPr>
+        <w:pStyle w:val="BodyText"/>
+      </w:pPr>
+      <w:r>
+        <w:t xml:space="preserve">Sviluppo dal 17-18/11 (5-8 settimane): metà gennaio senza margine rispetto alla scadenza Yext di fine gennaio. Da</w:t>
+      </w:r>
+      <w:r>
+        <w:t xml:space="preserve"> </w:t>
+      </w:r>
+      <w:r>
+        <w:t xml:space="preserve">chiedere subito a Yext il costo di una proroga di 1-2 mesi per la sola ricerca, da usare solo se serve.</w:t>
+      </w:r>
+    </w:p>
+    <w:bookmarkEnd w:id="27"/>
+    <w:bookmarkStart w:id="28" w:name="Xccbd241b55281545db5ae3150331824f0f75f18"/>
     <w:p>
       <w:pPr>
         <w:pStyle w:val="Heading2"/>
@@ -5125,8 +5502,8 @@
         <w:t xml:space="preserve">(solo in produzione): coprono il titolo «Cos'è AzzurraMente»; da segnalare a chi gestisce i widget.</w:t>
       </w:r>
     </w:p>
-    <w:bookmarkEnd w:id="27"/>
-    <w:bookmarkStart w:id="28" w:name="X898b42ef2c7e59f20211f0633f37c3831eecc50"/>
+    <w:bookmarkEnd w:id="28"/>
+    <w:bookmarkStart w:id="29" w:name="X898b42ef2c7e59f20211f0633f37c3831eecc50"/>
     <w:p>
       <w:pPr>
         <w:pStyle w:val="Heading2"/>
@@ -5446,8 +5823,8 @@
         <w:t xml:space="preserve">Fuori perimetro, da proporre (non nei documenti condivisi): baseline di misura entro fine novembre (Search Console, Bing AI Performance, canale AI in GA4, set di prompt ripetuti), IndexNow alla pubblicazione, domanda «come ci ha conosciuto?» nei moduli, profili Google dopo RetailTune (vedi analisi del documento PWC Local del 22/10: niente parole chiave nei nomi; test di categoria su un campione; programma recensioni).</w:t>
       </w:r>
     </w:p>
-    <w:bookmarkEnd w:id="28"/>
-    <w:bookmarkStart w:id="29" w:name="X6106934d94086303083d981b094913fadf78d77"/>
+    <w:bookmarkEnd w:id="29"/>
+    <w:bookmarkStart w:id="30" w:name="X6106934d94086303083d981b094913fadf78d77"/>
     <w:p>
       <w:pPr>
         <w:pStyle w:val="Heading2"/>
@@ -5617,8 +5994,8 @@
         <w:t xml:space="preserve">, redirect cartelle documenti (KOS); immagini e PDF mancanti (AA).</w:t>
       </w:r>
     </w:p>
-    <w:bookmarkEnd w:id="29"/>
     <w:bookmarkEnd w:id="30"/>
+    <w:bookmarkEnd w:id="31"/>
     <w:sectPr/>
   </w:body>
 </w:document>

</xml_diff>

<commit_message>
Piano: backup e ripristino dei contenuti AA rilasciati il 27/10
Co-Authored-By: Claude Opus 5.5 <noreply@anthropic.com>
Claude-Session: https://claude.ai/code/session_01Rr1X44gsg7BUwMzrRvYrc2
</commit_message>
<xml_diff>
--- a/docs/docx/piano-sprint-1.docx
+++ b/docs/docx/piano-sprint-1.docx
@@ -4639,7 +4639,67 @@
         <w:t xml:space="preserve"> </w:t>
       </w:r>
       <w:r>
-        <w:t xml:space="preserve">invariati dopo l'esportazione (nessun FERMO).</w:t>
+        <w:t xml:space="preserve">invariati dopo l'esportazione (nessun FERMO). Backup e ripristino: contenuti tabella</w:t>
+      </w:r>
+      <w:r>
+        <w:t xml:space="preserve"> </w:t>
+      </w:r>
+      <w:r>
+        <w:rPr>
+          <w:rStyle w:val="VerbatimChar"/>
+        </w:rPr>
+        <w:t xml:space="preserve">modx_site_content_bak_20261027_0210</w:t>
+      </w:r>
+      <w:r>
+        <w:t xml:space="preserve">,</w:t>
+      </w:r>
+      <w:r>
+        <w:t xml:space="preserve"> </w:t>
+      </w:r>
+      <w:r>
+        <w:rPr>
+          <w:rStyle w:val="VerbatimChar"/>
+        </w:rPr>
+        <w:t xml:space="preserve">~/backup-kos-seo-geo/20261027-021007-contenuti</w:t>
+      </w:r>
+      <w:r>
+        <w:t xml:space="preserve">; alt delle news tabella</w:t>
+      </w:r>
+      <w:r>
+        <w:t xml:space="preserve"> </w:t>
+      </w:r>
+      <w:r>
+        <w:rPr>
+          <w:rStyle w:val="VerbatimChar"/>
+        </w:rPr>
+        <w:t xml:space="preserve">modx_site_content_bak_20261027_0221</w:t>
+      </w:r>
+      <w:r>
+        <w:t xml:space="preserve">,</w:t>
+      </w:r>
+      <w:r>
+        <w:t xml:space="preserve"> </w:t>
+      </w:r>
+      <w:r>
+        <w:rPr>
+          <w:rStyle w:val="VerbatimChar"/>
+        </w:rPr>
+        <w:t xml:space="preserve">~/backup-kos-seo-geo/20261027-022144-contenuti</w:t>
+      </w:r>
+      <w:r>
+        <w:t xml:space="preserve"> </w:t>
+      </w:r>
+      <w:r>
+        <w:t xml:space="preserve">(</w:t>
+      </w:r>
+      <w:r>
+        <w:rPr>
+          <w:rStyle w:val="VerbatimChar"/>
+        </w:rPr>
+        <w:t xml:space="preserve">aggiorna-contenuti.php /www --ripristina &lt;cartella&gt; --scrivi</w:t>
+      </w:r>
+      <w:r>
+        <w:t xml:space="preserve">).</w:t>
       </w:r>
     </w:p>
     <w:bookmarkEnd w:id="26"/>

</xml_diff>

<commit_message>
AA-3: regole web dei redirect PDF e delle icone in produzione (27/10)
Co-Authored-By: Claude Opus 5.5 <noreply@anthropic.com>
Claude-Session: https://claude.ai/code/session_01Rr1X44gsg7BUwMzrRvYrc2
</commit_message>
<xml_diff>
--- a/docs/docx/piano-sprint-1.docx
+++ b/docs/docx/piano-sprint-1.docx
@@ -4699,7 +4699,37 @@
         <w:t xml:space="preserve">aggiorna-contenuti.php /www --ripristina &lt;cartella&gt; --scrivi</w:t>
       </w:r>
       <w:r>
-        <w:t xml:space="preserve">).</w:t>
+        <w:t xml:space="preserve">). Regole web AA in produzione il 27/10 (</w:t>
+      </w:r>
+      <w:r>
+        <w:rPr>
+          <w:rStyle w:val="VerbatimChar"/>
+        </w:rPr>
+        <w:t xml:space="preserve">aa-icone-apple.conf</w:t>
+      </w:r>
+      <w:r>
+        <w:t xml:space="preserve">,</w:t>
+      </w:r>
+      <w:r>
+        <w:t xml:space="preserve"> </w:t>
+      </w:r>
+      <w:r>
+        <w:rPr>
+          <w:rStyle w:val="VerbatimChar"/>
+        </w:rPr>
+        <w:t xml:space="preserve">aa-3-pdf-redirect.conf</w:t>
+      </w:r>
+      <w:r>
+        <w:t xml:space="preserve"> </w:t>
+      </w:r>
+      <w:r>
+        <w:t xml:space="preserve">con 97 redirect dei PDF): verificati 301 del PDF rinominato di Villa Pineta, 200 dell'icona</w:t>
+      </w:r>
+      <w:r>
+        <w:t xml:space="preserve"> </w:t>
+      </w:r>
+      <w:r>
+        <w:t xml:space="preserve">Apple con misura e della home.</w:t>
       </w:r>
     </w:p>
     <w:bookmarkEnd w:id="26"/>

</xml_diff>

<commit_message>
Piano: valutazione del documento PWC sui profili Google di Anni Azzurri (fuori perimetro)
Co-Authored-By: Claude Opus 5.5 <noreply@anthropic.com>
Claude-Session: https://claude.ai/code/session_01Rr1X44gsg7BUwMzrRvYrc2
</commit_message>
<xml_diff>
--- a/docs/docx/piano-sprint-1.docx
+++ b/docs/docx/piano-sprint-1.docx
@@ -3010,6 +3010,183 @@
       </w:pPr>
       <w:r>
         <w:t xml:space="preserve">Fuori piano, a consuntivo (in attesa di approvazione di KOS)</w:t>
+      </w:r>
+    </w:p>
+    <w:p>
+      <w:pPr>
+        <w:numPr>
+          <w:ilvl w:val="0"/>
+          <w:numId w:val="1006"/>
+        </w:numPr>
+      </w:pPr>
+      <w:r>
+        <w:rPr>
+          <w:bCs/>
+          <w:b/>
+        </w:rPr>
+        <w:t xml:space="preserve">[AA] Ottimizzazione dei profili Google (documento PWC «Local Ottimizzazioni e Linee Guida», 27/10).</w:t>
+      </w:r>
+      <w:r>
+        <w:t xml:space="preserve"> </w:t>
+      </w:r>
+      <w:r>
+        <w:t xml:space="preserve">Fuori dal</w:t>
+      </w:r>
+      <w:r>
+        <w:t xml:space="preserve"> </w:t>
+      </w:r>
+      <w:r>
+        <w:t xml:space="preserve">perimetro delle linee A e B (Local non a perimetro), nessun effetto sulla penale. Analisi: su 30 domande a ChatGPT</w:t>
+      </w:r>
+      <w:r>
+        <w:t xml:space="preserve"> </w:t>
+      </w:r>
+      <w:r>
+        <w:t xml:space="preserve">(Milano, Torino, Genova) Anni Azzurri compare in 4, Korian in 24; su Google Maps nessuna struttura AA nei primi 3 in 9</w:t>
+      </w:r>
+      <w:r>
+        <w:t xml:space="preserve"> </w:t>
+      </w:r>
+      <w:r>
+        <w:t xml:space="preserve">ricerche (Korian 6), su Bing 2 su 9. Valutazione del 27/10:</w:t>
+      </w:r>
+    </w:p>
+    <w:p>
+      <w:pPr>
+        <w:numPr>
+          <w:ilvl w:val="1"/>
+          <w:numId w:val="1007"/>
+        </w:numPr>
+        <w:pStyle w:val="Compact"/>
+      </w:pPr>
+      <w:r>
+        <w:rPr>
+          <w:bCs/>
+          <w:b/>
+        </w:rPr>
+        <w:t xml:space="preserve">da evitare:</w:t>
+      </w:r>
+      <w:r>
+        <w:t xml:space="preserve"> </w:t>
+      </w:r>
+      <w:r>
+        <w:t xml:space="preserve">parole chiave nei nomi dei profili (vietato dalle regole Google, rischio di sospensione in blocco su</w:t>
+      </w:r>
+      <w:r>
+        <w:t xml:space="preserve"> </w:t>
+      </w:r>
+      <w:r>
+        <w:t xml:space="preserve">60 sedi, in alcune proposte sparisce il marchio, contrario alla decisione di luglio di nomi coerenti tra profilo, H1 e</w:t>
+      </w:r>
+      <w:r>
+        <w:t xml:space="preserve"> </w:t>
+      </w:r>
+      <w:r>
+        <w:t xml:space="preserve">dato strutturato; «RSA» solo dove la struttura è accreditata); modifiche su tutti i profili insieme; modifiche fatte</w:t>
+      </w:r>
+      <w:r>
+        <w:t xml:space="preserve"> </w:t>
+      </w:r>
+      <w:r>
+        <w:t xml:space="preserve">direttamente su Google finché Yext sincronizza (si fanno in Yext);</w:t>
+      </w:r>
+    </w:p>
+    <w:p>
+      <w:pPr>
+        <w:numPr>
+          <w:ilvl w:val="1"/>
+          <w:numId w:val="1007"/>
+        </w:numPr>
+        <w:pStyle w:val="Compact"/>
+      </w:pPr>
+      <w:r>
+        <w:rPr>
+          <w:bCs/>
+          <w:b/>
+        </w:rPr>
+        <w:t xml:space="preserve">fattibile:</w:t>
+      </w:r>
+      <w:r>
+        <w:t xml:space="preserve"> </w:t>
+      </w:r>
+      <w:r>
+        <w:t xml:space="preserve">test della categoria principale «Casa di riposo» su 3-5 residenze di una città per 4-6 settimane, con</w:t>
+      </w:r>
+      <w:r>
+        <w:t xml:space="preserve"> </w:t>
+      </w:r>
+      <w:r>
+        <w:t xml:space="preserve">«Casa di cura» secondaria dove ci sono non autosufficienti; categorie secondarie vere; nuove descrizioni dopo</w:t>
+      </w:r>
+      <w:r>
+        <w:t xml:space="preserve"> </w:t>
+      </w:r>
+      <w:r>
+        <w:t xml:space="preserve">revisione (niente affermazioni sanitarie, «RSA» solo se accreditata); indirizzi, duplicati e reparti separati (dal</w:t>
+      </w:r>
+      <w:r>
+        <w:t xml:space="preserve"> </w:t>
+      </w:r>
+      <w:r>
+        <w:t xml:space="preserve">confronto Google/Yext del 26/10); Bing Places rivendicati e sincronizzati;</w:t>
+      </w:r>
+    </w:p>
+    <w:p>
+      <w:pPr>
+        <w:numPr>
+          <w:ilvl w:val="1"/>
+          <w:numId w:val="1007"/>
+        </w:numPr>
+        <w:pStyle w:val="Compact"/>
+      </w:pPr>
+      <w:r>
+        <w:rPr>
+          <w:bCs/>
+          <w:b/>
+        </w:rPr>
+        <w:t xml:space="preserve">da rimandare o rivedere:</w:t>
+      </w:r>
+      <w:r>
+        <w:t xml:space="preserve"> </w:t>
+      </w:r>
+      <w:r>
+        <w:t xml:space="preserve">misura su ChatGPT da rifare con domande vere e ripetute (metodo della strategia AEO; i</w:t>
+      </w:r>
+      <w:r>
+        <w:t xml:space="preserve"> </w:t>
+      </w:r>
+      <w:r>
+        <w:t xml:space="preserve">dati attuali come «prima»); programma recensioni con RetailTune (privacy sanitaria); nessuna modifica ai profili nelle</w:t>
+      </w:r>
+      <w:r>
+        <w:t xml:space="preserve"> </w:t>
+      </w:r>
+      <w:r>
+        <w:t xml:space="preserve">due settimane del passaggio Yext → RetailTune; pagine provincia AA (AA-10, sprint 3) come risposta del sito alle</w:t>
+      </w:r>
+      <w:r>
+        <w:t xml:space="preserve"> </w:t>
+      </w:r>
+      <w:r>
+        <w:t xml:space="preserve">ricerche per città.</w:t>
+      </w:r>
+    </w:p>
+    <w:p>
+      <w:pPr>
+        <w:numPr>
+          <w:ilvl w:val="1"/>
+          <w:numId w:val="1007"/>
+        </w:numPr>
+        <w:pStyle w:val="Compact"/>
+      </w:pPr>
+      <w:r>
+        <w:t xml:space="preserve">Tempi proposti: novembre test di categoria e correzioni (in Yext, con le correzioni di KOS); dicembre misura,</w:t>
+      </w:r>
+      <w:r>
+        <w:t xml:space="preserve"> </w:t>
+      </w:r>
+      <w:r>
+        <w:t xml:space="preserve">descrizioni e categorie secondarie; da gennaio recensioni e misura AEO periodica.</w:t>
       </w:r>
     </w:p>
     <w:p>
@@ -5205,7 +5382,7 @@
       <w:pPr>
         <w:numPr>
           <w:ilvl w:val="0"/>
-          <w:numId w:val="1007"/>
+          <w:numId w:val="1008"/>
         </w:numPr>
         <w:pStyle w:val="Compact"/>
       </w:pPr>
@@ -5313,483 +5490,6 @@
       </w:r>
       <w:r>
         <w:t xml:space="preserve">).</w:t>
-      </w:r>
-    </w:p>
-    <w:p>
-      <w:pPr>
-        <w:numPr>
-          <w:ilvl w:val="0"/>
-          <w:numId w:val="1007"/>
-        </w:numPr>
-        <w:pStyle w:val="Compact"/>
-      </w:pPr>
-      <w:r>
-        <w:rPr>
-          <w:bCs/>
-          <w:b/>
-        </w:rPr>
-        <w:t xml:space="preserve">[AA] Direttori con nomi diversi tra scheda e landing</w:t>
-      </w:r>
-      <w:r>
-        <w:t xml:space="preserve"> </w:t>
-      </w:r>
-      <w:r>
-        <w:t xml:space="preserve">(7 residenze: Il Giardino, Mestre, Parco Sempione, Sant'Anna, Sant'Ambrogio, Santena, Tonengo) e «Direttore» al posto di «Direttrice» (Campi Bisenzio, Beato Angelico, Santa Maria in Chienti, San Rocco): da segnalare a KOS; dopo la correzione si rigenera il pacchetto dei contenuti e l'alt delle foto si allinea.</w:t>
-      </w:r>
-    </w:p>
-    <w:p>
-      <w:pPr>
-        <w:numPr>
-          <w:ilvl w:val="0"/>
-          <w:numId w:val="1007"/>
-        </w:numPr>
-        <w:pStyle w:val="Compact"/>
-      </w:pPr>
-      <w:r>
-        <w:rPr>
-          <w:bCs/>
-          <w:b/>
-        </w:rPr>
-        <w:t xml:space="preserve">[AA] Link a PDF rotti nel sito (AA-3, scansione del 24/10)</w:t>
-      </w:r>
-      <w:r>
-        <w:t xml:space="preserve">: questionari di ammissione ASL-MB socio-anagrafico e sanitario (pagina Documentazione, risorsa 167), Carta dei servizi di La Margherita (chunk</w:t>
-      </w:r>
-      <w:r>
-        <w:t xml:space="preserve"> </w:t>
-      </w:r>
-      <w:r>
-        <w:rPr>
-          <w:rStyle w:val="VerbatimChar"/>
-        </w:rPr>
-        <w:t xml:space="preserve">cdsList</w:t>
-      </w:r>
-      <w:r>
-        <w:t xml:space="preserve">), informativa privacy del modulo</w:t>
-      </w:r>
-      <w:r>
-        <w:t xml:space="preserve"> </w:t>
-      </w:r>
-      <w:r>
-        <w:rPr>
-          <w:rStyle w:val="VerbatimChar"/>
-        </w:rPr>
-        <w:t xml:space="preserve">registrationFormKAfree</w:t>
-      </w:r>
-      <w:r>
-        <w:t xml:space="preserve"> </w:t>
-      </w:r>
-      <w:r>
-        <w:t xml:space="preserve">(</w:t>
-      </w:r>
-      <w:r>
-        <w:rPr>
-          <w:rStyle w:val="VerbatimChar"/>
-        </w:rPr>
-        <w:t xml:space="preserve">/assets/files/formazione/informativa-convegni-Kos-Care.pdf</w:t>
-      </w:r>
-      <w:r>
-        <w:t xml:space="preserve">; verificare se il modulo è ancora in uso e quale informativa usare: il modulo attuale</w:t>
-      </w:r>
-      <w:r>
-        <w:t xml:space="preserve"> </w:t>
-      </w:r>
-      <w:r>
-        <w:rPr>
-          <w:rStyle w:val="VerbatimChar"/>
-        </w:rPr>
-        <w:t xml:space="preserve">ecmIscrizione</w:t>
-      </w:r>
-      <w:r>
-        <w:t xml:space="preserve"> </w:t>
-      </w:r>
-      <w:r>
-        <w:t xml:space="preserve">usa</w:t>
-      </w:r>
-      <w:r>
-        <w:t xml:space="preserve"> </w:t>
-      </w:r>
-      <w:r>
-        <w:rPr>
-          <w:rStyle w:val="VerbatimChar"/>
-        </w:rPr>
-        <w:t xml:space="preserve">/assets/doc/KOS-Care_GDPR_Informativa.pdf</w:t>
-      </w:r>
-      <w:r>
-        <w:t xml:space="preserve">). Chiedere i documenti alle strutture o togliere i link.</w:t>
-      </w:r>
-    </w:p>
-    <w:p>
-      <w:pPr>
-        <w:numPr>
-          <w:ilvl w:val="0"/>
-          <w:numId w:val="1007"/>
-        </w:numPr>
-        <w:pStyle w:val="Compact"/>
-      </w:pPr>
-      <w:r>
-        <w:rPr>
-          <w:bCs/>
-          <w:b/>
-        </w:rPr>
-        <w:t xml:space="preserve">[2 siti] Traffico degli ambienti di sviluppo in GA4</w:t>
-      </w:r>
-      <w:r>
-        <w:t xml:space="preserve"> </w:t>
-      </w:r>
-      <w:r>
-        <w:t xml:space="preserve">(BigQuery, 24/10): eventi da 7 host</w:t>
-      </w:r>
-      <w:r>
-        <w:t xml:space="preserve"> </w:t>
-      </w:r>
-      <w:r>
-        <w:rPr>
-          <w:rStyle w:val="VerbatimChar"/>
-        </w:rPr>
-        <w:t xml:space="preserve">*.modx.dev</w:t>
-      </w:r>
-      <w:r>
-        <w:t xml:space="preserve"> </w:t>
-      </w:r>
-      <w:r>
-        <w:t xml:space="preserve">da gennaio, perché le copie dei siti contengono lo stesso Tag Manager. Condizione «Page Hostname» sui tag di misura nei contenitori GTM dei due siti (lasciare</w:t>
-      </w:r>
-      <w:r>
-        <w:t xml:space="preserve"> </w:t>
-      </w:r>
-      <w:r>
-        <w:rPr>
-          <w:rStyle w:val="VerbatimChar"/>
-        </w:rPr>
-        <w:t xml:space="preserve">app.tuotempo.com</w:t>
-      </w:r>
-      <w:r>
-        <w:t xml:space="preserve">, prenotazioni); nelle analisi BigQuery escludere gli host</w:t>
-      </w:r>
-      <w:r>
-        <w:t xml:space="preserve"> </w:t>
-      </w:r>
-      <w:r>
-        <w:rPr>
-          <w:rStyle w:val="VerbatimChar"/>
-        </w:rPr>
-        <w:t xml:space="preserve">modx.dev</w:t>
-      </w:r>
-      <w:r>
-        <w:t xml:space="preserve">.</w:t>
-      </w:r>
-      <w:r>
-        <w:t xml:space="preserve"> </w:t>
-      </w:r>
-      <w:r>
-        <w:rPr>
-          <w:bCs/>
-          <w:b/>
-        </w:rPr>
-        <w:t xml:space="preserve">25/10:</w:t>
-      </w:r>
-      <w:r>
-        <w:t xml:space="preserve"> </w:t>
-      </w:r>
-      <w:r>
-        <w:t xml:space="preserve">confermato da Danilo; anche il 24/10 GA4 AA ha 80 eventi dallo stage</w:t>
-      </w:r>
-      <w:r>
-        <w:t xml:space="preserve"> </w:t>
-      </w:r>
-      <w:r>
-        <w:rPr>
-          <w:rStyle w:val="VerbatimChar"/>
-        </w:rPr>
-        <w:t xml:space="preserve">tcm7b0i8.modx.dev</w:t>
-      </w:r>
-      <w:r>
-        <w:t xml:space="preserve"> </w:t>
-      </w:r>
-      <w:r>
-        <w:t xml:space="preserve">(collaudi). Metodo: in ciascun contenitore attivare la variabile «Page Hostname», creare l'attivatore di blocco «Escludi ambienti di sviluppo» (Evento personalizzato, nome evento</w:t>
-      </w:r>
-      <w:r>
-        <w:t xml:space="preserve"> </w:t>
-      </w:r>
-      <w:r>
-        <w:rPr>
-          <w:rStyle w:val="VerbatimChar"/>
-        </w:rPr>
-        <w:t xml:space="preserve">.*</w:t>
-      </w:r>
-      <w:r>
-        <w:t xml:space="preserve"> </w:t>
-      </w:r>
-      <w:r>
-        <w:t xml:space="preserve">come espressione regolare, condizione Page Hostname corrisponde a</w:t>
-      </w:r>
-      <w:r>
-        <w:t xml:space="preserve"> </w:t>
-      </w:r>
-      <w:r>
-        <w:rPr>
-          <w:rStyle w:val="VerbatimChar"/>
-        </w:rPr>
-        <w:t xml:space="preserve">\.modx\.dev$</w:t>
-      </w:r>
-      <w:r>
-        <w:t xml:space="preserve">) e aggiungerlo come eccezione a tutti i tag di misura e marketing (tag Google GA4, eventi GA4, Google Ads, altri pixel); verifica in Anteprima sullo stage e sulla produzione, poi pubblicazione.</w:t>
-      </w:r>
-      <w:r>
-        <w:t xml:space="preserve"> </w:t>
-      </w:r>
-      <w:r>
-        <w:rPr>
-          <w:rStyle w:val="VerbatimChar"/>
-        </w:rPr>
-        <w:t xml:space="preserve">ossigenopuro.anniazzurri.it</w:t>
-      </w:r>
-      <w:r>
-        <w:t xml:space="preserve"> </w:t>
-      </w:r>
-      <w:r>
-        <w:t xml:space="preserve">(minisito per gli OSS, moduli di contatto e invio CV) usa lo stesso contenitore AA ed è traffico valido: si tiene, distinto per host nelle analisi.</w:t>
-      </w:r>
-    </w:p>
-    <w:p>
-      <w:pPr>
-        <w:numPr>
-          <w:ilvl w:val="0"/>
-          <w:numId w:val="1007"/>
-        </w:numPr>
-        <w:pStyle w:val="Compact"/>
-      </w:pPr>
-      <w:r>
-        <w:rPr>
-          <w:bCs/>
-          <w:b/>
-        </w:rPr>
-        <w:t xml:space="preserve">[KOS]</w:t>
-      </w:r>
-      <w:r>
-        <w:rPr>
-          <w:bCs/>
-          <w:b/>
-        </w:rPr>
-        <w:t xml:space="preserve"> </w:t>
-      </w:r>
-      <w:r>
-        <w:rPr>
-          <w:rStyle w:val="VerbatimChar"/>
-          <w:bCs/>
-          <w:b/>
-        </w:rPr>
-        <w:t xml:space="preserve">7ydxba3m.modx.dev</w:t>
-      </w:r>
-      <w:r>
-        <w:rPr>
-          <w:bCs/>
-          <w:b/>
-        </w:rPr>
-        <w:t xml:space="preserve"> </w:t>
-      </w:r>
-      <w:r>
-        <w:rPr>
-          <w:bCs/>
-          <w:b/>
-        </w:rPr>
-        <w:t xml:space="preserve">= indirizzo tecnico MODX Cloud della produzione kosgroup.com</w:t>
-      </w:r>
-      <w:r>
-        <w:t xml:space="preserve">, raggiungibile e visitato dai crawler (2.089 utenti in GA4 da gennaio):</w:t>
-      </w:r>
-      <w:r>
-        <w:t xml:space="preserve"> </w:t>
-      </w:r>
-      <w:r>
-        <w:rPr>
-          <w:bCs/>
-          <w:b/>
-        </w:rPr>
-        <w:t xml:space="preserve">risolto il 24/10</w:t>
-      </w:r>
-      <w:r>
-        <w:t xml:space="preserve"> </w:t>
-      </w:r>
-      <w:r>
-        <w:t xml:space="preserve">con un 301 verso</w:t>
-      </w:r>
-      <w:r>
-        <w:t xml:space="preserve"> </w:t>
-      </w:r>
-      <w:r>
-        <w:rPr>
-          <w:rStyle w:val="VerbatimChar"/>
-        </w:rPr>
-        <w:t xml:space="preserve">https://kosgroup.com$request_uri</w:t>
-      </w:r>
-      <w:r>
-        <w:t xml:space="preserve"> </w:t>
-      </w:r>
-      <w:r>
-        <w:t xml:space="preserve">all'inizio delle regole web di produzione (in</w:t>
-      </w:r>
-      <w:r>
-        <w:t xml:space="preserve"> </w:t>
-      </w:r>
-      <w:r>
-        <w:rPr>
-          <w:rStyle w:val="VerbatimChar"/>
-        </w:rPr>
-        <w:t xml:space="preserve">kosgroup/files/web-rules/web-rules.conf</w:t>
-      </w:r>
-      <w:r>
-        <w:t xml:space="preserve">). Indirizzo tecnico AA (</w:t>
-      </w:r>
-      <w:r>
-        <w:rPr>
-          <w:rStyle w:val="VerbatimChar"/>
-        </w:rPr>
-        <w:t xml:space="preserve">z6naauhv.modx.dev</w:t>
-      </w:r>
-      <w:r>
-        <w:t xml:space="preserve">): già reindirizzato a</w:t>
-      </w:r>
-      <w:r>
-        <w:t xml:space="preserve"> </w:t>
-      </w:r>
-      <w:r>
-        <w:rPr>
-          <w:rStyle w:val="VerbatimChar"/>
-        </w:rPr>
-        <w:t xml:space="preserve">anniazzurri.it</w:t>
-      </w:r>
-      <w:r>
-        <w:t xml:space="preserve"> </w:t>
-      </w:r>
-      <w:r>
-        <w:t xml:space="preserve">dalla regola generica sugli host (verificato il 24/10). Da fare: verificare chi usa gli altri cloud di sviluppo con traffico in GA4 (</w:t>
-      </w:r>
-      <w:r>
-        <w:rPr>
-          <w:rStyle w:val="VerbatimChar"/>
-        </w:rPr>
-        <w:t xml:space="preserve">c28rmnd0</w:t>
-      </w:r>
-      <w:r>
-        <w:t xml:space="preserve">,</w:t>
-      </w:r>
-      <w:r>
-        <w:t xml:space="preserve"> </w:t>
-      </w:r>
-      <w:r>
-        <w:rPr>
-          <w:rStyle w:val="VerbatimChar"/>
-        </w:rPr>
-        <w:t xml:space="preserve">2q20ekw7</w:t>
-      </w:r>
-      <w:r>
-        <w:t xml:space="preserve">,</w:t>
-      </w:r>
-      <w:r>
-        <w:t xml:space="preserve"> </w:t>
-      </w:r>
-      <w:r>
-        <w:rPr>
-          <w:rStyle w:val="VerbatimChar"/>
-        </w:rPr>
-        <w:t xml:space="preserve">h94ms727</w:t>
-      </w:r>
-      <w:r>
-        <w:t xml:space="preserve">,</w:t>
-      </w:r>
-      <w:r>
-        <w:t xml:space="preserve"> </w:t>
-      </w:r>
-      <w:r>
-        <w:rPr>
-          <w:rStyle w:val="VerbatimChar"/>
-        </w:rPr>
-        <w:t xml:space="preserve">lussyiah</w:t>
-      </w:r>
-      <w:r>
-        <w:t xml:space="preserve">,</w:t>
-      </w:r>
-      <w:r>
-        <w:t xml:space="preserve"> </w:t>
-      </w:r>
-      <w:r>
-        <w:rPr>
-          <w:rStyle w:val="VerbatimChar"/>
-        </w:rPr>
-        <w:t xml:space="preserve">nnzdgwzr</w:t>
-      </w:r>
-      <w:r>
-        <w:t xml:space="preserve">) e proteggerli con password o spegnerli.</w:t>
-      </w:r>
-    </w:p>
-    <w:p>
-      <w:pPr>
-        <w:numPr>
-          <w:ilvl w:val="0"/>
-          <w:numId w:val="1007"/>
-        </w:numPr>
-        <w:pStyle w:val="Compact"/>
-      </w:pPr>
-      <w:r>
-        <w:rPr>
-          <w:bCs/>
-          <w:b/>
-        </w:rPr>
-        <w:t xml:space="preserve">[AA] Widget di accessibilità e chat su</w:t>
-      </w:r>
-      <w:r>
-        <w:rPr>
-          <w:bCs/>
-          <w:b/>
-        </w:rPr>
-        <w:t xml:space="preserve"> </w:t>
-      </w:r>
-      <w:r>
-        <w:rPr>
-          <w:rStyle w:val="VerbatimChar"/>
-          <w:bCs/>
-          <w:b/>
-        </w:rPr>
-        <w:t xml:space="preserve">/azzurramente</w:t>
-      </w:r>
-      <w:r>
-        <w:t xml:space="preserve"> </w:t>
-      </w:r>
-      <w:r>
-        <w:t xml:space="preserve">(solo in produzione): coprono il titolo «Cos'è AzzurraMente»; da segnalare a chi gestisce i widget.</w:t>
-      </w:r>
-    </w:p>
-    <w:bookmarkEnd w:id="28"/>
-    <w:bookmarkStart w:id="29" w:name="X898b42ef2c7e59f20211f0633f37c3831eecc50"/>
-    <w:p>
-      <w:pPr>
-        <w:pStyle w:val="Heading2"/>
-      </w:pPr>
-      <w:r>
-        <w:t xml:space="preserve">Indicazioni dalla strategia AEO/GEO (22 ottobre,</w:t>
-      </w:r>
-      <w:r>
-        <w:t xml:space="preserve"> </w:t>
-      </w:r>
-      <w:r>
-        <w:rPr>
-          <w:rStyle w:val="VerbatimChar"/>
-        </w:rPr>
-        <w:t xml:space="preserve">claude/strategia-aeo-geo.md</w:t>
-      </w:r>
-      <w:r>
-        <w:t xml:space="preserve">)</w:t>
-      </w:r>
-    </w:p>
-    <w:p>
-      <w:pPr>
-        <w:pStyle w:val="FirstParagraph"/>
-      </w:pPr>
-      <w:r>
-        <w:t xml:space="preserve">Dentro il perimetro, da applicare negli sprint:</w:t>
       </w:r>
     </w:p>
     <w:p>
@@ -5805,37 +5505,13 @@
           <w:bCs/>
           <w:b/>
         </w:rPr>
-        <w:t xml:space="preserve">Tipo delle residenze</w:t>
-      </w:r>
-      <w:r>
-        <w:t xml:space="preserve">:</w:t>
-      </w:r>
-      <w:r>
-        <w:t xml:space="preserve"> </w:t>
-      </w:r>
-      <w:r>
-        <w:rPr>
-          <w:rStyle w:val="VerbatimChar"/>
-        </w:rPr>
-        <w:t xml:space="preserve">NursingHome</w:t>
-      </w:r>
-      <w:r>
-        <w:t xml:space="preserve"> </w:t>
-      </w:r>
-      <w:r>
-        <w:t xml:space="preserve">non esiste su schema.org (verificato su 30.1); convenzione corretta il 22/10. Decidere con l'agenzia prima dello sprint 3 (proposta</w:t>
-      </w:r>
-      <w:r>
-        <w:t xml:space="preserve"> </w:t>
-      </w:r>
-      <w:r>
-        <w:rPr>
-          <w:rStyle w:val="VerbatimChar"/>
-        </w:rPr>
-        <w:t xml:space="preserve">["MedicalOrganization", "LocalBusiness"]</w:t>
-      </w:r>
-      <w:r>
-        <w:t xml:space="preserve">).</w:t>
+        <w:t xml:space="preserve">[AA] Direttori con nomi diversi tra scheda e landing</w:t>
+      </w:r>
+      <w:r>
+        <w:t xml:space="preserve"> </w:t>
+      </w:r>
+      <w:r>
+        <w:t xml:space="preserve">(7 residenze: Il Giardino, Mestre, Parco Sempione, Sant'Anna, Sant'Ambrogio, Santena, Tonengo) e «Direttore» al posto di «Direttrice» (Campi Bisenzio, Beato Angelico, Santa Maria in Chienti, San Rocco): da segnalare a KOS; dopo la correzione si rigenera il pacchetto dei contenuti e l'alt delle foto si allinea.</w:t>
       </w:r>
     </w:p>
     <w:p>
@@ -5851,55 +5527,73 @@
           <w:bCs/>
           <w:b/>
         </w:rPr>
-        <w:t xml:space="preserve">Medici KOS (voce 11, sprint 3)</w:t>
-      </w:r>
-      <w:r>
-        <w:t xml:space="preserve">:</w:t>
-      </w:r>
-      <w:r>
-        <w:t xml:space="preserve"> </w:t>
-      </w:r>
-      <w:r>
-        <w:rPr>
-          <w:rStyle w:val="VerbatimChar"/>
-        </w:rPr>
-        <w:t xml:space="preserve">IndividualPhysician</w:t>
-      </w:r>
-      <w:r>
-        <w:t xml:space="preserve"> </w:t>
-      </w:r>
-      <w:r>
-        <w:t xml:space="preserve">con</w:t>
-      </w:r>
-      <w:r>
-        <w:t xml:space="preserve"> </w:t>
-      </w:r>
-      <w:r>
-        <w:rPr>
-          <w:rStyle w:val="VerbatimChar"/>
-        </w:rPr>
-        <w:t xml:space="preserve">practicesAt</w:t>
-      </w:r>
-      <w:r>
-        <w:t xml:space="preserve"> </w:t>
-      </w:r>
-      <w:r>
-        <w:t xml:space="preserve">verso il</w:t>
-      </w:r>
-      <w:r>
-        <w:t xml:space="preserve"> </w:t>
-      </w:r>
-      <w:r>
-        <w:rPr>
-          <w:rStyle w:val="VerbatimChar"/>
-        </w:rPr>
-        <w:t xml:space="preserve">#localbusiness</w:t>
-      </w:r>
-      <w:r>
-        <w:t xml:space="preserve"> </w:t>
-      </w:r>
-      <w:r>
-        <w:t xml:space="preserve">della struttura.</w:t>
+        <w:t xml:space="preserve">[AA] Link a PDF rotti nel sito (AA-3, scansione del 24/10)</w:t>
+      </w:r>
+      <w:r>
+        <w:t xml:space="preserve">: questionari di ammissione ASL-MB socio-anagrafico e sanitario (pagina Documentazione, risorsa 167), Carta dei servizi di La Margherita (chunk</w:t>
+      </w:r>
+      <w:r>
+        <w:t xml:space="preserve"> </w:t>
+      </w:r>
+      <w:r>
+        <w:rPr>
+          <w:rStyle w:val="VerbatimChar"/>
+        </w:rPr>
+        <w:t xml:space="preserve">cdsList</w:t>
+      </w:r>
+      <w:r>
+        <w:t xml:space="preserve">), informativa privacy del modulo</w:t>
+      </w:r>
+      <w:r>
+        <w:t xml:space="preserve"> </w:t>
+      </w:r>
+      <w:r>
+        <w:rPr>
+          <w:rStyle w:val="VerbatimChar"/>
+        </w:rPr>
+        <w:t xml:space="preserve">registrationFormKAfree</w:t>
+      </w:r>
+      <w:r>
+        <w:t xml:space="preserve"> </w:t>
+      </w:r>
+      <w:r>
+        <w:t xml:space="preserve">(</w:t>
+      </w:r>
+      <w:r>
+        <w:rPr>
+          <w:rStyle w:val="VerbatimChar"/>
+        </w:rPr>
+        <w:t xml:space="preserve">/assets/files/formazione/informativa-convegni-Kos-Care.pdf</w:t>
+      </w:r>
+      <w:r>
+        <w:t xml:space="preserve">; verificare se il modulo è ancora in uso e quale informativa usare: il modulo attuale</w:t>
+      </w:r>
+      <w:r>
+        <w:t xml:space="preserve"> </w:t>
+      </w:r>
+      <w:r>
+        <w:rPr>
+          <w:rStyle w:val="VerbatimChar"/>
+        </w:rPr>
+        <w:t xml:space="preserve">ecmIscrizione</w:t>
+      </w:r>
+      <w:r>
+        <w:t xml:space="preserve"> </w:t>
+      </w:r>
+      <w:r>
+        <w:t xml:space="preserve">usa</w:t>
+      </w:r>
+      <w:r>
+        <w:t xml:space="preserve"> </w:t>
+      </w:r>
+      <w:r>
+        <w:rPr>
+          <w:rStyle w:val="VerbatimChar"/>
+        </w:rPr>
+        <w:t xml:space="preserve">/assets/doc/KOS-Care_GDPR_Informativa.pdf</w:t>
+      </w:r>
+      <w:r>
+        <w:t xml:space="preserve">). Chiedere i documenti alle strutture o togliere i link.</w:t>
       </w:r>
     </w:p>
     <w:p>
@@ -5915,37 +5609,125 @@
           <w:bCs/>
           <w:b/>
         </w:rPr>
-        <w:t xml:space="preserve">Collaudo di ogni sprint</w:t>
-      </w:r>
-      <w:r>
-        <w:t xml:space="preserve">: controllare anche la pagina servita senza consenso Cookiebot (testi, contatti, dato strutturato presenti); un solo</w:t>
-      </w:r>
-      <w:r>
-        <w:t xml:space="preserve"> </w:t>
-      </w:r>
-      <w:r>
-        <w:rPr>
-          <w:rStyle w:val="VerbatimChar"/>
-        </w:rPr>
-        <w:t xml:space="preserve">@graph</w:t>
-      </w:r>
-      <w:r>
-        <w:t xml:space="preserve"> </w:t>
-      </w:r>
-      <w:r>
-        <w:t xml:space="preserve">valido, H1, canonical, sitemap su un campione per template (estendere</w:t>
-      </w:r>
-      <w:r>
-        <w:t xml:space="preserve"> </w:t>
-      </w:r>
-      <w:r>
-        <w:rPr>
-          <w:rStyle w:val="VerbatimChar"/>
-        </w:rPr>
-        <w:t xml:space="preserve">verifica-rilascio-*.ps1</w:t>
-      </w:r>
-      <w:r>
-        <w:t xml:space="preserve">).</w:t>
+        <w:t xml:space="preserve">[2 siti] Traffico degli ambienti di sviluppo in GA4</w:t>
+      </w:r>
+      <w:r>
+        <w:t xml:space="preserve"> </w:t>
+      </w:r>
+      <w:r>
+        <w:t xml:space="preserve">(BigQuery, 24/10): eventi da 7 host</w:t>
+      </w:r>
+      <w:r>
+        <w:t xml:space="preserve"> </w:t>
+      </w:r>
+      <w:r>
+        <w:rPr>
+          <w:rStyle w:val="VerbatimChar"/>
+        </w:rPr>
+        <w:t xml:space="preserve">*.modx.dev</w:t>
+      </w:r>
+      <w:r>
+        <w:t xml:space="preserve"> </w:t>
+      </w:r>
+      <w:r>
+        <w:t xml:space="preserve">da gennaio, perché le copie dei siti contengono lo stesso Tag Manager. Condizione «Page Hostname» sui tag di misura nei contenitori GTM dei due siti (lasciare</w:t>
+      </w:r>
+      <w:r>
+        <w:t xml:space="preserve"> </w:t>
+      </w:r>
+      <w:r>
+        <w:rPr>
+          <w:rStyle w:val="VerbatimChar"/>
+        </w:rPr>
+        <w:t xml:space="preserve">app.tuotempo.com</w:t>
+      </w:r>
+      <w:r>
+        <w:t xml:space="preserve">, prenotazioni); nelle analisi BigQuery escludere gli host</w:t>
+      </w:r>
+      <w:r>
+        <w:t xml:space="preserve"> </w:t>
+      </w:r>
+      <w:r>
+        <w:rPr>
+          <w:rStyle w:val="VerbatimChar"/>
+        </w:rPr>
+        <w:t xml:space="preserve">modx.dev</w:t>
+      </w:r>
+      <w:r>
+        <w:t xml:space="preserve">.</w:t>
+      </w:r>
+      <w:r>
+        <w:t xml:space="preserve"> </w:t>
+      </w:r>
+      <w:r>
+        <w:rPr>
+          <w:bCs/>
+          <w:b/>
+        </w:rPr>
+        <w:t xml:space="preserve">25/10:</w:t>
+      </w:r>
+      <w:r>
+        <w:t xml:space="preserve"> </w:t>
+      </w:r>
+      <w:r>
+        <w:t xml:space="preserve">confermato da Danilo; anche il 24/10 GA4 AA ha 80 eventi dallo stage</w:t>
+      </w:r>
+      <w:r>
+        <w:t xml:space="preserve"> </w:t>
+      </w:r>
+      <w:r>
+        <w:rPr>
+          <w:rStyle w:val="VerbatimChar"/>
+        </w:rPr>
+        <w:t xml:space="preserve">tcm7b0i8.modx.dev</w:t>
+      </w:r>
+      <w:r>
+        <w:t xml:space="preserve"> </w:t>
+      </w:r>
+      <w:r>
+        <w:t xml:space="preserve">(collaudi). Metodo: in ciascun contenitore attivare la variabile «Page Hostname», creare l'attivatore di blocco «Escludi ambienti di sviluppo» (Evento personalizzato, nome evento</w:t>
+      </w:r>
+      <w:r>
+        <w:t xml:space="preserve"> </w:t>
+      </w:r>
+      <w:r>
+        <w:rPr>
+          <w:rStyle w:val="VerbatimChar"/>
+        </w:rPr>
+        <w:t xml:space="preserve">.*</w:t>
+      </w:r>
+      <w:r>
+        <w:t xml:space="preserve"> </w:t>
+      </w:r>
+      <w:r>
+        <w:t xml:space="preserve">come espressione regolare, condizione Page Hostname corrisponde a</w:t>
+      </w:r>
+      <w:r>
+        <w:t xml:space="preserve"> </w:t>
+      </w:r>
+      <w:r>
+        <w:rPr>
+          <w:rStyle w:val="VerbatimChar"/>
+        </w:rPr>
+        <w:t xml:space="preserve">\.modx\.dev$</w:t>
+      </w:r>
+      <w:r>
+        <w:t xml:space="preserve">) e aggiungerlo come eccezione a tutti i tag di misura e marketing (tag Google GA4, eventi GA4, Google Ads, altri pixel); verifica in Anteprima sullo stage e sulla produzione, poi pubblicazione.</w:t>
+      </w:r>
+      <w:r>
+        <w:t xml:space="preserve"> </w:t>
+      </w:r>
+      <w:r>
+        <w:rPr>
+          <w:rStyle w:val="VerbatimChar"/>
+        </w:rPr>
+        <w:t xml:space="preserve">ossigenopuro.anniazzurri.it</w:t>
+      </w:r>
+      <w:r>
+        <w:t xml:space="preserve"> </w:t>
+      </w:r>
+      <w:r>
+        <w:t xml:space="preserve">(minisito per gli OSS, moduli di contatto e invio CV) usa lo stesso contenitore AA ed è traffico valido: si tiene, distinto per host nelle analisi.</w:t>
       </w:r>
     </w:p>
     <w:p>
@@ -5961,10 +5743,163 @@
           <w:bCs/>
           <w:b/>
         </w:rPr>
-        <w:t xml:space="preserve">Title e description AA (voce 20, sprint 2)</w:t>
-      </w:r>
-      <w:r>
-        <w:t xml:space="preserve">: prima dell'import, controllare in Search Console la ripartizione delle query tra «RSA», «casa di riposo», «residenza per anziani» e usare i termini più cercati; testi generati o importati sempre rivisti.</w:t>
+        <w:t xml:space="preserve">[KOS]</w:t>
+      </w:r>
+      <w:r>
+        <w:rPr>
+          <w:bCs/>
+          <w:b/>
+        </w:rPr>
+        <w:t xml:space="preserve"> </w:t>
+      </w:r>
+      <w:r>
+        <w:rPr>
+          <w:rStyle w:val="VerbatimChar"/>
+          <w:bCs/>
+          <w:b/>
+        </w:rPr>
+        <w:t xml:space="preserve">7ydxba3m.modx.dev</w:t>
+      </w:r>
+      <w:r>
+        <w:rPr>
+          <w:bCs/>
+          <w:b/>
+        </w:rPr>
+        <w:t xml:space="preserve"> </w:t>
+      </w:r>
+      <w:r>
+        <w:rPr>
+          <w:bCs/>
+          <w:b/>
+        </w:rPr>
+        <w:t xml:space="preserve">= indirizzo tecnico MODX Cloud della produzione kosgroup.com</w:t>
+      </w:r>
+      <w:r>
+        <w:t xml:space="preserve">, raggiungibile e visitato dai crawler (2.089 utenti in GA4 da gennaio):</w:t>
+      </w:r>
+      <w:r>
+        <w:t xml:space="preserve"> </w:t>
+      </w:r>
+      <w:r>
+        <w:rPr>
+          <w:bCs/>
+          <w:b/>
+        </w:rPr>
+        <w:t xml:space="preserve">risolto il 24/10</w:t>
+      </w:r>
+      <w:r>
+        <w:t xml:space="preserve"> </w:t>
+      </w:r>
+      <w:r>
+        <w:t xml:space="preserve">con un 301 verso</w:t>
+      </w:r>
+      <w:r>
+        <w:t xml:space="preserve"> </w:t>
+      </w:r>
+      <w:r>
+        <w:rPr>
+          <w:rStyle w:val="VerbatimChar"/>
+        </w:rPr>
+        <w:t xml:space="preserve">https://kosgroup.com$request_uri</w:t>
+      </w:r>
+      <w:r>
+        <w:t xml:space="preserve"> </w:t>
+      </w:r>
+      <w:r>
+        <w:t xml:space="preserve">all'inizio delle regole web di produzione (in</w:t>
+      </w:r>
+      <w:r>
+        <w:t xml:space="preserve"> </w:t>
+      </w:r>
+      <w:r>
+        <w:rPr>
+          <w:rStyle w:val="VerbatimChar"/>
+        </w:rPr>
+        <w:t xml:space="preserve">kosgroup/files/web-rules/web-rules.conf</w:t>
+      </w:r>
+      <w:r>
+        <w:t xml:space="preserve">). Indirizzo tecnico AA (</w:t>
+      </w:r>
+      <w:r>
+        <w:rPr>
+          <w:rStyle w:val="VerbatimChar"/>
+        </w:rPr>
+        <w:t xml:space="preserve">z6naauhv.modx.dev</w:t>
+      </w:r>
+      <w:r>
+        <w:t xml:space="preserve">): già reindirizzato a</w:t>
+      </w:r>
+      <w:r>
+        <w:t xml:space="preserve"> </w:t>
+      </w:r>
+      <w:r>
+        <w:rPr>
+          <w:rStyle w:val="VerbatimChar"/>
+        </w:rPr>
+        <w:t xml:space="preserve">anniazzurri.it</w:t>
+      </w:r>
+      <w:r>
+        <w:t xml:space="preserve"> </w:t>
+      </w:r>
+      <w:r>
+        <w:t xml:space="preserve">dalla regola generica sugli host (verificato il 24/10). Da fare: verificare chi usa gli altri cloud di sviluppo con traffico in GA4 (</w:t>
+      </w:r>
+      <w:r>
+        <w:rPr>
+          <w:rStyle w:val="VerbatimChar"/>
+        </w:rPr>
+        <w:t xml:space="preserve">c28rmnd0</w:t>
+      </w:r>
+      <w:r>
+        <w:t xml:space="preserve">,</w:t>
+      </w:r>
+      <w:r>
+        <w:t xml:space="preserve"> </w:t>
+      </w:r>
+      <w:r>
+        <w:rPr>
+          <w:rStyle w:val="VerbatimChar"/>
+        </w:rPr>
+        <w:t xml:space="preserve">2q20ekw7</w:t>
+      </w:r>
+      <w:r>
+        <w:t xml:space="preserve">,</w:t>
+      </w:r>
+      <w:r>
+        <w:t xml:space="preserve"> </w:t>
+      </w:r>
+      <w:r>
+        <w:rPr>
+          <w:rStyle w:val="VerbatimChar"/>
+        </w:rPr>
+        <w:t xml:space="preserve">h94ms727</w:t>
+      </w:r>
+      <w:r>
+        <w:t xml:space="preserve">,</w:t>
+      </w:r>
+      <w:r>
+        <w:t xml:space="preserve"> </w:t>
+      </w:r>
+      <w:r>
+        <w:rPr>
+          <w:rStyle w:val="VerbatimChar"/>
+        </w:rPr>
+        <w:t xml:space="preserve">lussyiah</w:t>
+      </w:r>
+      <w:r>
+        <w:t xml:space="preserve">,</w:t>
+      </w:r>
+      <w:r>
+        <w:t xml:space="preserve"> </w:t>
+      </w:r>
+      <w:r>
+        <w:rPr>
+          <w:rStyle w:val="VerbatimChar"/>
+        </w:rPr>
+        <w:t xml:space="preserve">nnzdgwzr</w:t>
+      </w:r>
+      <w:r>
+        <w:t xml:space="preserve">) e proteggerli con password o spegnerli.</w:t>
       </w:r>
     </w:p>
     <w:p>
@@ -5980,117 +5915,58 @@
           <w:bCs/>
           <w:b/>
         </w:rPr>
-        <w:t xml:space="preserve">Schede struttura (sprint 2 KOS, sprint 3 AA)</w:t>
-      </w:r>
-      <w:r>
-        <w:t xml:space="preserve">: togliere lo script Yext che inietta il dato; le schede devono differire nella sostanza (servizi, nuclei, contatti), non solo nel nome.</w:t>
+        <w:t xml:space="preserve">[AA] Widget di accessibilità e chat su</w:t>
+      </w:r>
+      <w:r>
+        <w:rPr>
+          <w:bCs/>
+          <w:b/>
+        </w:rPr>
+        <w:t xml:space="preserve"> </w:t>
+      </w:r>
+      <w:r>
+        <w:rPr>
+          <w:rStyle w:val="VerbatimChar"/>
+          <w:bCs/>
+          <w:b/>
+        </w:rPr>
+        <w:t xml:space="preserve">/azzurramente</w:t>
+      </w:r>
+      <w:r>
+        <w:t xml:space="preserve"> </w:t>
+      </w:r>
+      <w:r>
+        <w:t xml:space="preserve">(solo in produzione): coprono il titolo «Cos'è AzzurraMente»; da segnalare a chi gestisce i widget.</w:t>
+      </w:r>
+    </w:p>
+    <w:bookmarkEnd w:id="28"/>
+    <w:bookmarkStart w:id="29" w:name="X898b42ef2c7e59f20211f0633f37c3831eecc50"/>
+    <w:p>
+      <w:pPr>
+        <w:pStyle w:val="Heading2"/>
+      </w:pPr>
+      <w:r>
+        <w:t xml:space="preserve">Indicazioni dalla strategia AEO/GEO (22 ottobre,</w:t>
+      </w:r>
+      <w:r>
+        <w:t xml:space="preserve"> </w:t>
+      </w:r>
+      <w:r>
+        <w:rPr>
+          <w:rStyle w:val="VerbatimChar"/>
+        </w:rPr>
+        <w:t xml:space="preserve">claude/strategia-aeo-geo.md</w:t>
+      </w:r>
+      <w:r>
+        <w:t xml:space="preserve">)</w:t>
       </w:r>
     </w:p>
     <w:p>
       <w:pPr>
-        <w:numPr>
-          <w:ilvl w:val="0"/>
-          <w:numId w:val="1008"/>
-        </w:numPr>
-        <w:pStyle w:val="Compact"/>
-      </w:pPr>
-      <w:r>
-        <w:rPr>
-          <w:bCs/>
-          <w:b/>
-        </w:rPr>
-        <w:t xml:space="preserve">Articoli (voce 10 KOS, sprint 3)</w:t>
-      </w:r>
-      <w:r>
-        <w:t xml:space="preserve">:</w:t>
-      </w:r>
-      <w:r>
-        <w:t xml:space="preserve"> </w:t>
-      </w:r>
-      <w:r>
-        <w:rPr>
-          <w:rStyle w:val="VerbatimChar"/>
-        </w:rPr>
-        <w:t xml:space="preserve">MedicalWebPage</w:t>
-      </w:r>
-      <w:r>
-        <w:t xml:space="preserve"> </w:t>
-      </w:r>
-      <w:r>
-        <w:t xml:space="preserve">con</w:t>
-      </w:r>
-      <w:r>
-        <w:t xml:space="preserve"> </w:t>
-      </w:r>
-      <w:r>
-        <w:rPr>
-          <w:rStyle w:val="VerbatimChar"/>
-        </w:rPr>
-        <w:t xml:space="preserve">lastReviewed</w:t>
-      </w:r>
-      <w:r>
-        <w:t xml:space="preserve">/</w:t>
-      </w:r>
-      <w:r>
-        <w:rPr>
-          <w:rStyle w:val="VerbatimChar"/>
-        </w:rPr>
-        <w:t xml:space="preserve">reviewedBy</w:t>
-      </w:r>
-      <w:r>
-        <w:t xml:space="preserve"> </w:t>
-      </w:r>
-      <w:r>
-        <w:t xml:space="preserve">solo dove c'è un revisore reale; autore = ente finché KOS non ha firme; data visibile coerente con</w:t>
-      </w:r>
-      <w:r>
-        <w:t xml:space="preserve"> </w:t>
-      </w:r>
-      <w:r>
-        <w:rPr>
-          <w:rStyle w:val="VerbatimChar"/>
-        </w:rPr>
-        <w:t xml:space="preserve">dateModified</w:t>
-      </w:r>
-      <w:r>
-        <w:t xml:space="preserve">.</w:t>
-      </w:r>
-    </w:p>
-    <w:p>
-      <w:pPr>
-        <w:numPr>
-          <w:ilvl w:val="0"/>
-          <w:numId w:val="1008"/>
-        </w:numPr>
-        <w:pStyle w:val="Compact"/>
-      </w:pPr>
-      <w:r>
-        <w:rPr>
-          <w:bCs/>
-          <w:b/>
-        </w:rPr>
-        <w:t xml:space="preserve">FAQ</w:t>
-      </w:r>
-      <w:r>
-        <w:t xml:space="preserve">: il risultato FAQ di Google non è più mostrato (maggio 2026): FAQ come testo visibile, markup facoltativo.</w:t>
-      </w:r>
-    </w:p>
-    <w:p>
-      <w:pPr>
         <w:pStyle w:val="FirstParagraph"/>
       </w:pPr>
       <w:r>
-        <w:t xml:space="preserve">Fuori perimetro, da proporre (non nei documenti condivisi): baseline di misura entro fine novembre (Search Console, Bing AI Performance, canale AI in GA4, set di prompt ripetuti), IndexNow alla pubblicazione, domanda «come ci ha conosciuto?» nei moduli, profili Google dopo RetailTune (vedi analisi del documento PWC Local del 22/10: niente parole chiave nei nomi; test di categoria su un campione; programma recensioni).</w:t>
-      </w:r>
-    </w:p>
-    <w:bookmarkEnd w:id="29"/>
-    <w:bookmarkStart w:id="30" w:name="X6106934d94086303083d981b094913fadf78d77"/>
-    <w:p>
-      <w:pPr>
-        <w:pStyle w:val="Heading2"/>
-      </w:pPr>
-      <w:r>
-        <w:t xml:space="preserve">Preparazione per lo sprint 2 (da avviare nella settimana del 26)</w:t>
+        <w:t xml:space="preserve">Dentro il perimetro, da applicare negli sprint:</w:t>
       </w:r>
     </w:p>
     <w:p>
@@ -6102,7 +5978,41 @@
         <w:pStyle w:val="Compact"/>
       </w:pPr>
       <w:r>
-        <w:t xml:space="preserve">Script di import dei dati anagrafici dall'export Yext corretto nelle TV dei due siti (import 2-6 novembre), con report delle differenze su KOS.</w:t>
+        <w:rPr>
+          <w:bCs/>
+          <w:b/>
+        </w:rPr>
+        <w:t xml:space="preserve">Tipo delle residenze</w:t>
+      </w:r>
+      <w:r>
+        <w:t xml:space="preserve">:</w:t>
+      </w:r>
+      <w:r>
+        <w:t xml:space="preserve"> </w:t>
+      </w:r>
+      <w:r>
+        <w:rPr>
+          <w:rStyle w:val="VerbatimChar"/>
+        </w:rPr>
+        <w:t xml:space="preserve">NursingHome</w:t>
+      </w:r>
+      <w:r>
+        <w:t xml:space="preserve"> </w:t>
+      </w:r>
+      <w:r>
+        <w:t xml:space="preserve">non esiste su schema.org (verificato su 30.1); convenzione corretta il 22/10. Decidere con l'agenzia prima dello sprint 3 (proposta</w:t>
+      </w:r>
+      <w:r>
+        <w:t xml:space="preserve"> </w:t>
+      </w:r>
+      <w:r>
+        <w:rPr>
+          <w:rStyle w:val="VerbatimChar"/>
+        </w:rPr>
+        <w:t xml:space="preserve">["MedicalOrganization", "LocalBusiness"]</w:t>
+      </w:r>
+      <w:r>
+        <w:t xml:space="preserve">).</w:t>
       </w:r>
     </w:p>
     <w:p>
@@ -6114,7 +6024,59 @@
         <w:pStyle w:val="Compact"/>
       </w:pPr>
       <w:r>
-        <w:t xml:space="preserve">Creazione delle TV anagrafiche su AA.</w:t>
+        <w:rPr>
+          <w:bCs/>
+          <w:b/>
+        </w:rPr>
+        <w:t xml:space="preserve">Medici KOS (voce 11, sprint 3)</w:t>
+      </w:r>
+      <w:r>
+        <w:t xml:space="preserve">:</w:t>
+      </w:r>
+      <w:r>
+        <w:t xml:space="preserve"> </w:t>
+      </w:r>
+      <w:r>
+        <w:rPr>
+          <w:rStyle w:val="VerbatimChar"/>
+        </w:rPr>
+        <w:t xml:space="preserve">IndividualPhysician</w:t>
+      </w:r>
+      <w:r>
+        <w:t xml:space="preserve"> </w:t>
+      </w:r>
+      <w:r>
+        <w:t xml:space="preserve">con</w:t>
+      </w:r>
+      <w:r>
+        <w:t xml:space="preserve"> </w:t>
+      </w:r>
+      <w:r>
+        <w:rPr>
+          <w:rStyle w:val="VerbatimChar"/>
+        </w:rPr>
+        <w:t xml:space="preserve">practicesAt</w:t>
+      </w:r>
+      <w:r>
+        <w:t xml:space="preserve"> </w:t>
+      </w:r>
+      <w:r>
+        <w:t xml:space="preserve">verso il</w:t>
+      </w:r>
+      <w:r>
+        <w:t xml:space="preserve"> </w:t>
+      </w:r>
+      <w:r>
+        <w:rPr>
+          <w:rStyle w:val="VerbatimChar"/>
+        </w:rPr>
+        <w:t xml:space="preserve">#localbusiness</w:t>
+      </w:r>
+      <w:r>
+        <w:t xml:space="preserve"> </w:t>
+      </w:r>
+      <w:r>
+        <w:t xml:space="preserve">della struttura.</w:t>
       </w:r>
     </w:p>
     <w:p>
@@ -6130,25 +6092,37 @@
           <w:bCs/>
           <w:b/>
         </w:rPr>
-        <w:t xml:space="preserve">[AA] Title e description (20) e H2 (6), sprint 2</w:t>
-      </w:r>
-      <w:r>
-        <w:t xml:space="preserve">: fonte dei testi</w:t>
-      </w:r>
-      <w:r>
-        <w:t xml:space="preserve"> </w:t>
-      </w:r>
-      <w:r>
-        <w:rPr>
-          <w:rStyle w:val="VerbatimChar"/>
-        </w:rPr>
-        <w:t xml:space="preserve">202607_PWC_AnniAzzurri_Ottimizzazioni_Meta_Tag_v2_Ant.xlsx</w:t>
-      </w:r>
-      <w:r>
-        <w:t xml:space="preserve"> </w:t>
-      </w:r>
-      <w:r>
-        <w:t xml:space="preserve">(stato al 7/7/2026): 88 URL (22 regioni e province, 58 residenze, 8 pagine editoriali) con title, H1 e description attuali e suggeriti. Decisione di luglio: H1 suggeriti non applicati (nomi coerenti con GBP; H1 solo dove mancavano, fatto nello sprint 1); title e description importati con script. Da verificare prima: che sia la versione validata richiesta nel calendario, 6 title suggeriti oltre 65 caratteri, pagine cambiate dopo luglio; le pagine dell'audit fuori dagli 88 URL (title/description lunghi, mancanti, duplicati) vanno coperte a parte. Su alcuni articoli il title attuale ripete «| Anni Azzurri | Anni Azzurri»: probabile suffisso aggiunto dal template a un longtitle che lo contiene già, da correggere nel template.</w:t>
+        <w:t xml:space="preserve">Collaudo di ogni sprint</w:t>
+      </w:r>
+      <w:r>
+        <w:t xml:space="preserve">: controllare anche la pagina servita senza consenso Cookiebot (testi, contatti, dato strutturato presenti); un solo</w:t>
+      </w:r>
+      <w:r>
+        <w:t xml:space="preserve"> </w:t>
+      </w:r>
+      <w:r>
+        <w:rPr>
+          <w:rStyle w:val="VerbatimChar"/>
+        </w:rPr>
+        <w:t xml:space="preserve">@graph</w:t>
+      </w:r>
+      <w:r>
+        <w:t xml:space="preserve"> </w:t>
+      </w:r>
+      <w:r>
+        <w:t xml:space="preserve">valido, H1, canonical, sitemap su un campione per template (estendere</w:t>
+      </w:r>
+      <w:r>
+        <w:t xml:space="preserve"> </w:t>
+      </w:r>
+      <w:r>
+        <w:rPr>
+          <w:rStyle w:val="VerbatimChar"/>
+        </w:rPr>
+        <w:t xml:space="preserve">verifica-rilascio-*.ps1</w:t>
+      </w:r>
+      <w:r>
+        <w:t xml:space="preserve">).</w:t>
       </w:r>
     </w:p>
     <w:p>
@@ -6164,58 +6138,10 @@
           <w:bCs/>
           <w:b/>
         </w:rPr>
-        <w:t xml:space="preserve">Segreti scritti nel codice</w:t>
-      </w:r>
-      <w:r>
-        <w:t xml:space="preserve"> </w:t>
-      </w:r>
-      <w:r>
-        <w:t xml:space="preserve">(emersi dalla baseline del 19 ottobre, sostituiti con segnaposto nel repository): chiave YouTube Data API in</w:t>
-      </w:r>
-      <w:r>
-        <w:t xml:space="preserve"> </w:t>
-      </w:r>
-      <w:r>
-        <w:rPr>
-          <w:rStyle w:val="VerbatimChar"/>
-        </w:rPr>
-        <w:t xml:space="preserve">syncYoutubeVideos</w:t>
-      </w:r>
-      <w:r>
-        <w:t xml:space="preserve"> </w:t>
-      </w:r>
-      <w:r>
-        <w:t xml:space="preserve">e token Arca24 in</w:t>
-      </w:r>
-      <w:r>
-        <w:t xml:space="preserve"> </w:t>
-      </w:r>
-      <w:r>
-        <w:rPr>
-          <w:rStyle w:val="VerbatimChar"/>
-        </w:rPr>
-        <w:t xml:space="preserve">arca24Import</w:t>
-      </w:r>
-      <w:r>
-        <w:t xml:space="preserve"> </w:t>
-      </w:r>
-      <w:r>
-        <w:t xml:space="preserve">(KOS), chiave di cifratura in</w:t>
-      </w:r>
-      <w:r>
-        <w:t xml:space="preserve"> </w:t>
-      </w:r>
-      <w:r>
-        <w:rPr>
-          <w:rStyle w:val="VerbatimChar"/>
-        </w:rPr>
-        <w:t xml:space="preserve">countContact</w:t>
-      </w:r>
-      <w:r>
-        <w:t xml:space="preserve"> </w:t>
-      </w:r>
-      <w:r>
-        <w:t xml:space="preserve">(AA). Quando questi snippet diventano statici, i valori vanno spostati in impostazioni di sistema; valutare con KOS la rigenerazione della chiave YouTube.</w:t>
+        <w:t xml:space="preserve">Title e description AA (voce 20, sprint 2)</w:t>
+      </w:r>
+      <w:r>
+        <w:t xml:space="preserve">: prima dell'import, controllare in Search Console la ripartizione delle query tra «RSA», «casa di riposo», «residenza per anziani» e usare i termini più cercati; testi generati o importati sempre rivisti.</w:t>
       </w:r>
     </w:p>
     <w:p>
@@ -6223,6 +6149,257 @@
         <w:numPr>
           <w:ilvl w:val="0"/>
           <w:numId w:val="1009"/>
+        </w:numPr>
+        <w:pStyle w:val="Compact"/>
+      </w:pPr>
+      <w:r>
+        <w:rPr>
+          <w:bCs/>
+          <w:b/>
+        </w:rPr>
+        <w:t xml:space="preserve">Schede struttura (sprint 2 KOS, sprint 3 AA)</w:t>
+      </w:r>
+      <w:r>
+        <w:t xml:space="preserve">: togliere lo script Yext che inietta il dato; le schede devono differire nella sostanza (servizi, nuclei, contatti), non solo nel nome.</w:t>
+      </w:r>
+    </w:p>
+    <w:p>
+      <w:pPr>
+        <w:numPr>
+          <w:ilvl w:val="0"/>
+          <w:numId w:val="1009"/>
+        </w:numPr>
+        <w:pStyle w:val="Compact"/>
+      </w:pPr>
+      <w:r>
+        <w:rPr>
+          <w:bCs/>
+          <w:b/>
+        </w:rPr>
+        <w:t xml:space="preserve">Articoli (voce 10 KOS, sprint 3)</w:t>
+      </w:r>
+      <w:r>
+        <w:t xml:space="preserve">:</w:t>
+      </w:r>
+      <w:r>
+        <w:t xml:space="preserve"> </w:t>
+      </w:r>
+      <w:r>
+        <w:rPr>
+          <w:rStyle w:val="VerbatimChar"/>
+        </w:rPr>
+        <w:t xml:space="preserve">MedicalWebPage</w:t>
+      </w:r>
+      <w:r>
+        <w:t xml:space="preserve"> </w:t>
+      </w:r>
+      <w:r>
+        <w:t xml:space="preserve">con</w:t>
+      </w:r>
+      <w:r>
+        <w:t xml:space="preserve"> </w:t>
+      </w:r>
+      <w:r>
+        <w:rPr>
+          <w:rStyle w:val="VerbatimChar"/>
+        </w:rPr>
+        <w:t xml:space="preserve">lastReviewed</w:t>
+      </w:r>
+      <w:r>
+        <w:t xml:space="preserve">/</w:t>
+      </w:r>
+      <w:r>
+        <w:rPr>
+          <w:rStyle w:val="VerbatimChar"/>
+        </w:rPr>
+        <w:t xml:space="preserve">reviewedBy</w:t>
+      </w:r>
+      <w:r>
+        <w:t xml:space="preserve"> </w:t>
+      </w:r>
+      <w:r>
+        <w:t xml:space="preserve">solo dove c'è un revisore reale; autore = ente finché KOS non ha firme; data visibile coerente con</w:t>
+      </w:r>
+      <w:r>
+        <w:t xml:space="preserve"> </w:t>
+      </w:r>
+      <w:r>
+        <w:rPr>
+          <w:rStyle w:val="VerbatimChar"/>
+        </w:rPr>
+        <w:t xml:space="preserve">dateModified</w:t>
+      </w:r>
+      <w:r>
+        <w:t xml:space="preserve">.</w:t>
+      </w:r>
+    </w:p>
+    <w:p>
+      <w:pPr>
+        <w:numPr>
+          <w:ilvl w:val="0"/>
+          <w:numId w:val="1009"/>
+        </w:numPr>
+        <w:pStyle w:val="Compact"/>
+      </w:pPr>
+      <w:r>
+        <w:rPr>
+          <w:bCs/>
+          <w:b/>
+        </w:rPr>
+        <w:t xml:space="preserve">FAQ</w:t>
+      </w:r>
+      <w:r>
+        <w:t xml:space="preserve">: il risultato FAQ di Google non è più mostrato (maggio 2026): FAQ come testo visibile, markup facoltativo.</w:t>
+      </w:r>
+    </w:p>
+    <w:p>
+      <w:pPr>
+        <w:pStyle w:val="FirstParagraph"/>
+      </w:pPr>
+      <w:r>
+        <w:t xml:space="preserve">Fuori perimetro, da proporre (non nei documenti condivisi): baseline di misura entro fine novembre (Search Console, Bing AI Performance, canale AI in GA4, set di prompt ripetuti), IndexNow alla pubblicazione, domanda «come ci ha conosciuto?» nei moduli, profili Google dopo RetailTune (vedi analisi del documento PWC Local del 22/10: niente parole chiave nei nomi; test di categoria su un campione; programma recensioni).</w:t>
+      </w:r>
+    </w:p>
+    <w:bookmarkEnd w:id="29"/>
+    <w:bookmarkStart w:id="30" w:name="X6106934d94086303083d981b094913fadf78d77"/>
+    <w:p>
+      <w:pPr>
+        <w:pStyle w:val="Heading2"/>
+      </w:pPr>
+      <w:r>
+        <w:t xml:space="preserve">Preparazione per lo sprint 2 (da avviare nella settimana del 26)</w:t>
+      </w:r>
+    </w:p>
+    <w:p>
+      <w:pPr>
+        <w:numPr>
+          <w:ilvl w:val="0"/>
+          <w:numId w:val="1010"/>
+        </w:numPr>
+        <w:pStyle w:val="Compact"/>
+      </w:pPr>
+      <w:r>
+        <w:t xml:space="preserve">Script di import dei dati anagrafici dall'export Yext corretto nelle TV dei due siti (import 2-6 novembre), con report delle differenze su KOS.</w:t>
+      </w:r>
+    </w:p>
+    <w:p>
+      <w:pPr>
+        <w:numPr>
+          <w:ilvl w:val="0"/>
+          <w:numId w:val="1010"/>
+        </w:numPr>
+        <w:pStyle w:val="Compact"/>
+      </w:pPr>
+      <w:r>
+        <w:t xml:space="preserve">Creazione delle TV anagrafiche su AA.</w:t>
+      </w:r>
+    </w:p>
+    <w:p>
+      <w:pPr>
+        <w:numPr>
+          <w:ilvl w:val="0"/>
+          <w:numId w:val="1010"/>
+        </w:numPr>
+        <w:pStyle w:val="Compact"/>
+      </w:pPr>
+      <w:r>
+        <w:rPr>
+          <w:bCs/>
+          <w:b/>
+        </w:rPr>
+        <w:t xml:space="preserve">[AA] Title e description (20) e H2 (6), sprint 2</w:t>
+      </w:r>
+      <w:r>
+        <w:t xml:space="preserve">: fonte dei testi</w:t>
+      </w:r>
+      <w:r>
+        <w:t xml:space="preserve"> </w:t>
+      </w:r>
+      <w:r>
+        <w:rPr>
+          <w:rStyle w:val="VerbatimChar"/>
+        </w:rPr>
+        <w:t xml:space="preserve">202607_PWC_AnniAzzurri_Ottimizzazioni_Meta_Tag_v2_Ant.xlsx</w:t>
+      </w:r>
+      <w:r>
+        <w:t xml:space="preserve"> </w:t>
+      </w:r>
+      <w:r>
+        <w:t xml:space="preserve">(stato al 7/7/2026): 88 URL (22 regioni e province, 58 residenze, 8 pagine editoriali) con title, H1 e description attuali e suggeriti. Decisione di luglio: H1 suggeriti non applicati (nomi coerenti con GBP; H1 solo dove mancavano, fatto nello sprint 1); title e description importati con script. Da verificare prima: che sia la versione validata richiesta nel calendario, 6 title suggeriti oltre 65 caratteri, pagine cambiate dopo luglio; le pagine dell'audit fuori dagli 88 URL (title/description lunghi, mancanti, duplicati) vanno coperte a parte. Su alcuni articoli il title attuale ripete «| Anni Azzurri | Anni Azzurri»: probabile suffisso aggiunto dal template a un longtitle che lo contiene già, da correggere nel template.</w:t>
+      </w:r>
+    </w:p>
+    <w:p>
+      <w:pPr>
+        <w:numPr>
+          <w:ilvl w:val="0"/>
+          <w:numId w:val="1010"/>
+        </w:numPr>
+        <w:pStyle w:val="Compact"/>
+      </w:pPr>
+      <w:r>
+        <w:rPr>
+          <w:bCs/>
+          <w:b/>
+        </w:rPr>
+        <w:t xml:space="preserve">Segreti scritti nel codice</w:t>
+      </w:r>
+      <w:r>
+        <w:t xml:space="preserve"> </w:t>
+      </w:r>
+      <w:r>
+        <w:t xml:space="preserve">(emersi dalla baseline del 19 ottobre, sostituiti con segnaposto nel repository): chiave YouTube Data API in</w:t>
+      </w:r>
+      <w:r>
+        <w:t xml:space="preserve"> </w:t>
+      </w:r>
+      <w:r>
+        <w:rPr>
+          <w:rStyle w:val="VerbatimChar"/>
+        </w:rPr>
+        <w:t xml:space="preserve">syncYoutubeVideos</w:t>
+      </w:r>
+      <w:r>
+        <w:t xml:space="preserve"> </w:t>
+      </w:r>
+      <w:r>
+        <w:t xml:space="preserve">e token Arca24 in</w:t>
+      </w:r>
+      <w:r>
+        <w:t xml:space="preserve"> </w:t>
+      </w:r>
+      <w:r>
+        <w:rPr>
+          <w:rStyle w:val="VerbatimChar"/>
+        </w:rPr>
+        <w:t xml:space="preserve">arca24Import</w:t>
+      </w:r>
+      <w:r>
+        <w:t xml:space="preserve"> </w:t>
+      </w:r>
+      <w:r>
+        <w:t xml:space="preserve">(KOS), chiave di cifratura in</w:t>
+      </w:r>
+      <w:r>
+        <w:t xml:space="preserve"> </w:t>
+      </w:r>
+      <w:r>
+        <w:rPr>
+          <w:rStyle w:val="VerbatimChar"/>
+        </w:rPr>
+        <w:t xml:space="preserve">countContact</w:t>
+      </w:r>
+      <w:r>
+        <w:t xml:space="preserve"> </w:t>
+      </w:r>
+      <w:r>
+        <w:t xml:space="preserve">(AA). Quando questi snippet diventano statici, i valori vanno spostati in impostazioni di sistema; valutare con KOS la rigenerazione della chiave YouTube.</w:t>
+      </w:r>
+    </w:p>
+    <w:p>
+      <w:pPr>
+        <w:numPr>
+          <w:ilvl w:val="0"/>
+          <w:numId w:val="1010"/>
         </w:numPr>
         <w:pStyle w:val="Compact"/>
       </w:pPr>
@@ -6802,6 +6979,9 @@
     <w:abstractNumId w:val="991"/>
   </w:num>
   <w:num w:numId="1009">
+    <w:abstractNumId w:val="991"/>
+  </w:num>
+  <w:num w:numId="1010">
     <w:abstractNumId w:val="991"/>
   </w:num>
 </w:numbering>

</xml_diff>

<commit_message>
Piano: fonte e metodo per title, description e H1 (AA-20, KOS 21-23)
Co-Authored-By: Claude Opus 5.5 <noreply@anthropic.com>
Claude-Session: https://claude.ai/code/session_01Rr1X44gsg7BUwMzrRvYrc2
</commit_message>
<xml_diff>
--- a/docs/docx/piano-sprint-1.docx
+++ b/docs/docx/piano-sprint-1.docx
@@ -2,7 +2,7 @@
 <file path=word/document.xml><?xml version="1.0" encoding="utf-8"?>
 <w:document xmlns:w="http://schemas.openxmlformats.org/wordprocessingml/2006/main" xmlns:m="http://schemas.openxmlformats.org/officeDocument/2006/math" xmlns:r="http://schemas.openxmlformats.org/officeDocument/2006/relationships" xmlns:o="urn:schemas-microsoft-com:office:office" xmlns:v="urn:schemas-microsoft-com:vml" xmlns:w10="urn:schemas-microsoft-com:office:word" xmlns:a="http://schemas.openxmlformats.org/drawingml/2006/main" xmlns:pic="http://schemas.openxmlformats.org/drawingml/2006/picture" xmlns:wp="http://schemas.openxmlformats.org/drawingml/2006/wordprocessingDrawing">
   <w:body>
-    <w:bookmarkStart w:id="31" w:name="Xff2d8b895f42074f3d940c259894f313a91b2c2"/>
+    <w:bookmarkStart w:id="32" w:name="Xff2d8b895f42074f3d940c259894f313a91b2c2"/>
     <w:p>
       <w:pPr>
         <w:pStyle w:val="Heading1"/>
@@ -4992,7 +4992,185 @@
       </w:r>
     </w:p>
     <w:bookmarkEnd w:id="26"/>
-    <w:bookmarkStart w:id="27" w:name="Xaa16755a13975bb21ff40475055306adf18ab77"/>
+    <w:bookmarkStart w:id="27" w:name="Xa87a4810e3d85a3a3b4600dd4c4af9e61d56717"/>
+    <w:p>
+      <w:pPr>
+        <w:pStyle w:val="Heading2"/>
+      </w:pPr>
+      <w:r>
+        <w:t xml:space="preserve">Title, description e H1 (AA-20, KOS 21-23, sprint 2) — deciso il 27/10</w:t>
+      </w:r>
+    </w:p>
+    <w:p>
+      <w:pPr>
+        <w:pStyle w:val="FirstParagraph"/>
+      </w:pPr>
+      <w:r>
+        <w:t xml:space="preserve">Fonte dei testi: i fogli dell'agenzia. AA:</w:t>
+      </w:r>
+      <w:r>
+        <w:t xml:space="preserve"> </w:t>
+      </w:r>
+      <w:r>
+        <w:rPr>
+          <w:rStyle w:val="VerbatimChar"/>
+        </w:rPr>
+        <w:t xml:space="preserve">202607_PWC_AnniAzzurri_Ottimizzazioni_Meta_Tag_v2_Ant.xlsx</w:t>
+      </w:r>
+      <w:r>
+        <w:t xml:space="preserve"> </w:t>
+      </w:r>
+      <w:r>
+        <w:t xml:space="preserve">(88 URL con</w:t>
+      </w:r>
+      <w:r>
+        <w:t xml:space="preserve"> </w:t>
+      </w:r>
+      <w:r>
+        <w:t xml:space="preserve">title e description suggeriti; H1 suggeriti non applicati, decisione di luglio). Incongruenze e migliorie si segnalano e</w:t>
+      </w:r>
+      <w:r>
+        <w:t xml:space="preserve"> </w:t>
+      </w:r>
+      <w:r>
+        <w:t xml:space="preserve">si discutono, non si applicano di nostra iniziativa. Per le voci degli audit senza testo proposto (AA: circa 100 pagine,</w:t>
+      </w:r>
+      <w:r>
+        <w:t xml:space="preserve"> </w:t>
+      </w:r>
+      <w:r>
+        <w:t xml:space="preserve">soprattutto articoli, segnalate nell'audit di aprile ma fuori dagli 88 URL; KOS: 78 title, 301 description, 20 H1 del</w:t>
+      </w:r>
+      <w:r>
+        <w:t xml:space="preserve"> </w:t>
+      </w:r>
+      <w:r>
+        <w:t xml:space="preserve">dettaglio di settembre, che non contiene testi suggeriti) prepariamo noi una</w:t>
+      </w:r>
+      <w:r>
+        <w:t xml:space="preserve"> </w:t>
+      </w:r>
+      <w:r>
+        <w:rPr>
+          <w:bCs/>
+          <w:b/>
+        </w:rPr>
+        <w:t xml:space="preserve">proposta da validare</w:t>
+      </w:r>
+      <w:r>
+        <w:t xml:space="preserve"> </w:t>
+      </w:r>
+      <w:r>
+        <w:t xml:space="preserve">con regole</w:t>
+      </w:r>
+      <w:r>
+        <w:t xml:space="preserve"> </w:t>
+      </w:r>
+      <w:r>
+        <w:t xml:space="preserve">semplici (accorciare il testo esistente, aggiungere il nome della pagina o della struttura dove manca, distinguere i</w:t>
+      </w:r>
+      <w:r>
+        <w:t xml:space="preserve"> </w:t>
+      </w:r>
+      <w:r>
+        <w:t xml:space="preserve">duplicati), da mandare all'agenzia con una data di validazione. Prima: stato attuale degli URL degli audit</w:t>
+      </w:r>
+      <w:r>
+        <w:t xml:space="preserve"> </w:t>
+      </w:r>
+      <w:r>
+        <w:t xml:space="preserve">(</w:t>
+      </w:r>
+      <w:r>
+        <w:rPr>
+          <w:rStyle w:val="VerbatimChar"/>
+        </w:rPr>
+        <w:t xml:space="preserve">scripts/checks/meta-stato.php</w:t>
+      </w:r>
+      <w:r>
+        <w:t xml:space="preserve">, elenchi in</w:t>
+      </w:r>
+      <w:r>
+        <w:t xml:space="preserve"> </w:t>
+      </w:r>
+      <w:r>
+        <w:rPr>
+          <w:rStyle w:val="VerbatimChar"/>
+        </w:rPr>
+        <w:t xml:space="preserve">anniazzurri/dati/aa-20/</w:t>
+      </w:r>
+      <w:r>
+        <w:t xml:space="preserve"> </w:t>
+      </w:r>
+      <w:r>
+        <w:t xml:space="preserve">e</w:t>
+      </w:r>
+      <w:r>
+        <w:t xml:space="preserve"> </w:t>
+      </w:r>
+      <w:r>
+        <w:rPr>
+          <w:rStyle w:val="VerbatimChar"/>
+        </w:rPr>
+        <w:t xml:space="preserve">kosgroup/dati/kos-21-23/</w:t>
+      </w:r>
+      <w:r>
+        <w:t xml:space="preserve">) per separare le voci</w:t>
+      </w:r>
+      <w:r>
+        <w:t xml:space="preserve"> </w:t>
+      </w:r>
+      <w:r>
+        <w:t xml:space="preserve">già risolte (evidenza per la nota di consegna) e quelle che dipendono dal template (suffissi doppi), da correggere senza</w:t>
+      </w:r>
+      <w:r>
+        <w:t xml:space="preserve"> </w:t>
+      </w:r>
+      <w:r>
+        <w:t xml:space="preserve">toccare i testi; dati di Search Console degli ultimi 16 mesi in BigQuery (</w:t>
+      </w:r>
+      <w:r>
+        <w:rPr>
+          <w:rStyle w:val="VerbatimChar"/>
+        </w:rPr>
+        <w:t xml:space="preserve">searchconsole_aa</w:t>
+      </w:r>
+      <w:r>
+        <w:t xml:space="preserve">,</w:t>
+      </w:r>
+      <w:r>
+        <w:t xml:space="preserve"> </w:t>
+      </w:r>
+      <w:r>
+        <w:rPr>
+          <w:rStyle w:val="VerbatimChar"/>
+        </w:rPr>
+        <w:t xml:space="preserve">searchconsole_kos</w:t>
+      </w:r>
+      <w:r>
+        <w:t xml:space="preserve">,</w:t>
+      </w:r>
+      <w:r>
+        <w:t xml:space="preserve"> </w:t>
+      </w:r>
+      <w:r>
+        <w:t xml:space="preserve">scaricati il 27/10 con</w:t>
+      </w:r>
+      <w:r>
+        <w:t xml:space="preserve"> </w:t>
+      </w:r>
+      <w:r>
+        <w:rPr>
+          <w:rStyle w:val="VerbatimChar"/>
+        </w:rPr>
+        <w:t xml:space="preserve">scripts/gsc/storico-search-console.py</w:t>
+      </w:r>
+      <w:r>
+        <w:t xml:space="preserve">) come riscontro per le segnalazioni.</w:t>
+      </w:r>
+    </w:p>
+    <w:bookmarkEnd w:id="27"/>
+    <w:bookmarkStart w:id="28" w:name="Xaa16755a13975bb21ff40475055306adf18ab77"/>
     <w:p>
       <w:pPr>
         <w:pStyle w:val="Heading2"/>
@@ -5368,8 +5546,8 @@
         <w:t xml:space="preserve">chiedere subito a Yext il costo di una proroga di 1-2 mesi per la sola ricerca, da usare solo se serve.</w:t>
       </w:r>
     </w:p>
-    <w:bookmarkEnd w:id="27"/>
-    <w:bookmarkStart w:id="28" w:name="Xccbd241b55281545db5ae3150331824f0f75f18"/>
+    <w:bookmarkEnd w:id="28"/>
+    <w:bookmarkStart w:id="29" w:name="Xccbd241b55281545db5ae3150331824f0f75f18"/>
     <w:p>
       <w:pPr>
         <w:pStyle w:val="Heading2"/>
@@ -5939,8 +6117,8 @@
         <w:t xml:space="preserve">(solo in produzione): coprono il titolo «Cos'è AzzurraMente»; da segnalare a chi gestisce i widget.</w:t>
       </w:r>
     </w:p>
-    <w:bookmarkEnd w:id="28"/>
-    <w:bookmarkStart w:id="29" w:name="X898b42ef2c7e59f20211f0633f37c3831eecc50"/>
+    <w:bookmarkEnd w:id="29"/>
+    <w:bookmarkStart w:id="30" w:name="X898b42ef2c7e59f20211f0633f37c3831eecc50"/>
     <w:p>
       <w:pPr>
         <w:pStyle w:val="Heading2"/>
@@ -6260,8 +6438,8 @@
         <w:t xml:space="preserve">Fuori perimetro, da proporre (non nei documenti condivisi): baseline di misura entro fine novembre (Search Console, Bing AI Performance, canale AI in GA4, set di prompt ripetuti), IndexNow alla pubblicazione, domanda «come ci ha conosciuto?» nei moduli, profili Google dopo RetailTune (vedi analisi del documento PWC Local del 22/10: niente parole chiave nei nomi; test di categoria su un campione; programma recensioni).</w:t>
       </w:r>
     </w:p>
-    <w:bookmarkEnd w:id="29"/>
-    <w:bookmarkStart w:id="30" w:name="X6106934d94086303083d981b094913fadf78d77"/>
+    <w:bookmarkEnd w:id="30"/>
+    <w:bookmarkStart w:id="31" w:name="X6106934d94086303083d981b094913fadf78d77"/>
     <w:p>
       <w:pPr>
         <w:pStyle w:val="Heading2"/>
@@ -6431,8 +6609,8 @@
         <w:t xml:space="preserve">, redirect cartelle documenti (KOS); immagini e PDF mancanti (AA).</w:t>
       </w:r>
     </w:p>
-    <w:bookmarkEnd w:id="30"/>
     <w:bookmarkEnd w:id="31"/>
+    <w:bookmarkEnd w:id="32"/>
     <w:sectPr/>
   </w:body>
 </w:document>

</xml_diff>

<commit_message>
Piano: storico di Search Console in BigQuery (27/10)
Co-Authored-By: Claude Opus 5.5 <noreply@anthropic.com>
Claude-Session: https://claude.ai/code/session_01Rr1X44gsg7BUwMzrRvYrc2
</commit_message>
<xml_diff>
--- a/docs/docx/piano-sprint-1.docx
+++ b/docs/docx/piano-sprint-1.docx
@@ -4110,7 +4110,7 @@
               <w:t xml:space="preserve">searchconsole_kos</w:t>
             </w:r>
             <w:r>
-              <w:t xml:space="preserve">). Lo storico via API (</w:t>
+              <w:t xml:space="preserve">). Storico scaricato via API il 27/10 (</w:t>
             </w:r>
             <w:r>
               <w:rPr>
@@ -4119,7 +4119,70 @@
               <w:t xml:space="preserve">scripts/gsc/storico-search-console.py</w:t>
             </w:r>
             <w:r>
-              <w:t xml:space="preserve">) non serve, resta come ripiego</w:t>
+              <w:t xml:space="preserve">, client OAuth del progetto, API Search Console abilitata):</w:t>
+            </w:r>
+            <w:r>
+              <w:t xml:space="preserve"> </w:t>
+            </w:r>
+            <w:r>
+              <w:rPr>
+                <w:rStyle w:val="VerbatimChar"/>
+              </w:rPr>
+              <w:t xml:space="preserve">searchconsole_aa</w:t>
+            </w:r>
+            <w:r>
+              <w:t xml:space="preserve"> </w:t>
+            </w:r>
+            <w:r>
+              <w:t xml:space="preserve">e</w:t>
+            </w:r>
+            <w:r>
+              <w:t xml:space="preserve"> </w:t>
+            </w:r>
+            <w:r>
+              <w:rPr>
+                <w:rStyle w:val="VerbatimChar"/>
+              </w:rPr>
+              <w:t xml:space="preserve">searchconsole_kos</w:t>
+            </w:r>
+            <w:r>
+              <w:t xml:space="preserve">, 14/6/2025-23/10/2026 (497 giorni; tabelle</w:t>
+            </w:r>
+            <w:r>
+              <w:t xml:space="preserve"> </w:t>
+            </w:r>
+            <w:r>
+              <w:rPr>
+                <w:rStyle w:val="VerbatimChar"/>
+              </w:rPr>
+              <w:t xml:space="preserve">storico_site_totali</w:t>
+            </w:r>
+            <w:r>
+              <w:t xml:space="preserve">,</w:t>
+            </w:r>
+            <w:r>
+              <w:t xml:space="preserve"> </w:t>
+            </w:r>
+            <w:r>
+              <w:rPr>
+                <w:rStyle w:val="VerbatimChar"/>
+              </w:rPr>
+              <w:t xml:space="preserve">storico_site_impression</w:t>
+            </w:r>
+            <w:r>
+              <w:t xml:space="preserve">,</w:t>
+            </w:r>
+            <w:r>
+              <w:t xml:space="preserve"> </w:t>
+            </w:r>
+            <w:r>
+              <w:rPr>
+                <w:rStyle w:val="VerbatimChar"/>
+              </w:rPr>
+              <w:t xml:space="preserve">storico_url_impression</w:t>
+            </w:r>
+            <w:r>
+              <w:t xml:space="preserve">). L'accesso ai dataset dell'agenzia serve per i giorni dal 24/10 in poi</w:t>
             </w:r>
           </w:p>
         </w:tc>

</xml_diff>

<commit_message>
KOS-2 misura LCP completa del 27/10 e piano A/B/C nel piano sprint
Co-Authored-By: Claude Opus 5.5 <noreply@anthropic.com>
Claude-Session: https://claude.ai/code/session_01Rr1X44gsg7BUwMzrRvYrc2
</commit_message>
<xml_diff>
--- a/docs/docx/piano-sprint-1.docx
+++ b/docs/docx/piano-sprint-1.docx
@@ -4792,6 +4792,268 @@
       </w:r>
       <w:r>
         <w:t xml:space="preserve">Cookiebot (precaricamento dello script).</w:t>
+      </w:r>
+      <w:r>
+        <w:t xml:space="preserve"> </w:t>
+      </w:r>
+      <w:r>
+        <w:rPr>
+          <w:bCs/>
+          <w:b/>
+        </w:rPr>
+        <w:t xml:space="preserve">Misura completa del 27/10 sera</w:t>
+      </w:r>
+      <w:r>
+        <w:t xml:space="preserve"> </w:t>
+      </w:r>
+      <w:r>
+        <w:t xml:space="preserve">(3 caricamenti per pagina, mediana): LCP mediano</w:t>
+      </w:r>
+      <w:r>
+        <w:t xml:space="preserve"> </w:t>
+      </w:r>
+      <w:r>
+        <w:t xml:space="preserve">4,4 s, nessuna pagina peggiorata; 595 caricamenti di immagini fuori schermo senza caricamento differito (circa 13,5 MB, un</w:t>
+      </w:r>
+      <w:r>
+        <w:t xml:space="preserve"> </w:t>
+      </w:r>
+      <w:r>
+        <w:t xml:space="preserve">terzo dei byte di immagini);</w:t>
+      </w:r>
+      <w:r>
+        <w:t xml:space="preserve"> </w:t>
+      </w:r>
+      <w:r>
+        <w:rPr>
+          <w:rStyle w:val="VerbatimChar"/>
+        </w:rPr>
+        <w:t xml:space="preserve">bg-pattern.jpg</w:t>
+      </w:r>
+      <w:r>
+        <w:t xml:space="preserve"> </w:t>
+      </w:r>
+      <w:r>
+        <w:t xml:space="preserve">(26 KB) ancora elemento LCP su 31 pagine perché sfondo CSS scoperto tardi;</w:t>
+      </w:r>
+      <w:r>
+        <w:t xml:space="preserve"> </w:t>
+      </w:r>
+      <w:r>
+        <w:t xml:space="preserve">rimasti fuori dal primo giro</w:t>
+      </w:r>
+      <w:r>
+        <w:t xml:space="preserve"> </w:t>
+      </w:r>
+      <w:r>
+        <w:rPr>
+          <w:rStyle w:val="VerbatimChar"/>
+        </w:rPr>
+        <w:t xml:space="preserve">sfondo-tit-img-cda.png</w:t>
+      </w:r>
+      <w:r>
+        <w:t xml:space="preserve"> </w:t>
+      </w:r>
+      <w:r>
+        <w:t xml:space="preserve">859 KB,</w:t>
+      </w:r>
+      <w:r>
+        <w:t xml:space="preserve"> </w:t>
+      </w:r>
+      <w:r>
+        <w:rPr>
+          <w:rStyle w:val="VerbatimChar"/>
+        </w:rPr>
+        <w:t xml:space="preserve">sfondo-tit-img-collegio.png</w:t>
+      </w:r>
+      <w:r>
+        <w:t xml:space="preserve"> </w:t>
+      </w:r>
+      <w:r>
+        <w:t xml:space="preserve">847 KB,</w:t>
+      </w:r>
+      <w:r>
+        <w:t xml:space="preserve"> </w:t>
+      </w:r>
+      <w:r>
+        <w:rPr>
+          <w:rStyle w:val="VerbatimChar"/>
+        </w:rPr>
+        <w:t xml:space="preserve">sfondo-tit-img.png</w:t>
+      </w:r>
+      <w:r>
+        <w:t xml:space="preserve"> </w:t>
+      </w:r>
+      <w:r>
+        <w:t xml:space="preserve">441 KB,</w:t>
+      </w:r>
+      <w:r>
+        <w:t xml:space="preserve"> </w:t>
+      </w:r>
+      <w:r>
+        <w:rPr>
+          <w:rStyle w:val="VerbatimChar"/>
+        </w:rPr>
+        <w:t xml:space="preserve">home-img.jpg</w:t>
+      </w:r>
+      <w:r>
+        <w:t xml:space="preserve"> </w:t>
+      </w:r>
+      <w:r>
+        <w:t xml:space="preserve">298 KB (LCP di</w:t>
+      </w:r>
+      <w:r>
+        <w:t xml:space="preserve"> </w:t>
+      </w:r>
+      <w:r>
+        <w:rPr>
+          <w:rStyle w:val="VerbatimChar"/>
+        </w:rPr>
+        <w:t xml:space="preserve">/it/strutture</w:t>
+      </w:r>
+      <w:r>
+        <w:t xml:space="preserve"> </w:t>
+      </w:r>
+      <w:r>
+        <w:t xml:space="preserve">e</w:t>
+      </w:r>
+      <w:r>
+        <w:t xml:space="preserve"> </w:t>
+      </w:r>
+      <w:r>
+        <w:rPr>
+          <w:rStyle w:val="VerbatimChar"/>
+        </w:rPr>
+        <w:t xml:space="preserve">/it/servizi-e-cure</w:t>
+      </w:r>
+      <w:r>
+        <w:t xml:space="preserve">), banner</w:t>
+      </w:r>
+      <w:r>
+        <w:t xml:space="preserve"> </w:t>
+      </w:r>
+      <w:r>
+        <w:rPr>
+          <w:rStyle w:val="VerbatimChar"/>
+        </w:rPr>
+        <w:t xml:space="preserve">chi-siamo/*-banner.jpg</w:t>
+      </w:r>
+      <w:r>
+        <w:t xml:space="preserve"> </w:t>
+      </w:r>
+      <w:r>
+        <w:t xml:space="preserve">da 2049 px.</w:t>
+      </w:r>
+      <w:r>
+        <w:t xml:space="preserve"> </w:t>
+      </w:r>
+      <w:r>
+        <w:t xml:space="preserve">Piano KOS-2:</w:t>
+      </w:r>
+      <w:r>
+        <w:t xml:space="preserve"> </w:t>
+      </w:r>
+      <w:r>
+        <w:rPr>
+          <w:bCs/>
+          <w:b/>
+        </w:rPr>
+        <w:t xml:space="preserve">A</w:t>
+      </w:r>
+      <w:r>
+        <w:t xml:space="preserve"> </w:t>
+      </w:r>
+      <w:r>
+        <w:t xml:space="preserve">secondo giro di ottimizzazione di questi file (28/10);</w:t>
+      </w:r>
+      <w:r>
+        <w:t xml:space="preserve"> </w:t>
+      </w:r>
+      <w:r>
+        <w:rPr>
+          <w:bCs/>
+          <w:b/>
+        </w:rPr>
+        <w:t xml:space="preserve">B</w:t>
+      </w:r>
+      <w:r>
+        <w:t xml:space="preserve"> </w:t>
+      </w:r>
+      <w:r>
+        <w:rPr>
+          <w:rStyle w:val="VerbatimChar"/>
+        </w:rPr>
+        <w:t xml:space="preserve">loading="lazy"</w:t>
+      </w:r>
+      <w:r>
+        <w:t xml:space="preserve"> </w:t>
+      </w:r>
+      <w:r>
+        <w:t xml:space="preserve">sulle immagini fuori</w:t>
+      </w:r>
+      <w:r>
+        <w:t xml:space="preserve"> </w:t>
+      </w:r>
+      <w:r>
+        <w:t xml:space="preserve">schermo (gallerie delle strutture, footer, icone) e preload di</w:t>
+      </w:r>
+      <w:r>
+        <w:t xml:space="preserve"> </w:t>
+      </w:r>
+      <w:r>
+        <w:rPr>
+          <w:rStyle w:val="VerbatimChar"/>
+        </w:rPr>
+        <w:t xml:space="preserve">bg-pattern</w:t>
+      </w:r>
+      <w:r>
+        <w:t xml:space="preserve"> </w:t>
+      </w:r>
+      <w:r>
+        <w:t xml:space="preserve">negli head, collaudo sullo stage e produzione</w:t>
+      </w:r>
+      <w:r>
+        <w:t xml:space="preserve"> </w:t>
+      </w:r>
+      <w:r>
+        <w:t xml:space="preserve">dal 2/11;</w:t>
+      </w:r>
+      <w:r>
+        <w:t xml:space="preserve"> </w:t>
+      </w:r>
+      <w:r>
+        <w:rPr>
+          <w:bCs/>
+          <w:b/>
+        </w:rPr>
+        <w:t xml:space="preserve">C</w:t>
+      </w:r>
+      <w:r>
+        <w:t xml:space="preserve"> </w:t>
+      </w:r>
+      <w:r>
+        <w:rPr>
+          <w:rStyle w:val="VerbatimChar"/>
+        </w:rPr>
+        <w:t xml:space="preserve">&lt;picture&gt;</w:t>
+      </w:r>
+      <w:r>
+        <w:t xml:space="preserve">/WebP con lo snippet comune</w:t>
+      </w:r>
+      <w:r>
+        <w:t xml:space="preserve"> </w:t>
+      </w:r>
+      <w:r>
+        <w:rPr>
+          <w:rStyle w:val="VerbatimChar"/>
+        </w:rPr>
+        <w:t xml:space="preserve">immagine</w:t>
+      </w:r>
+      <w:r>
+        <w:t xml:space="preserve"> </w:t>
+      </w:r>
+      <w:r>
+        <w:t xml:space="preserve">nello sprint 2.</w:t>
       </w:r>
       <w:r>
         <w:t xml:space="preserve"> </w:t>

</xml_diff>

<commit_message>
KOS-2 secondo giro di immagini in produzione (28/10)
Co-Authored-By: Claude Opus 5.5 <noreply@anthropic.com>
Claude-Session: https://claude.ai/code/session_01Rr1X44gsg7BUwMzrRvYrc2
</commit_message>
<xml_diff>
--- a/docs/docx/piano-sprint-1.docx
+++ b/docs/docx/piano-sprint-1.docx
@@ -5054,6 +5054,127 @@
       </w:r>
       <w:r>
         <w:t xml:space="preserve">nello sprint 2.</w:t>
+      </w:r>
+      <w:r>
+        <w:t xml:space="preserve"> </w:t>
+      </w:r>
+      <w:r>
+        <w:rPr>
+          <w:bCs/>
+          <w:b/>
+        </w:rPr>
+        <w:t xml:space="preserve">A in produzione il 28/10</w:t>
+      </w:r>
+      <w:r>
+        <w:t xml:space="preserve"> </w:t>
+      </w:r>
+      <w:r>
+        <w:t xml:space="preserve">(</w:t>
+      </w:r>
+      <w:r>
+        <w:rPr>
+          <w:rStyle w:val="VerbatimChar"/>
+        </w:rPr>
+        <w:t xml:space="preserve">kosgroup/dati/kos-2-immagini-giro-2.txt</w:t>
+      </w:r>
+      <w:r>
+        <w:t xml:space="preserve">,</w:t>
+      </w:r>
+      <w:r>
+        <w:t xml:space="preserve"> </w:t>
+      </w:r>
+      <w:r>
+        <w:rPr>
+          <w:rStyle w:val="VerbatimChar"/>
+        </w:rPr>
+        <w:t xml:space="preserve">--obiettivo=100</w:t>
+      </w:r>
+      <w:r>
+        <w:t xml:space="preserve">): 29 file, 4,1 → 3,3 MB (−19%;</w:t>
+      </w:r>
+      <w:r>
+        <w:t xml:space="preserve"> </w:t>
+      </w:r>
+      <w:r>
+        <w:rPr>
+          <w:rStyle w:val="VerbatimChar"/>
+        </w:rPr>
+        <w:t xml:space="preserve">home-img.jpg</w:t>
+      </w:r>
+      <w:r>
+        <w:t xml:space="preserve"> </w:t>
+      </w:r>
+      <w:r>
+        <w:t xml:space="preserve">297 → 188 KB a 818×1080,</w:t>
+      </w:r>
+      <w:r>
+        <w:t xml:space="preserve"> </w:t>
+      </w:r>
+      <w:r>
+        <w:rPr>
+          <w:rStyle w:val="VerbatimChar"/>
+        </w:rPr>
+        <w:t xml:space="preserve">intro-pagina-imgs-*</w:t>
+      </w:r>
+      <w:r>
+        <w:t xml:space="preserve"> </w:t>
+      </w:r>
+      <w:r>
+        <w:t xml:space="preserve">110 → 18 KB);</w:t>
+      </w:r>
+      <w:r>
+        <w:t xml:space="preserve"> </w:t>
+      </w:r>
+      <w:r>
+        <w:t xml:space="preserve">corretto in</w:t>
+      </w:r>
+      <w:r>
+        <w:t xml:space="preserve"> </w:t>
+      </w:r>
+      <w:r>
+        <w:rPr>
+          <w:rStyle w:val="VerbatimChar"/>
+        </w:rPr>
+        <w:t xml:space="preserve">Immagini.php</w:t>
+      </w:r>
+      <w:r>
+        <w:t xml:space="preserve"> </w:t>
+      </w:r>
+      <w:r>
+        <w:t xml:space="preserve">il caso di una riduzione più pesante dell'originale (banner da 2049 px: originale tenuto).</w:t>
+      </w:r>
+      <w:r>
+        <w:t xml:space="preserve"> </w:t>
+      </w:r>
+      <w:r>
+        <w:t xml:space="preserve">Collaudo visivo stage/produzione a 390 e 1366 px: pagine con le immagini cambiate sotto lo 0,15%. Backup</w:t>
+      </w:r>
+      <w:r>
+        <w:t xml:space="preserve"> </w:t>
+      </w:r>
+      <w:r>
+        <w:rPr>
+          <w:rStyle w:val="VerbatimChar"/>
+        </w:rPr>
+        <w:t xml:space="preserve">/paas/c0095/backup-kos-seo-geo/immagini-20261028-050407</w:t>
+      </w:r>
+      <w:r>
+        <w:t xml:space="preserve"> </w:t>
+      </w:r>
+      <w:r>
+        <w:t xml:space="preserve">(ripristino con</w:t>
+      </w:r>
+      <w:r>
+        <w:t xml:space="preserve"> </w:t>
+      </w:r>
+      <w:r>
+        <w:rPr>
+          <w:rStyle w:val="VerbatimChar"/>
+        </w:rPr>
+        <w:t xml:space="preserve">ottimizza-immagini.php /www --ripristina &lt;cartella&gt; --scrivi</w:t>
+      </w:r>
+      <w:r>
+        <w:t xml:space="preserve">).</w:t>
       </w:r>
       <w:r>
         <w:t xml:space="preserve"> </w:t>

</xml_diff>

<commit_message>
Verifica dello sprint 1 prima della consegna: script ripetibile e revisione indipendente (piano)
Co-Authored-By: Claude Opus 5.5 <noreply@anthropic.com>
Claude-Session: https://claude.ai/code/session_01Rr1X44gsg7BUwMzrRvYrc2
</commit_message>
<xml_diff>
--- a/docs/docx/piano-sprint-1.docx
+++ b/docs/docx/piano-sprint-1.docx
@@ -2,7 +2,7 @@
 <file path=word/document.xml><?xml version="1.0" encoding="utf-8"?>
 <w:document xmlns:w="http://schemas.openxmlformats.org/wordprocessingml/2006/main" xmlns:m="http://schemas.openxmlformats.org/officeDocument/2006/math" xmlns:r="http://schemas.openxmlformats.org/officeDocument/2006/relationships" xmlns:o="urn:schemas-microsoft-com:office:office" xmlns:v="urn:schemas-microsoft-com:vml" xmlns:w10="urn:schemas-microsoft-com:office:word" xmlns:a="http://schemas.openxmlformats.org/drawingml/2006/main" xmlns:pic="http://schemas.openxmlformats.org/drawingml/2006/picture" xmlns:wp="http://schemas.openxmlformats.org/drawingml/2006/wordprocessingDrawing">
   <w:body>
-    <w:bookmarkStart w:id="32" w:name="Xff2d8b895f42074f3d940c259894f313a91b2c2"/>
+    <w:bookmarkStart w:id="33" w:name="Xff2d8b895f42074f3d940c259894f313a91b2c2"/>
     <w:p>
       <w:pPr>
         <w:pStyle w:val="Heading1"/>
@@ -5438,13 +5438,13 @@
       </w:r>
     </w:p>
     <w:bookmarkEnd w:id="26"/>
-    <w:bookmarkStart w:id="27" w:name="Xa87a4810e3d85a3a3b4600dd4c4af9e61d56717"/>
+    <w:bookmarkStart w:id="27" w:name="Xd3f6db9bb91852295f6664624f52de614b5423f"/>
     <w:p>
       <w:pPr>
         <w:pStyle w:val="Heading2"/>
       </w:pPr>
       <w:r>
-        <w:t xml:space="preserve">Title, description e H1 (AA-20, KOS 21-23, sprint 2) — deciso il 27/10</w:t>
+        <w:t xml:space="preserve">Verifica dello sprint 1 prima della consegna (deciso il 28/10)</w:t>
       </w:r>
     </w:p>
     <w:p>
@@ -5452,74 +5452,7 @@
         <w:pStyle w:val="FirstParagraph"/>
       </w:pPr>
       <w:r>
-        <w:t xml:space="preserve">Fonte dei testi: i fogli dell'agenzia. AA:</w:t>
-      </w:r>
-      <w:r>
-        <w:t xml:space="preserve"> </w:t>
-      </w:r>
-      <w:r>
-        <w:rPr>
-          <w:rStyle w:val="VerbatimChar"/>
-        </w:rPr>
-        <w:t xml:space="preserve">202607_PWC_AnniAzzurri_Ottimizzazioni_Meta_Tag_v2_Ant.xlsx</w:t>
-      </w:r>
-      <w:r>
-        <w:t xml:space="preserve"> </w:t>
-      </w:r>
-      <w:r>
-        <w:t xml:space="preserve">(88 URL con</w:t>
-      </w:r>
-      <w:r>
-        <w:t xml:space="preserve"> </w:t>
-      </w:r>
-      <w:r>
-        <w:t xml:space="preserve">title e description suggeriti; H1 suggeriti non applicati, decisione di luglio). Incongruenze e migliorie si segnalano e</w:t>
-      </w:r>
-      <w:r>
-        <w:t xml:space="preserve"> </w:t>
-      </w:r>
-      <w:r>
-        <w:t xml:space="preserve">si discutono, non si applicano di nostra iniziativa. Per le voci degli audit senza testo proposto (AA: circa 100 pagine,</w:t>
-      </w:r>
-      <w:r>
-        <w:t xml:space="preserve"> </w:t>
-      </w:r>
-      <w:r>
-        <w:t xml:space="preserve">soprattutto articoli, segnalate nell'audit di aprile ma fuori dagli 88 URL; KOS: 78 title, 301 description, 20 H1 del</w:t>
-      </w:r>
-      <w:r>
-        <w:t xml:space="preserve"> </w:t>
-      </w:r>
-      <w:r>
-        <w:t xml:space="preserve">dettaglio di settembre, che non contiene testi suggeriti) prepariamo noi una</w:t>
-      </w:r>
-      <w:r>
-        <w:t xml:space="preserve"> </w:t>
-      </w:r>
-      <w:r>
-        <w:rPr>
-          <w:bCs/>
-          <w:b/>
-        </w:rPr>
-        <w:t xml:space="preserve">proposta da validare</w:t>
-      </w:r>
-      <w:r>
-        <w:t xml:space="preserve"> </w:t>
-      </w:r>
-      <w:r>
-        <w:t xml:space="preserve">con regole</w:t>
-      </w:r>
-      <w:r>
-        <w:t xml:space="preserve"> </w:t>
-      </w:r>
-      <w:r>
-        <w:t xml:space="preserve">semplici (accorciare il testo esistente, aggiungere il nome della pagina o della struttura dove manca, distinguere i</w:t>
-      </w:r>
-      <w:r>
-        <w:t xml:space="preserve"> </w:t>
-      </w:r>
-      <w:r>
-        <w:t xml:space="preserve">duplicati), da mandare all'agenzia con una data di validazione. Prima: stato attuale degli URL degli audit</w:t>
+        <w:t xml:space="preserve">Per evitare che il controllo di Cerved/ProWeb (9-14/11) trovi mancanze: (1) script di verifica ripetibile</w:t>
       </w:r>
       <w:r>
         <w:t xml:space="preserve"> </w:t>
@@ -5531,277 +5464,218 @@
         <w:rPr>
           <w:rStyle w:val="VerbatimChar"/>
         </w:rPr>
-        <w:t xml:space="preserve">scripts/checks/meta-stato.php</w:t>
-      </w:r>
-      <w:r>
-        <w:t xml:space="preserve">, elenchi in</w:t>
-      </w:r>
-      <w:r>
-        <w:t xml:space="preserve"> </w:t>
-      </w:r>
-      <w:r>
-        <w:rPr>
-          <w:rStyle w:val="VerbatimChar"/>
-        </w:rPr>
-        <w:t xml:space="preserve">anniazzurri/dati/aa-20/</w:t>
-      </w:r>
-      <w:r>
-        <w:t xml:space="preserve"> </w:t>
-      </w:r>
-      <w:r>
-        <w:t xml:space="preserve">e</w:t>
-      </w:r>
-      <w:r>
-        <w:t xml:space="preserve"> </w:t>
-      </w:r>
-      <w:r>
-        <w:rPr>
-          <w:rStyle w:val="VerbatimChar"/>
-        </w:rPr>
-        <w:t xml:space="preserve">kosgroup/dati/kos-21-23/</w:t>
-      </w:r>
-      <w:r>
-        <w:t xml:space="preserve">) per separare le voci</w:t>
-      </w:r>
-      <w:r>
-        <w:t xml:space="preserve"> </w:t>
-      </w:r>
-      <w:r>
-        <w:t xml:space="preserve">già risolte (evidenza per la nota di consegna) e quelle che dipendono dal template (suffissi doppi), da correggere senza</w:t>
-      </w:r>
-      <w:r>
-        <w:t xml:space="preserve"> </w:t>
-      </w:r>
-      <w:r>
-        <w:t xml:space="preserve">toccare i testi; dati di Search Console degli ultimi 16 mesi in BigQuery (</w:t>
-      </w:r>
-      <w:r>
-        <w:rPr>
-          <w:rStyle w:val="VerbatimChar"/>
-        </w:rPr>
-        <w:t xml:space="preserve">searchconsole_aa</w:t>
-      </w:r>
-      <w:r>
-        <w:t xml:space="preserve">,</w:t>
-      </w:r>
-      <w:r>
-        <w:t xml:space="preserve"> </w:t>
-      </w:r>
-      <w:r>
-        <w:rPr>
-          <w:rStyle w:val="VerbatimChar"/>
-        </w:rPr>
-        <w:t xml:space="preserve">searchconsole_kos</w:t>
-      </w:r>
-      <w:r>
-        <w:t xml:space="preserve">,</w:t>
-      </w:r>
-      <w:r>
-        <w:t xml:space="preserve"> </w:t>
-      </w:r>
-      <w:r>
-        <w:t xml:space="preserve">scaricati il 27/10 con</w:t>
-      </w:r>
-      <w:r>
-        <w:t xml:space="preserve"> </w:t>
-      </w:r>
-      <w:r>
-        <w:rPr>
-          <w:rStyle w:val="VerbatimChar"/>
-        </w:rPr>
-        <w:t xml:space="preserve">scripts/gsc/storico-search-console.py</w:t>
-      </w:r>
-      <w:r>
-        <w:t xml:space="preserve">) come riscontro per le segnalazioni.</w:t>
+        <w:t xml:space="preserve">scripts/collaudo/verifica-sprint-1.mjs</w:t>
+      </w:r>
+      <w:r>
+        <w:t xml:space="preserve">, lanciato dal PC di Danilo sulla produzione dei due siti) con un controllo per voce</w:t>
+      </w:r>
+      <w:r>
+        <w:t xml:space="preserve"> </w:t>
+      </w:r>
+      <w:r>
+        <w:t xml:space="preserve">dello sprint 1 su tutte le pagine della sitemap dove possibile, esito superato/non superato con comando e output come</w:t>
+      </w:r>
+      <w:r>
+        <w:t xml:space="preserve"> </w:t>
+      </w:r>
+      <w:r>
+        <w:t xml:space="preserve">evidenza per la nota di consegna; (2) revisione indipendente: un agente che riceve solo gli audit dell'agenzia e l'output</w:t>
+      </w:r>
+      <w:r>
+        <w:t xml:space="preserve"> </w:t>
+      </w:r>
+      <w:r>
+        <w:t xml:space="preserve">dello script (non il piano né le nostre conclusioni) e segnala cosa l'agenzia verificherebbe e dove le evidenze non bastano.</w:t>
+      </w:r>
+      <w:r>
+        <w:t xml:space="preserve"> </w:t>
+      </w:r>
+      <w:r>
+        <w:t xml:space="preserve">Calendario: 29/10 script e revisione; 30/10 correzioni piccole o note esplicite nella consegna; 6/11 seconda esecuzione</w:t>
+      </w:r>
+      <w:r>
+        <w:t xml:space="preserve"> </w:t>
+      </w:r>
+      <w:r>
+        <w:t xml:space="preserve">prima della verifica.</w:t>
+      </w:r>
+    </w:p>
+    <w:bookmarkEnd w:id="27"/>
+    <w:bookmarkStart w:id="28" w:name="Xa87a4810e3d85a3a3b4600dd4c4af9e61d56717"/>
+    <w:p>
+      <w:pPr>
+        <w:pStyle w:val="Heading2"/>
+      </w:pPr>
+      <w:r>
+        <w:t xml:space="preserve">Title, description e H1 (AA-20, KOS 21-23, sprint 2) — deciso il 27/10</w:t>
       </w:r>
     </w:p>
     <w:p>
       <w:pPr>
-        <w:pStyle w:val="BodyText"/>
-      </w:pPr>
-      <w:r>
-        <w:rPr>
-          <w:bCs/>
-          <w:b/>
-        </w:rPr>
-        <w:t xml:space="preserve">Template AA-20 in produzione il 27/10 sera</w:t>
-      </w:r>
-      <w:r>
-        <w:t xml:space="preserve"> </w:t>
-      </w:r>
-      <w:r>
-        <w:t xml:space="preserve">(pacchetto</w:t>
-      </w:r>
-      <w:r>
-        <w:t xml:space="preserve"> </w:t>
-      </w:r>
-      <w:r>
-        <w:rPr>
-          <w:rStyle w:val="VerbatimChar"/>
-        </w:rPr>
-        <w:t xml:space="preserve">aa-20-title</w:t>
-      </w:r>
-      <w:r>
-        <w:t xml:space="preserve">, snippet comune</w:t>
-      </w:r>
-      <w:r>
-        <w:t xml:space="preserve"> </w:t>
-      </w:r>
-      <w:r>
-        <w:rPr>
-          <w:rStyle w:val="VerbatimChar"/>
-        </w:rPr>
-        <w:t xml:space="preserve">titoloPagina</w:t>
-      </w:r>
-      <w:r>
-        <w:t xml:space="preserve"> </w:t>
-      </w:r>
-      <w:r>
-        <w:t xml:space="preserve">in 26 head e</w:t>
-      </w:r>
-      <w:r>
-        <w:t xml:space="preserve"> </w:t>
-      </w:r>
-      <w:r>
-        <w:t xml:space="preserve">nel template</w:t>
-      </w:r>
-      <w:r>
-        <w:t xml:space="preserve"> </w:t>
-      </w:r>
-      <w:r>
-        <w:rPr>
-          <w:rStyle w:val="VerbatimChar"/>
-        </w:rPr>
-        <w:t xml:space="preserve">convegnoAA</w:t>
-      </w:r>
-      <w:r>
-        <w:t xml:space="preserve">, impostazione</w:t>
-      </w:r>
-      <w:r>
-        <w:t xml:space="preserve"> </w:t>
-      </w:r>
-      <w:r>
-        <w:rPr>
-          <w:rStyle w:val="VerbatimChar"/>
-        </w:rPr>
-        <w:t xml:space="preserve">seo.titolo_marchio</w:t>
-      </w:r>
-      <w:r>
-        <w:t xml:space="preserve">): longtitle se compilato, mai un longtitle che è il nome di</w:t>
-      </w:r>
-      <w:r>
-        <w:t xml:space="preserve"> </w:t>
-      </w:r>
-      <w:r>
-        <w:t xml:space="preserve">una cartella (sulle landing indica la cartella di foto e documenti, quindi</w:t>
-      </w:r>
-      <w:r>
-        <w:t xml:space="preserve"> </w:t>
-      </w:r>
-      <w:r>
-        <w:rPr>
-          <w:rStyle w:val="VerbatimChar"/>
-        </w:rPr>
-        <w:t xml:space="preserve">head-landing</w:t>
-      </w:r>
-      <w:r>
-        <w:t xml:space="preserve"> </w:t>
-      </w:r>
-      <w:r>
-        <w:t xml:space="preserve">lo ignora sempre); marchio</w:t>
-      </w:r>
-      <w:r>
-        <w:t xml:space="preserve"> </w:t>
-      </w:r>
-      <w:r>
-        <w:t xml:space="preserve">« | Anni Azzurri» una volta sola e non aggiunto se già nel testo; «- MODX Revolution» tolto dalla galleria del convegno.</w:t>
-      </w:r>
-      <w:r>
-        <w:t xml:space="preserve"> </w:t>
-      </w:r>
-      <w:r>
-        <w:t xml:space="preserve">Anteprima prima del rilascio (</w:t>
-      </w:r>
-      <w:r>
-        <w:rPr>
-          <w:rStyle w:val="VerbatimChar"/>
-        </w:rPr>
-        <w:t xml:space="preserve">scripts/checks/aa-20-titoli-anteprima.php</w:t>
-      </w:r>
-      <w:r>
-        <w:t xml:space="preserve">): 89 title cambiati su 521 pagine, nessuno</w:t>
-      </w:r>
-      <w:r>
-        <w:t xml:space="preserve"> </w:t>
-      </w:r>
-      <w:r>
-        <w:t xml:space="preserve">peggiorato; stage e produzione con lo stesso esito. Ripristino:</w:t>
-      </w:r>
-      <w:r>
-        <w:t xml:space="preserve"> </w:t>
-      </w:r>
-      <w:r>
-        <w:rPr>
-          <w:rStyle w:val="VerbatimChar"/>
-        </w:rPr>
-        <w:t xml:space="preserve">installa-elementi.php /www ~/backup-kos-seo-geo/20261027-151018/ripristino.json --scrivi</w:t>
-      </w:r>
-      <w:r>
-        <w:t xml:space="preserve">. Da decidere nell'import dei testi (fuori dall'audit):</w:t>
-      </w:r>
-      <w:r>
-        <w:t xml:space="preserve"> </w:t>
-      </w:r>
-      <w:r>
-        <w:t xml:space="preserve">longtitle «Servizi e cure» su</w:t>
-      </w:r>
-      <w:r>
-        <w:t xml:space="preserve"> </w:t>
-      </w:r>
-      <w:r>
-        <w:rPr>
-          <w:rStyle w:val="VerbatimChar"/>
-        </w:rPr>
-        <w:t xml:space="preserve">/la-nostra-equipe</w:t>
-      </w:r>
-      <w:r>
-        <w:t xml:space="preserve">, title di</w:t>
-      </w:r>
-      <w:r>
-        <w:t xml:space="preserve"> </w:t>
-      </w:r>
-      <w:r>
-        <w:rPr>
-          <w:rStyle w:val="VerbatimChar"/>
-        </w:rPr>
-        <w:t xml:space="preserve">/ladi</w:t>
-      </w:r>
-      <w:r>
-        <w:t xml:space="preserve">, pagetitle</w:t>
-      </w:r>
-      <w:r>
-        <w:t xml:space="preserve"> </w:t>
-      </w:r>
-      <w:r>
-        <w:rPr>
-          <w:rStyle w:val="VerbatimChar"/>
-        </w:rPr>
-        <w:t xml:space="preserve">oss-toscana</w:t>
-      </w:r>
-      <w:r>
-        <w:t xml:space="preserve">, « | KOS» nel longtitle</w:t>
-      </w:r>
-      <w:r>
-        <w:t xml:space="preserve"> </w:t>
-      </w:r>
-      <w:r>
-        <w:t xml:space="preserve">della news del premio AGIRE. L'import dei testi nei campi longtitle e description deve escludere le landing e i</w:t>
-      </w:r>
-      <w:r>
-        <w:t xml:space="preserve"> </w:t>
-      </w:r>
-      <w:r>
-        <w:t xml:space="preserve">longtitle che sono nomi di cartella.</w:t>
+        <w:pStyle w:val="FirstParagraph"/>
+      </w:pPr>
+      <w:r>
+        <w:t xml:space="preserve">Fonte dei testi: i fogli dell'agenzia. AA:</w:t>
+      </w:r>
+      <w:r>
+        <w:t xml:space="preserve"> </w:t>
+      </w:r>
+      <w:r>
+        <w:rPr>
+          <w:rStyle w:val="VerbatimChar"/>
+        </w:rPr>
+        <w:t xml:space="preserve">202607_PWC_AnniAzzurri_Ottimizzazioni_Meta_Tag_v2_Ant.xlsx</w:t>
+      </w:r>
+      <w:r>
+        <w:t xml:space="preserve"> </w:t>
+      </w:r>
+      <w:r>
+        <w:t xml:space="preserve">(88 URL con</w:t>
+      </w:r>
+      <w:r>
+        <w:t xml:space="preserve"> </w:t>
+      </w:r>
+      <w:r>
+        <w:t xml:space="preserve">title e description suggeriti; H1 suggeriti non applicati, decisione di luglio). Incongruenze e migliorie si segnalano e</w:t>
+      </w:r>
+      <w:r>
+        <w:t xml:space="preserve"> </w:t>
+      </w:r>
+      <w:r>
+        <w:t xml:space="preserve">si discutono, non si applicano di nostra iniziativa. Per le voci degli audit senza testo proposto (AA: circa 100 pagine,</w:t>
+      </w:r>
+      <w:r>
+        <w:t xml:space="preserve"> </w:t>
+      </w:r>
+      <w:r>
+        <w:t xml:space="preserve">soprattutto articoli, segnalate nell'audit di aprile ma fuori dagli 88 URL; KOS: 78 title, 301 description, 20 H1 del</w:t>
+      </w:r>
+      <w:r>
+        <w:t xml:space="preserve"> </w:t>
+      </w:r>
+      <w:r>
+        <w:t xml:space="preserve">dettaglio di settembre, che non contiene testi suggeriti) prepariamo noi una</w:t>
+      </w:r>
+      <w:r>
+        <w:t xml:space="preserve"> </w:t>
+      </w:r>
+      <w:r>
+        <w:rPr>
+          <w:bCs/>
+          <w:b/>
+        </w:rPr>
+        <w:t xml:space="preserve">proposta da validare</w:t>
+      </w:r>
+      <w:r>
+        <w:t xml:space="preserve"> </w:t>
+      </w:r>
+      <w:r>
+        <w:t xml:space="preserve">con regole</w:t>
+      </w:r>
+      <w:r>
+        <w:t xml:space="preserve"> </w:t>
+      </w:r>
+      <w:r>
+        <w:t xml:space="preserve">semplici (accorciare il testo esistente, aggiungere il nome della pagina o della struttura dove manca, distinguere i</w:t>
+      </w:r>
+      <w:r>
+        <w:t xml:space="preserve"> </w:t>
+      </w:r>
+      <w:r>
+        <w:t xml:space="preserve">duplicati), da mandare all'agenzia con una data di validazione. Prima: stato attuale degli URL degli audit</w:t>
+      </w:r>
+      <w:r>
+        <w:t xml:space="preserve"> </w:t>
+      </w:r>
+      <w:r>
+        <w:t xml:space="preserve">(</w:t>
+      </w:r>
+      <w:r>
+        <w:rPr>
+          <w:rStyle w:val="VerbatimChar"/>
+        </w:rPr>
+        <w:t xml:space="preserve">scripts/checks/meta-stato.php</w:t>
+      </w:r>
+      <w:r>
+        <w:t xml:space="preserve">, elenchi in</w:t>
+      </w:r>
+      <w:r>
+        <w:t xml:space="preserve"> </w:t>
+      </w:r>
+      <w:r>
+        <w:rPr>
+          <w:rStyle w:val="VerbatimChar"/>
+        </w:rPr>
+        <w:t xml:space="preserve">anniazzurri/dati/aa-20/</w:t>
+      </w:r>
+      <w:r>
+        <w:t xml:space="preserve"> </w:t>
+      </w:r>
+      <w:r>
+        <w:t xml:space="preserve">e</w:t>
+      </w:r>
+      <w:r>
+        <w:t xml:space="preserve"> </w:t>
+      </w:r>
+      <w:r>
+        <w:rPr>
+          <w:rStyle w:val="VerbatimChar"/>
+        </w:rPr>
+        <w:t xml:space="preserve">kosgroup/dati/kos-21-23/</w:t>
+      </w:r>
+      <w:r>
+        <w:t xml:space="preserve">) per separare le voci</w:t>
+      </w:r>
+      <w:r>
+        <w:t xml:space="preserve"> </w:t>
+      </w:r>
+      <w:r>
+        <w:t xml:space="preserve">già risolte (evidenza per la nota di consegna) e quelle che dipendono dal template (suffissi doppi), da correggere senza</w:t>
+      </w:r>
+      <w:r>
+        <w:t xml:space="preserve"> </w:t>
+      </w:r>
+      <w:r>
+        <w:t xml:space="preserve">toccare i testi; dati di Search Console degli ultimi 16 mesi in BigQuery (</w:t>
+      </w:r>
+      <w:r>
+        <w:rPr>
+          <w:rStyle w:val="VerbatimChar"/>
+        </w:rPr>
+        <w:t xml:space="preserve">searchconsole_aa</w:t>
+      </w:r>
+      <w:r>
+        <w:t xml:space="preserve">,</w:t>
+      </w:r>
+      <w:r>
+        <w:t xml:space="preserve"> </w:t>
+      </w:r>
+      <w:r>
+        <w:rPr>
+          <w:rStyle w:val="VerbatimChar"/>
+        </w:rPr>
+        <w:t xml:space="preserve">searchconsole_kos</w:t>
+      </w:r>
+      <w:r>
+        <w:t xml:space="preserve">,</w:t>
+      </w:r>
+      <w:r>
+        <w:t xml:space="preserve"> </w:t>
+      </w:r>
+      <w:r>
+        <w:t xml:space="preserve">scaricati il 27/10 con</w:t>
+      </w:r>
+      <w:r>
+        <w:t xml:space="preserve"> </w:t>
+      </w:r>
+      <w:r>
+        <w:rPr>
+          <w:rStyle w:val="VerbatimChar"/>
+        </w:rPr>
+        <w:t xml:space="preserve">scripts/gsc/storico-search-console.py</w:t>
+      </w:r>
+      <w:r>
+        <w:t xml:space="preserve">) come riscontro per le segnalazioni.</w:t>
       </w:r>
     </w:p>
     <w:p>
@@ -5813,6 +5687,195 @@
           <w:bCs/>
           <w:b/>
         </w:rPr>
+        <w:t xml:space="preserve">Template AA-20 in produzione il 27/10 sera</w:t>
+      </w:r>
+      <w:r>
+        <w:t xml:space="preserve"> </w:t>
+      </w:r>
+      <w:r>
+        <w:t xml:space="preserve">(pacchetto</w:t>
+      </w:r>
+      <w:r>
+        <w:t xml:space="preserve"> </w:t>
+      </w:r>
+      <w:r>
+        <w:rPr>
+          <w:rStyle w:val="VerbatimChar"/>
+        </w:rPr>
+        <w:t xml:space="preserve">aa-20-title</w:t>
+      </w:r>
+      <w:r>
+        <w:t xml:space="preserve">, snippet comune</w:t>
+      </w:r>
+      <w:r>
+        <w:t xml:space="preserve"> </w:t>
+      </w:r>
+      <w:r>
+        <w:rPr>
+          <w:rStyle w:val="VerbatimChar"/>
+        </w:rPr>
+        <w:t xml:space="preserve">titoloPagina</w:t>
+      </w:r>
+      <w:r>
+        <w:t xml:space="preserve"> </w:t>
+      </w:r>
+      <w:r>
+        <w:t xml:space="preserve">in 26 head e</w:t>
+      </w:r>
+      <w:r>
+        <w:t xml:space="preserve"> </w:t>
+      </w:r>
+      <w:r>
+        <w:t xml:space="preserve">nel template</w:t>
+      </w:r>
+      <w:r>
+        <w:t xml:space="preserve"> </w:t>
+      </w:r>
+      <w:r>
+        <w:rPr>
+          <w:rStyle w:val="VerbatimChar"/>
+        </w:rPr>
+        <w:t xml:space="preserve">convegnoAA</w:t>
+      </w:r>
+      <w:r>
+        <w:t xml:space="preserve">, impostazione</w:t>
+      </w:r>
+      <w:r>
+        <w:t xml:space="preserve"> </w:t>
+      </w:r>
+      <w:r>
+        <w:rPr>
+          <w:rStyle w:val="VerbatimChar"/>
+        </w:rPr>
+        <w:t xml:space="preserve">seo.titolo_marchio</w:t>
+      </w:r>
+      <w:r>
+        <w:t xml:space="preserve">): longtitle se compilato, mai un longtitle che è il nome di</w:t>
+      </w:r>
+      <w:r>
+        <w:t xml:space="preserve"> </w:t>
+      </w:r>
+      <w:r>
+        <w:t xml:space="preserve">una cartella (sulle landing indica la cartella di foto e documenti, quindi</w:t>
+      </w:r>
+      <w:r>
+        <w:t xml:space="preserve"> </w:t>
+      </w:r>
+      <w:r>
+        <w:rPr>
+          <w:rStyle w:val="VerbatimChar"/>
+        </w:rPr>
+        <w:t xml:space="preserve">head-landing</w:t>
+      </w:r>
+      <w:r>
+        <w:t xml:space="preserve"> </w:t>
+      </w:r>
+      <w:r>
+        <w:t xml:space="preserve">lo ignora sempre); marchio</w:t>
+      </w:r>
+      <w:r>
+        <w:t xml:space="preserve"> </w:t>
+      </w:r>
+      <w:r>
+        <w:t xml:space="preserve">« | Anni Azzurri» una volta sola e non aggiunto se già nel testo; «- MODX Revolution» tolto dalla galleria del convegno.</w:t>
+      </w:r>
+      <w:r>
+        <w:t xml:space="preserve"> </w:t>
+      </w:r>
+      <w:r>
+        <w:t xml:space="preserve">Anteprima prima del rilascio (</w:t>
+      </w:r>
+      <w:r>
+        <w:rPr>
+          <w:rStyle w:val="VerbatimChar"/>
+        </w:rPr>
+        <w:t xml:space="preserve">scripts/checks/aa-20-titoli-anteprima.php</w:t>
+      </w:r>
+      <w:r>
+        <w:t xml:space="preserve">): 89 title cambiati su 521 pagine, nessuno</w:t>
+      </w:r>
+      <w:r>
+        <w:t xml:space="preserve"> </w:t>
+      </w:r>
+      <w:r>
+        <w:t xml:space="preserve">peggiorato; stage e produzione con lo stesso esito. Ripristino:</w:t>
+      </w:r>
+      <w:r>
+        <w:t xml:space="preserve"> </w:t>
+      </w:r>
+      <w:r>
+        <w:rPr>
+          <w:rStyle w:val="VerbatimChar"/>
+        </w:rPr>
+        <w:t xml:space="preserve">installa-elementi.php /www ~/backup-kos-seo-geo/20261027-151018/ripristino.json --scrivi</w:t>
+      </w:r>
+      <w:r>
+        <w:t xml:space="preserve">. Da decidere nell'import dei testi (fuori dall'audit):</w:t>
+      </w:r>
+      <w:r>
+        <w:t xml:space="preserve"> </w:t>
+      </w:r>
+      <w:r>
+        <w:t xml:space="preserve">longtitle «Servizi e cure» su</w:t>
+      </w:r>
+      <w:r>
+        <w:t xml:space="preserve"> </w:t>
+      </w:r>
+      <w:r>
+        <w:rPr>
+          <w:rStyle w:val="VerbatimChar"/>
+        </w:rPr>
+        <w:t xml:space="preserve">/la-nostra-equipe</w:t>
+      </w:r>
+      <w:r>
+        <w:t xml:space="preserve">, title di</w:t>
+      </w:r>
+      <w:r>
+        <w:t xml:space="preserve"> </w:t>
+      </w:r>
+      <w:r>
+        <w:rPr>
+          <w:rStyle w:val="VerbatimChar"/>
+        </w:rPr>
+        <w:t xml:space="preserve">/ladi</w:t>
+      </w:r>
+      <w:r>
+        <w:t xml:space="preserve">, pagetitle</w:t>
+      </w:r>
+      <w:r>
+        <w:t xml:space="preserve"> </w:t>
+      </w:r>
+      <w:r>
+        <w:rPr>
+          <w:rStyle w:val="VerbatimChar"/>
+        </w:rPr>
+        <w:t xml:space="preserve">oss-toscana</w:t>
+      </w:r>
+      <w:r>
+        <w:t xml:space="preserve">, « | KOS» nel longtitle</w:t>
+      </w:r>
+      <w:r>
+        <w:t xml:space="preserve"> </w:t>
+      </w:r>
+      <w:r>
+        <w:t xml:space="preserve">della news del premio AGIRE. L'import dei testi nei campi longtitle e description deve escludere le landing e i</w:t>
+      </w:r>
+      <w:r>
+        <w:t xml:space="preserve"> </w:t>
+      </w:r>
+      <w:r>
+        <w:t xml:space="preserve">longtitle che sono nomi di cartella.</w:t>
+      </w:r>
+    </w:p>
+    <w:p>
+      <w:pPr>
+        <w:pStyle w:val="BodyText"/>
+      </w:pPr>
+      <w:r>
+        <w:rPr>
+          <w:bCs/>
+          <w:b/>
+        </w:rPr>
         <w:t xml:space="preserve">Testi AA-20 in produzione il 28/10</w:t>
       </w:r>
       <w:r>
@@ -6035,8 +6098,8 @@
         <w:t xml:space="preserve">al prossimo rilascio dello snippet.</w:t>
       </w:r>
     </w:p>
-    <w:bookmarkEnd w:id="27"/>
-    <w:bookmarkStart w:id="28" w:name="Xaa16755a13975bb21ff40475055306adf18ab77"/>
+    <w:bookmarkEnd w:id="28"/>
+    <w:bookmarkStart w:id="29" w:name="Xaa16755a13975bb21ff40475055306adf18ab77"/>
     <w:p>
       <w:pPr>
         <w:pStyle w:val="Heading2"/>
@@ -6412,8 +6475,8 @@
         <w:t xml:space="preserve">chiedere subito a Yext il costo di una proroga di 1-2 mesi per la sola ricerca, da usare solo se serve.</w:t>
       </w:r>
     </w:p>
-    <w:bookmarkEnd w:id="28"/>
-    <w:bookmarkStart w:id="29" w:name="Xccbd241b55281545db5ae3150331824f0f75f18"/>
+    <w:bookmarkEnd w:id="29"/>
+    <w:bookmarkStart w:id="30" w:name="Xccbd241b55281545db5ae3150331824f0f75f18"/>
     <w:p>
       <w:pPr>
         <w:pStyle w:val="Heading2"/>
@@ -6983,8 +7046,8 @@
         <w:t xml:space="preserve">(solo in produzione): coprono il titolo «Cos'è AzzurraMente»; da segnalare a chi gestisce i widget.</w:t>
       </w:r>
     </w:p>
-    <w:bookmarkEnd w:id="29"/>
-    <w:bookmarkStart w:id="30" w:name="X898b42ef2c7e59f20211f0633f37c3831eecc50"/>
+    <w:bookmarkEnd w:id="30"/>
+    <w:bookmarkStart w:id="31" w:name="X898b42ef2c7e59f20211f0633f37c3831eecc50"/>
     <w:p>
       <w:pPr>
         <w:pStyle w:val="Heading2"/>
@@ -7304,8 +7367,8 @@
         <w:t xml:space="preserve">Fuori perimetro, da proporre (non nei documenti condivisi): baseline di misura entro fine novembre (Search Console, Bing AI Performance, canale AI in GA4, set di prompt ripetuti), IndexNow alla pubblicazione, domanda «come ci ha conosciuto?» nei moduli, profili Google dopo RetailTune (vedi analisi del documento PWC Local del 22/10: niente parole chiave nei nomi; test di categoria su un campione; programma recensioni).</w:t>
       </w:r>
     </w:p>
-    <w:bookmarkEnd w:id="30"/>
-    <w:bookmarkStart w:id="31" w:name="X6106934d94086303083d981b094913fadf78d77"/>
+    <w:bookmarkEnd w:id="31"/>
+    <w:bookmarkStart w:id="32" w:name="X6106934d94086303083d981b094913fadf78d77"/>
     <w:p>
       <w:pPr>
         <w:pStyle w:val="Heading2"/>
@@ -7475,8 +7538,8 @@
         <w:t xml:space="preserve">, redirect cartelle documenti (KOS); immagini e PDF mancanti (AA).</w:t>
       </w:r>
     </w:p>
-    <w:bookmarkEnd w:id="31"/>
     <w:bookmarkEnd w:id="32"/>
+    <w:bookmarkEnd w:id="33"/>
     <w:sectPr/>
   </w:body>
 </w:document>

</xml_diff>

<commit_message>
Piano: proposta fuori piano del marchio « | KOS» aggiunto dal template
Co-Authored-By: Claude Opus 5.5 <noreply@anthropic.com>
Claude-Session: https://claude.ai/code/session_01Rr1X44gsg7BUwMzrRvYrc2
</commit_message>
<xml_diff>
--- a/docs/docx/piano-sprint-1.docx
+++ b/docs/docx/piano-sprint-1.docx
@@ -3187,6 +3187,108 @@
       </w:r>
       <w:r>
         <w:t xml:space="preserve">descrizioni e categorie secondarie; da gennaio recensioni e misura AEO periodica.</w:t>
+      </w:r>
+    </w:p>
+    <w:p>
+      <w:pPr>
+        <w:numPr>
+          <w:ilvl w:val="0"/>
+          <w:numId w:val="1006"/>
+        </w:numPr>
+      </w:pPr>
+      <w:r>
+        <w:rPr>
+          <w:bCs/>
+          <w:b/>
+        </w:rPr>
+        <w:t xml:space="preserve">[KOS] Marchio « | KOS» aggiunto dal template</w:t>
+      </w:r>
+      <w:r>
+        <w:t xml:space="preserve"> </w:t>
+      </w:r>
+      <w:r>
+        <w:t xml:space="preserve">(proposta del 29/10, da quotare o da includere in KOS 21-23). Oggi</w:t>
+      </w:r>
+      <w:r>
+        <w:t xml:space="preserve"> </w:t>
+      </w:r>
+      <w:r>
+        <w:t xml:space="preserve">il title di kosgroup.com è il longtitle così com'è, con « | KOS» scritto a mano in ogni pagina (dimenticato o doppio</w:t>
+      </w:r>
+      <w:r>
+        <w:t xml:space="preserve"> </w:t>
+      </w:r>
+      <w:r>
+        <w:t xml:space="preserve">in alcune, e</w:t>
+      </w:r>
+      <w:r>
+        <w:t xml:space="preserve"> </w:t>
+      </w:r>
+      <w:r>
+        <w:rPr>
+          <w:rStyle w:val="VerbatimChar"/>
+        </w:rPr>
+        <w:t xml:space="preserve">seoSchema</w:t>
+      </w:r>
+      <w:r>
+        <w:t xml:space="preserve"> </w:t>
+      </w:r>
+      <w:r>
+        <w:t xml:space="preserve">deve toglierlo per ricavare i nomi). Intervento: lo snippet comune</w:t>
+      </w:r>
+      <w:r>
+        <w:t xml:space="preserve"> </w:t>
+      </w:r>
+      <w:r>
+        <w:rPr>
+          <w:rStyle w:val="VerbatimChar"/>
+        </w:rPr>
+        <w:t xml:space="preserve">titoloPagina</w:t>
+      </w:r>
+      <w:r>
+        <w:t xml:space="preserve"> </w:t>
+      </w:r>
+      <w:r>
+        <w:t xml:space="preserve">già in uso su</w:t>
+      </w:r>
+      <w:r>
+        <w:t xml:space="preserve"> </w:t>
+      </w:r>
+      <w:r>
+        <w:t xml:space="preserve">anniazzurri.it negli head KOS consolidati (</w:t>
+      </w:r>
+      <w:r>
+        <w:rPr>
+          <w:rStyle w:val="VerbatimChar"/>
+        </w:rPr>
+        <w:t xml:space="preserve">seo.titolo_marchio</w:t>
+      </w:r>
+      <w:r>
+        <w:t xml:space="preserve"> </w:t>
+      </w:r>
+      <w:r>
+        <w:t xml:space="preserve">= «KOS»), più la pulizia dei longtitle esistenti con</w:t>
+      </w:r>
+      <w:r>
+        <w:t xml:space="preserve"> </w:t>
+      </w:r>
+      <w:r>
+        <w:rPr>
+          <w:rStyle w:val="VerbatimChar"/>
+        </w:rPr>
+        <w:t xml:space="preserve">aggiorna-campi.php</w:t>
+      </w:r>
+      <w:r>
+        <w:t xml:space="preserve"> </w:t>
+      </w:r>
+      <w:r>
+        <w:t xml:space="preserve">(backup e ripristino). Da fare insieme all'import dei title di KOS 21-23, così i testi si</w:t>
+      </w:r>
+      <w:r>
+        <w:t xml:space="preserve"> </w:t>
+      </w:r>
+      <w:r>
+        <w:t xml:space="preserve">scrivono una volta sola senza suffisso. Stima indicativa mezza giornata, collaudo compreso.</w:t>
       </w:r>
     </w:p>
     <w:p>

</xml_diff>

<commit_message>
Piano: backup del rilascio AA del 29/10
Co-Authored-By: Claude Opus 5.5 <noreply@anthropic.com>
Claude-Session: https://claude.ai/code/session_01Rr1X44gsg7BUwMzrRvYrc2
</commit_message>
<xml_diff>
--- a/docs/docx/piano-sprint-1.docx
+++ b/docs/docx/piano-sprint-1.docx
@@ -5740,7 +5740,67 @@
         <w:t xml:space="preserve"> </w:t>
       </w:r>
       <w:r>
-        <w:t xml:space="preserve">(titoli senza tag HTML). Seconda esecuzione: tutte le voci superate. Restano: blocco LocalBusiness di Yext nel DOM renderizzato</w:t>
+        <w:t xml:space="preserve">(titoli senza tag HTML); backup in produzione</w:t>
+      </w:r>
+      <w:r>
+        <w:t xml:space="preserve"> </w:t>
+      </w:r>
+      <w:r>
+        <w:rPr>
+          <w:rStyle w:val="VerbatimChar"/>
+        </w:rPr>
+        <w:t xml:space="preserve">~/backup-kos-seo-geo/20261029-050825</w:t>
+      </w:r>
+      <w:r>
+        <w:t xml:space="preserve"> </w:t>
+      </w:r>
+      <w:r>
+        <w:t xml:space="preserve">(</w:t>
+      </w:r>
+      <w:r>
+        <w:rPr>
+          <w:rStyle w:val="VerbatimChar"/>
+        </w:rPr>
+        <w:t xml:space="preserve">aa-20-title</w:t>
+      </w:r>
+      <w:r>
+        <w:t xml:space="preserve">) e</w:t>
+      </w:r>
+      <w:r>
+        <w:t xml:space="preserve"> </w:t>
+      </w:r>
+      <w:r>
+        <w:rPr>
+          <w:rStyle w:val="VerbatimChar"/>
+        </w:rPr>
+        <w:t xml:space="preserve">20261029-050826</w:t>
+      </w:r>
+      <w:r>
+        <w:t xml:space="preserve"> </w:t>
+      </w:r>
+      <w:r>
+        <w:t xml:space="preserve">(</w:t>
+      </w:r>
+      <w:r>
+        <w:rPr>
+          <w:rStyle w:val="VerbatimChar"/>
+        </w:rPr>
+        <w:t xml:space="preserve">aa-8-correzioni</w:t>
+      </w:r>
+      <w:r>
+        <w:t xml:space="preserve">), ripristino con</w:t>
+      </w:r>
+      <w:r>
+        <w:t xml:space="preserve"> </w:t>
+      </w:r>
+      <w:r>
+        <w:rPr>
+          <w:rStyle w:val="VerbatimChar"/>
+        </w:rPr>
+        <w:t xml:space="preserve">installa-elementi.php /www &lt;cartella&gt;/ripristino.json --scrivi</w:t>
+      </w:r>
+      <w:r>
+        <w:t xml:space="preserve">, prima il secondo. Seconda esecuzione: tutte le voci superate. Restano: blocco LocalBusiness di Yext nel DOM renderizzato</w:t>
       </w:r>
       <w:r>
         <w:t xml:space="preserve"> </w:t>

</xml_diff>

<commit_message>
AA-8 tipo delle residenze dall'autorizzazione: verifica delle 55 carte dei servizi (29/10)
Co-Authored-By: Claude Opus 5.5 <noreply@anthropic.com>
Claude-Session: https://claude.ai/code/session_01Rr1X44gsg7BUwMzrRvYrc2
</commit_message>
<xml_diff>
--- a/docs/docx/piano-sprint-1.docx
+++ b/docs/docx/piano-sprint-1.docx
@@ -7897,25 +7897,22 @@
         <w:t xml:space="preserve"> </w:t>
       </w:r>
       <w:r>
-        <w:t xml:space="preserve">residenze solo socio-assistenziali</w:t>
-      </w:r>
-      <w:r>
-        <w:t xml:space="preserve"> </w:t>
-      </w:r>
-      <w:r>
         <w:rPr>
           <w:rStyle w:val="VerbatimChar"/>
         </w:rPr>
         <w:t xml:space="preserve">LocalBusiness</w:t>
       </w:r>
       <w:r>
-        <w:t xml:space="preserve">. L'accreditamento si verifica dalle carte dei servizi</w:t>
-      </w:r>
-      <w:r>
-        <w:t xml:space="preserve"> </w:t>
-      </w:r>
-      <w:r>
-        <w:t xml:space="preserve">(</w:t>
+        <w:t xml:space="preserve"> </w:t>
+      </w:r>
+      <w:r>
+        <w:t xml:space="preserve">solo per unità socio-assistenziali pure (alloggi protetti, casa di riposo). Verifica del 29/10</w:t>
+      </w:r>
+      <w:r>
+        <w:t xml:space="preserve"> </w:t>
+      </w:r>
+      <w:r>
+        <w:t xml:space="preserve">sulle carte dei servizi (</w:t>
       </w:r>
       <w:r>
         <w:rPr>
@@ -7924,7 +7921,37 @@
         <w:t xml:space="preserve">scripts/checks/aa-carte-servizi.php</w:t>
       </w:r>
       <w:r>
-        <w:t xml:space="preserve">, 29/10). Nota di consegna: l'audit (slide 30) chiede un LocalBusiness, e</w:t>
+        <w:t xml:space="preserve">, tabella in</w:t>
+      </w:r>
+      <w:r>
+        <w:t xml:space="preserve"> </w:t>
+      </w:r>
+      <w:r>
+        <w:rPr>
+          <w:rStyle w:val="VerbatimChar"/>
+        </w:rPr>
+        <w:t xml:space="preserve">anniazzurri/dati/accreditamento-residenze-2026-10-29.xlsx</w:t>
+      </w:r>
+      <w:r>
+        <w:t xml:space="preserve">): tutte le 55 residenze sono autorizzate come unità</w:t>
+      </w:r>
+      <w:r>
+        <w:t xml:space="preserve"> </w:t>
+      </w:r>
+      <w:r>
+        <w:t xml:space="preserve">socio-sanitarie (RSA, CRA, Residenza Protetta), quindi il tipo è lo stesso per tutte; l'accreditamento (30 sì,</w:t>
+      </w:r>
+      <w:r>
+        <w:t xml:space="preserve"> </w:t>
+      </w:r>
+      <w:r>
+        <w:t xml:space="preserve">6 parziale, 2 in corso, 1 no, 16 non esplicito nella carta) non cambia il tipo. Nota di consegna: l'audit</w:t>
+      </w:r>
+      <w:r>
+        <w:t xml:space="preserve"> </w:t>
+      </w:r>
+      <w:r>
+        <w:t xml:space="preserve">(slide 30) chiede un LocalBusiness, e</w:t>
       </w:r>
       <w:r>
         <w:t xml:space="preserve"> </w:t>

</xml_diff>

<commit_message>
AA-8 KOS-24 specifica del grafo v2 dopo la revisione indipendente: worksFor per i professionisti non medici, schede da sistemare, categorie sui codici, passi e misura, proprietà dei profili
Co-Authored-By: Claude Opus 5.5 <noreply@anthropic.com>
Claude-Session: https://claude.ai/code/session_01Rr1X44gsg7BUwMzrRvYrc2
</commit_message>
<xml_diff>
--- a/docs/docx/piano-sprint-1.docx
+++ b/docs/docx/piano-sprint-1.docx
@@ -7933,19 +7933,19 @@
         <w:t xml:space="preserve">anniazzurri/dati/accreditamento-residenze-2026-10-29.xlsx</w:t>
       </w:r>
       <w:r>
-        <w:t xml:space="preserve">): tutte le 55 residenze sono autorizzate come unità</w:t>
-      </w:r>
-      <w:r>
-        <w:t xml:space="preserve"> </w:t>
-      </w:r>
-      <w:r>
-        <w:t xml:space="preserve">socio-sanitarie (RSA, CRA, Residenza Protetta), quindi il tipo è lo stesso per tutte; l'accreditamento (30 sì,</w:t>
-      </w:r>
-      <w:r>
-        <w:t xml:space="preserve"> </w:t>
-      </w:r>
-      <w:r>
-        <w:t xml:space="preserve">6 parziale, 2 in corso, 1 no, 16 non esplicito nella carta) non cambia il tipo. Nota di consegna: l'audit</w:t>
+        <w:t xml:space="preserve">): tutte le 57 residenze aperte sono autorizzate come unità</w:t>
+      </w:r>
+      <w:r>
+        <w:t xml:space="preserve"> </w:t>
+      </w:r>
+      <w:r>
+        <w:t xml:space="preserve">socio-sanitarie (RSA, CRA, Residenza Protetta), quindi il tipo è lo stesso per tutte; l'accreditamento (31 sì,</w:t>
+      </w:r>
+      <w:r>
+        <w:t xml:space="preserve"> </w:t>
+      </w:r>
+      <w:r>
+        <w:t xml:space="preserve">7 parziale, 2 in corso, 1 no, 16 non esplicito nella carta, su 57 pagine) non cambia il tipo. Nota di consegna: l'audit</w:t>
       </w:r>
       <w:r>
         <w:t xml:space="preserve"> </w:t>
@@ -8101,6 +8101,21 @@
         <w:t xml:space="preserve">IndividualPhysician</w:t>
       </w:r>
       <w:r>
+        <w:t xml:space="preserve"> </w:t>
+      </w:r>
+      <w:r>
+        <w:t xml:space="preserve">con</w:t>
+      </w:r>
+      <w:r>
+        <w:t xml:space="preserve"> </w:t>
+      </w:r>
+      <w:r>
+        <w:rPr>
+          <w:rStyle w:val="VerbatimChar"/>
+        </w:rPr>
+        <w:t xml:space="preserve">practicesAt</w:t>
+      </w:r>
+      <w:r>
         <w:t xml:space="preserve">, altri professionisti</w:t>
       </w:r>
       <w:r>
@@ -8128,7 +8143,40 @@
         <w:t xml:space="preserve">jobTitle</w:t>
       </w:r>
       <w:r>
-        <w:t xml:space="preserve">,</w:t>
+        <w:t xml:space="preserve"> </w:t>
+      </w:r>
+      <w:r>
+        <w:t xml:space="preserve">e</w:t>
+      </w:r>
+      <w:r>
+        <w:t xml:space="preserve"> </w:t>
+      </w:r>
+      <w:r>
+        <w:rPr>
+          <w:rStyle w:val="VerbatimChar"/>
+        </w:rPr>
+        <w:t xml:space="preserve">worksFor</w:t>
+      </w:r>
+      <w:r>
+        <w:t xml:space="preserve"> </w:t>
+      </w:r>
+      <w:r>
+        <w:t xml:space="preserve">verso</w:t>
+      </w:r>
+      <w:r>
+        <w:t xml:space="preserve"> </w:t>
+      </w:r>
+      <w:r>
+        <w:rPr>
+          <w:rStyle w:val="VerbatimChar"/>
+        </w:rPr>
+        <w:t xml:space="preserve">#localbusiness</w:t>
+      </w:r>
+      <w:r>
+        <w:t xml:space="preserve"> </w:t>
+      </w:r>
+      <w:r>
+        <w:t xml:space="preserve">(corretto dopo la revisione del 29/10:</w:t>
       </w:r>
       <w:r>
         <w:t xml:space="preserve"> </w:t>
@@ -8143,19 +8191,7 @@
         <w:t xml:space="preserve"> </w:t>
       </w:r>
       <w:r>
-        <w:t xml:space="preserve">verso</w:t>
-      </w:r>
-      <w:r>
-        <w:t xml:space="preserve"> </w:t>
-      </w:r>
-      <w:r>
-        <w:rPr>
-          <w:rStyle w:val="VerbatimChar"/>
-        </w:rPr>
-        <w:t xml:space="preserve">#localbusiness</w:t>
-      </w:r>
-      <w:r>
-        <w:t xml:space="preserve">. Nota di consegna: l'esempio dell'audit (slide 27) usa</w:t>
+        <w:t xml:space="preserve">vale solo per i medici). Nota di consegna: l'esempio dell'audit (slide 27) usa</w:t>
       </w:r>
       <w:r>
         <w:t xml:space="preserve"> </w:t>
@@ -8316,25 +8352,43 @@
           <w:bCs/>
           <w:b/>
         </w:rPr>
-        <w:t xml:space="preserve">Test della categoria «Casa di riposo»</w:t>
-      </w:r>
-      <w:r>
-        <w:t xml:space="preserve"> </w:t>
-      </w:r>
-      <w:r>
-        <w:t xml:space="preserve">(piano PWC): le linee guida Google sulle catene chiedono la stessa</w:t>
-      </w:r>
-      <w:r>
-        <w:t xml:space="preserve"> </w:t>
-      </w:r>
-      <w:r>
-        <w:t xml:space="preserve">categoria per le sedi con lo stesso servizio; proposta: cambiare un sottogruppo omogeneo intero (es. tutte le</w:t>
-      </w:r>
-      <w:r>
-        <w:t xml:space="preserve"> </w:t>
-      </w:r>
-      <w:r>
-        <w:t xml:space="preserve">residenze non accreditate) invece di 3-5 residenze a campione. Decisione di Danilo con PWC.</w:t>
+        <w:t xml:space="preserve">Categorie Google delle residenze</w:t>
+      </w:r>
+      <w:r>
+        <w:t xml:space="preserve"> </w:t>
+      </w:r>
+      <w:r>
+        <w:t xml:space="preserve">(deciso il 29/10, sostituisce il test PWC su un campione): stessa</w:t>
+      </w:r>
+      <w:r>
+        <w:t xml:space="preserve"> </w:t>
+      </w:r>
+      <w:r>
+        <w:t xml:space="preserve">categoria per tutte le residenze aperte, «Casa di riposo» principale come i concorrenti, aggiuntive solo per servizi</w:t>
+      </w:r>
+      <w:r>
+        <w:t xml:space="preserve"> </w:t>
+      </w:r>
+      <w:r>
+        <w:t xml:space="preserve">reali, via «Geriatra» e «Servizio di salute mentale»; da validare con PWC sui codici delle categorie, dopo la finestra</w:t>
+      </w:r>
+      <w:r>
+        <w:t xml:space="preserve"> </w:t>
+      </w:r>
+      <w:r>
+        <w:t xml:space="preserve">di passaggio Yext → RetailTune e a passi. Dettaglio e misura in</w:t>
+      </w:r>
+      <w:r>
+        <w:t xml:space="preserve"> </w:t>
+      </w:r>
+      <w:r>
+        <w:rPr>
+          <w:rStyle w:val="VerbatimChar"/>
+        </w:rPr>
+        <w:t xml:space="preserve">docs/specifica-grafo-kos.md</w:t>
+      </w:r>
+      <w:r>
+        <w:t xml:space="preserve">.</w:t>
       </w:r>
     </w:p>
     <w:p>

</xml_diff>

<commit_message>
AA-8 verifica del 30/10: San Lorenzo senza JSON-LD per la cache scritta durante lo svuotamento, corretta
Co-Authored-By: Claude Opus 5.5 <noreply@anthropic.com>
Claude-Session: https://claude.ai/code/session_01Rr1X44gsg7BUwMzrRvYrc2
</commit_message>
<xml_diff>
--- a/docs/docx/piano-sprint-1.docx
+++ b/docs/docx/piano-sprint-1.docx
@@ -5818,7 +5818,49 @@
         <w:t xml:space="preserve"> </w:t>
       </w:r>
       <w:r>
-        <w:t xml:space="preserve">aggiornata. Terza esecuzione il 6/11.</w:t>
+        <w:t xml:space="preserve">aggiornata. Esecuzione del 30/10 (9:35, prima dell'invio): stessi residui; nuovo KO su Residenza San Lorenzo (risorsa 64) senza JSON-LD: cache della pagina scritta alle 03:06:49, due secondi dopo lo svuotamento della cache del rilascio extra aa-news-muba, con l'uscita di</w:t>
+      </w:r>
+      <w:r>
+        <w:t xml:space="preserve"> </w:t>
+      </w:r>
+      <w:r>
+        <w:rPr>
+          <w:rStyle w:val="VerbatimChar"/>
+        </w:rPr>
+        <w:t xml:space="preserve">aaSchema</w:t>
+      </w:r>
+      <w:r>
+        <w:t xml:space="preserve"> </w:t>
+      </w:r>
+      <w:r>
+        <w:t xml:space="preserve">vuota (snippet corretto se eseguito:</w:t>
+      </w:r>
+      <w:r>
+        <w:t xml:space="preserve"> </w:t>
+      </w:r>
+      <w:r>
+        <w:rPr>
+          <w:rStyle w:val="VerbatimChar"/>
+        </w:rPr>
+        <w:t xml:space="preserve">scripts/checks/aa-schema-risorsa.php</w:t>
+      </w:r>
+      <w:r>
+        <w:t xml:space="preserve">). Cancellato il file di cache della risorsa, pagina verificata con un solo</w:t>
+      </w:r>
+      <w:r>
+        <w:t xml:space="preserve"> </w:t>
+      </w:r>
+      <w:r>
+        <w:rPr>
+          <w:rStyle w:val="VerbatimChar"/>
+        </w:rPr>
+        <w:t xml:space="preserve">@graph</w:t>
+      </w:r>
+      <w:r>
+        <w:t xml:space="preserve"> </w:t>
+      </w:r>
+      <w:r>
+        <w:t xml:space="preserve">e briciole uguali a quelle visibili. Da fare: controllo delle pagine in cache senza JSON-LD alla fine di ogni installer che svuota la cache. Terza esecuzione il 6/11.</w:t>
       </w:r>
     </w:p>
     <w:bookmarkEnd w:id="27"/>

</xml_diff>

<commit_message>
KOS-9 approfondimento Salute mentale: tolto il JSON-LD scritto a mano nella TV schemaJsonLd, un solo @graph
Co-Authored-By: Claude Opus 5.5 <noreply@anthropic.com>
Claude-Session: https://claude.ai/code/session_01Rr1X44gsg7BUwMzrRvYrc2
</commit_message>
<xml_diff>
--- a/docs/docx/piano-sprint-1.docx
+++ b/docs/docx/piano-sprint-1.docx
@@ -5860,7 +5860,91 @@
         <w:t xml:space="preserve"> </w:t>
       </w:r>
       <w:r>
-        <w:t xml:space="preserve">e briciole uguali a quelle visibili. Da fare: controllo delle pagine in cache senza JSON-LD alla fine di ogni installer che svuota la cache. Terza esecuzione il 6/11.</w:t>
+        <w:t xml:space="preserve">e briciole uguali a quelle visibili. Da fare: controllo delle pagine in cache senza JSON-LD alla fine di ogni installer che svuota la cache. Tolto lo stesso giorno anche il secondo blocco dell'approfondimento KOS «Salute mentale…»: era la TV</w:t>
+      </w:r>
+      <w:r>
+        <w:t xml:space="preserve"> </w:t>
+      </w:r>
+      <w:r>
+        <w:rPr>
+          <w:rStyle w:val="VerbatimChar"/>
+        </w:rPr>
+        <w:t xml:space="preserve">schemaJsonLd</w:t>
+      </w:r>
+      <w:r>
+        <w:t xml:space="preserve"> </w:t>
+      </w:r>
+      <w:r>
+        <w:t xml:space="preserve">del template</w:t>
+      </w:r>
+      <w:r>
+        <w:t xml:space="preserve"> </w:t>
+      </w:r>
+      <w:r>
+        <w:rPr>
+          <w:rStyle w:val="VerbatimChar"/>
+        </w:rPr>
+        <w:t xml:space="preserve">informativo</w:t>
+      </w:r>
+      <w:r>
+        <w:t xml:space="preserve"> </w:t>
+      </w:r>
+      <w:r>
+        <w:t xml:space="preserve">(stampata tra</w:t>
+      </w:r>
+      <w:r>
+        <w:t xml:space="preserve"> </w:t>
+      </w:r>
+      <w:r>
+        <w:rPr>
+          <w:rStyle w:val="VerbatimChar"/>
+        </w:rPr>
+        <w:t xml:space="preserve">&lt;/head&gt;</w:t>
+      </w:r>
+      <w:r>
+        <w:t xml:space="preserve"> </w:t>
+      </w:r>
+      <w:r>
+        <w:t xml:space="preserve">e</w:t>
+      </w:r>
+      <w:r>
+        <w:t xml:space="preserve"> </w:t>
+      </w:r>
+      <w:r>
+        <w:rPr>
+          <w:rStyle w:val="VerbatimChar"/>
+        </w:rPr>
+        <w:t xml:space="preserve">&lt;body&gt;</w:t>
+      </w:r>
+      <w:r>
+        <w:t xml:space="preserve">), svuotata da Danilo; ora un solo</w:t>
+      </w:r>
+      <w:r>
+        <w:t xml:space="preserve"> </w:t>
+      </w:r>
+      <w:r>
+        <w:rPr>
+          <w:rStyle w:val="VerbatimChar"/>
+        </w:rPr>
+        <w:t xml:space="preserve">@graph</w:t>
+      </w:r>
+      <w:r>
+        <w:t xml:space="preserve">. Nel consolidamento degli head KOS: togliere</w:t>
+      </w:r>
+      <w:r>
+        <w:t xml:space="preserve"> </w:t>
+      </w:r>
+      <w:r>
+        <w:rPr>
+          <w:rStyle w:val="VerbatimChar"/>
+        </w:rPr>
+        <w:t xml:space="preserve">[[*schemaJsonLd]]</w:t>
+      </w:r>
+      <w:r>
+        <w:t xml:space="preserve"> </w:t>
+      </w:r>
+      <w:r>
+        <w:t xml:space="preserve">dal template e portare l'eventuale FAQPage nella libreria comune come nodo di pagina. Terza esecuzione il 6/11.</w:t>
       </w:r>
     </w:p>
     <w:bookmarkEnd w:id="27"/>

</xml_diff>

<commit_message>
Piano: marchio « | KOS» dal template incluso nel pacchetto head KOS con valutazione a parte
Co-Authored-By: Claude Opus 5.5 <noreply@anthropic.com>
Claude-Session: https://claude.ai/code/session_01Rr1X44gsg7BUwMzrRvYrc2
</commit_message>
<xml_diff>
--- a/docs/docx/piano-sprint-1.docx
+++ b/docs/docx/piano-sprint-1.docx
@@ -3207,7 +3207,20 @@
         <w:t xml:space="preserve"> </w:t>
       </w:r>
       <w:r>
-        <w:t xml:space="preserve">(proposta del 29/10, da quotare o da includere in KOS 21-23). Oggi</w:t>
+        <w:t xml:space="preserve">(proposta del 29/10;</w:t>
+      </w:r>
+      <w:r>
+        <w:t xml:space="preserve"> </w:t>
+      </w:r>
+      <w:r>
+        <w:rPr>
+          <w:bCs/>
+          <w:b/>
+        </w:rPr>
+        <w:t xml:space="preserve">30/10 Danilo: si fa, nel pacchetto degli head KOS con l'import dei title di KOS 21-23, con valutazione a parte; a fine progetto Danilo decide se rientra nel perimetro o va a consuntivo</w:t>
+      </w:r>
+      <w:r>
+        <w:t xml:space="preserve">). Oggi</w:t>
       </w:r>
       <w:r>
         <w:t xml:space="preserve"> </w:t>

</xml_diff>

<commit_message>
Piano: stage sui domini di terzo livello e filtri GTM, da fare
Co-Authored-By: Claude Opus 5.5 <noreply@anthropic.com>
Claude-Session: https://claude.ai/code/session_01Rr1X44gsg7BUwMzrRvYrc2
</commit_message>
<xml_diff>
--- a/docs/docx/piano-sprint-1.docx
+++ b/docs/docx/piano-sprint-1.docx
@@ -2,7 +2,7 @@
 <file path=word/document.xml><?xml version="1.0" encoding="utf-8"?>
 <w:document xmlns:w="http://schemas.openxmlformats.org/wordprocessingml/2006/main" xmlns:m="http://schemas.openxmlformats.org/officeDocument/2006/math" xmlns:r="http://schemas.openxmlformats.org/officeDocument/2006/relationships" xmlns:o="urn:schemas-microsoft-com:office:office" xmlns:v="urn:schemas-microsoft-com:vml" xmlns:w10="urn:schemas-microsoft-com:office:word" xmlns:a="http://schemas.openxmlformats.org/drawingml/2006/main" xmlns:pic="http://schemas.openxmlformats.org/drawingml/2006/picture" xmlns:wp="http://schemas.openxmlformats.org/drawingml/2006/wordprocessingDrawing">
   <w:body>
-    <w:bookmarkStart w:id="34" w:name="Xff2d8b895f42074f3d940c259894f313a91b2c2"/>
+    <w:bookmarkStart w:id="35" w:name="Xff2d8b895f42074f3d940c259894f313a91b2c2"/>
     <w:p>
       <w:pPr>
         <w:pStyle w:val="Heading1"/>
@@ -8811,7 +8811,211 @@
       </w:r>
     </w:p>
     <w:bookmarkEnd w:id="33"/>
+    <w:bookmarkStart w:id="34" w:name="X929ee5f0b8e30978991f6e00fc45417891ed5c5"/>
+    <w:p>
+      <w:pPr>
+        <w:pStyle w:val="Heading2"/>
+      </w:pPr>
+      <w:r>
+        <w:t xml:space="preserve">Stage sui domini di terzo livello (30/10, da fare da Danilo nei prossimi giorni)</w:t>
+      </w:r>
+    </w:p>
+    <w:p>
+      <w:pPr>
+        <w:pStyle w:val="FirstParagraph"/>
+      </w:pPr>
+      <w:r>
+        <w:rPr>
+          <w:rStyle w:val="VerbatimChar"/>
+        </w:rPr>
+        <w:t xml:space="preserve">stage.anniazzurri.it</w:t>
+      </w:r>
+      <w:r>
+        <w:t xml:space="preserve"> </w:t>
+      </w:r>
+      <w:r>
+        <w:t xml:space="preserve">e</w:t>
+      </w:r>
+      <w:r>
+        <w:t xml:space="preserve"> </w:t>
+      </w:r>
+      <w:r>
+        <w:rPr>
+          <w:rStyle w:val="VerbatimChar"/>
+        </w:rPr>
+        <w:t xml:space="preserve">stage.kosgroup.com</w:t>
+      </w:r>
+      <w:r>
+        <w:t xml:space="preserve"> </w:t>
+      </w:r>
+      <w:r>
+        <w:t xml:space="preserve">sono attivi. Danilo li associa ai cloud di sviluppo come dominio principale al posto</w:t>
+      </w:r>
+      <w:r>
+        <w:t xml:space="preserve"> </w:t>
+      </w:r>
+      <w:r>
+        <w:t xml:space="preserve">di</w:t>
+      </w:r>
+      <w:r>
+        <w:t xml:space="preserve"> </w:t>
+      </w:r>
+      <w:r>
+        <w:rPr>
+          <w:rStyle w:val="VerbatimChar"/>
+        </w:rPr>
+        <w:t xml:space="preserve">tcm7b0i8.modx.dev</w:t>
+      </w:r>
+      <w:r>
+        <w:t xml:space="preserve"> </w:t>
+      </w:r>
+      <w:r>
+        <w:t xml:space="preserve">e</w:t>
+      </w:r>
+      <w:r>
+        <w:t xml:space="preserve"> </w:t>
+      </w:r>
+      <w:r>
+        <w:rPr>
+          <w:rStyle w:val="VerbatimChar"/>
+        </w:rPr>
+        <w:t xml:space="preserve">b0k2gmat.modx.dev</w:t>
+      </w:r>
+      <w:r>
+        <w:t xml:space="preserve">. Prima del cambio: certificato Let's Encrypt emesso; dopo: senza password 401 con</w:t>
+      </w:r>
+      <w:r>
+        <w:t xml:space="preserve"> </w:t>
+      </w:r>
+      <w:r>
+        <w:rPr>
+          <w:rStyle w:val="VerbatimChar"/>
+        </w:rPr>
+        <w:t xml:space="preserve">X-Robots-Tag</w:t>
+      </w:r>
+      <w:r>
+        <w:t xml:space="preserve"> </w:t>
+      </w:r>
+      <w:r>
+        <w:t xml:space="preserve">(le regole di protezione valgono per ogni host). Il dominio di terzo livello non evita i filtri in GTM, li rende</w:t>
+      </w:r>
+      <w:r>
+        <w:t xml:space="preserve"> </w:t>
+      </w:r>
+      <w:r>
+        <w:t xml:space="preserve">necessari: Cookiebot può accettare i sottodomini e il cookie</w:t>
+      </w:r>
+      <w:r>
+        <w:t xml:space="preserve"> </w:t>
+      </w:r>
+      <w:r>
+        <w:rPr>
+          <w:rStyle w:val="VerbatimChar"/>
+        </w:rPr>
+        <w:t xml:space="preserve">_ga</w:t>
+      </w:r>
+      <w:r>
+        <w:t xml:space="preserve"> </w:t>
+      </w:r>
+      <w:r>
+        <w:t xml:space="preserve">su</w:t>
+      </w:r>
+      <w:r>
+        <w:t xml:space="preserve"> </w:t>
+      </w:r>
+      <w:r>
+        <w:rPr>
+          <w:rStyle w:val="VerbatimChar"/>
+        </w:rPr>
+        <w:t xml:space="preserve">.anniazzurri.it</w:t>
+      </w:r>
+      <w:r>
+        <w:t xml:space="preserve"> </w:t>
+      </w:r>
+      <w:r>
+        <w:t xml:space="preserve">/</w:t>
+      </w:r>
+      <w:r>
+        <w:t xml:space="preserve"> </w:t>
+      </w:r>
+      <w:r>
+        <w:rPr>
+          <w:rStyle w:val="VerbatimChar"/>
+        </w:rPr>
+        <w:t xml:space="preserve">.kosgroup.com</w:t>
+      </w:r>
+      <w:r>
+        <w:t xml:space="preserve"> </w:t>
+      </w:r>
+      <w:r>
+        <w:t xml:space="preserve">è condiviso con la</w:t>
+      </w:r>
+      <w:r>
+        <w:t xml:space="preserve"> </w:t>
+      </w:r>
+      <w:r>
+        <w:t xml:space="preserve">produzione. Proposta: ID di misurazione GA4 da una tabella di ricerca su</w:t>
+      </w:r>
+      <w:r>
+        <w:t xml:space="preserve"> </w:t>
+      </w:r>
+      <w:r>
+        <w:rPr>
+          <w:rStyle w:val="VerbatimChar"/>
+        </w:rPr>
+        <w:t xml:space="preserve">{{Page Hostname}}</w:t>
+      </w:r>
+      <w:r>
+        <w:t xml:space="preserve"> </w:t>
+      </w:r>
+      <w:r>
+        <w:t xml:space="preserve">(stage → proprietà di test o vuoto)</w:t>
+      </w:r>
+      <w:r>
+        <w:t xml:space="preserve"> </w:t>
+      </w:r>
+      <w:r>
+        <w:t xml:space="preserve">e un solo attivatore di eccezione «Stage» sui tag di conversione (Ads, Meta). Dopo il cambio, Claude aggiorna</w:t>
+      </w:r>
+      <w:r>
+        <w:t xml:space="preserve"> </w:t>
+      </w:r>
+      <w:r>
+        <w:rPr>
+          <w:rStyle w:val="VerbatimChar"/>
+        </w:rPr>
+        <w:t xml:space="preserve">docs/ambienti-di-prova.md</w:t>
+      </w:r>
+      <w:r>
+        <w:t xml:space="preserve"> </w:t>
+      </w:r>
+      <w:r>
+        <w:t xml:space="preserve">e gli esempi degli script di collaudo (</w:t>
+      </w:r>
+      <w:r>
+        <w:rPr>
+          <w:rStyle w:val="VerbatimChar"/>
+        </w:rPr>
+        <w:t xml:space="preserve">--stage</w:t>
+      </w:r>
+      <w:r>
+        <w:t xml:space="preserve">,</w:t>
+      </w:r>
+      <w:r>
+        <w:t xml:space="preserve"> </w:t>
+      </w:r>
+      <w:r>
+        <w:rPr>
+          <w:rStyle w:val="VerbatimChar"/>
+        </w:rPr>
+        <w:t xml:space="preserve">--base</w:t>
+      </w:r>
+      <w:r>
+        <w:t xml:space="preserve">).</w:t>
+      </w:r>
+    </w:p>
     <w:bookmarkEnd w:id="34"/>
+    <w:bookmarkEnd w:id="35"/>
     <w:sectPr/>
   </w:body>
 </w:document>

</xml_diff>